<commit_message>
DT043: tái lập paper chính bằng toàn văn (E11 3-layer THARM), cập nhật báo cáo, thêm notebook, kịch bản thuyết trình và câu hỏi bảo vệ
</commit_message>
<xml_diff>
--- a/DT043/report/BaoCao_DT043_1150080120_HoangThanhTra.docx
+++ b/DT043/report/BaoCao_DT043_1150080120_HoangThanhTra.docx
@@ -3,8 +3,8 @@
 <w:document xmlns:wpc="http://schemas.microsoft.com/office/word/2010/wordprocessingCanvas" xmlns:cx="http://schemas.microsoft.com/office/drawing/2014/chartex" xmlns:cx1="http://schemas.microsoft.com/office/drawing/2015/9/8/chartex" xmlns:cx2="http://schemas.microsoft.com/office/drawing/2015/10/21/chartex" xmlns:cx3="http://schemas.microsoft.com/office/drawing/2016/5/9/chartex" xmlns:cx4="http://schemas.microsoft.com/office/drawing/2016/5/10/chartex" xmlns:cx5="http://schemas.microsoft.com/office/drawing/2016/5/11/chartex" xmlns:cx6="http://schemas.microsoft.com/office/drawing/2016/5/12/chartex" xmlns:cx7="http://schemas.microsoft.com/office/drawing/2016/5/13/chartex" xmlns:cx8="http://schemas.microsoft.com/office/drawing/2016/5/14/chartex" xmlns:mc="http://schemas.openxmlformats.org/markup-compatibility/2006" xmlns:o="urn:schemas-microsoft-com:office:office" xmlns:r="http://schemas.openxmlformats.org/officeDocument/2006/relationships" xmlns:m="http://schemas.openxmlformats.org/officeDocument/2006/math" xmlns:v="urn:schemas-microsoft-com:vml" xmlns:wp14="http://schemas.microsoft.com/office/word/2010/wordprocessingDrawing" xmlns:wp="http://schemas.openxmlformats.org/drawingml/2006/wordprocessingDrawing" xmlns:w="http://schemas.openxmlformats.org/wordprocessingml/2006/main" xmlns:w14="http://schemas.microsoft.com/office/word/2010/wordml" xmlns:w10="urn:schemas-microsoft-com:office:word" xmlns:w15="http://schemas.microsoft.com/office/word/2012/wordml" xmlns:wpg="http://schemas.microsoft.com/office/word/2010/wordprocessingGroup" xmlns:wpi="http://schemas.microsoft.com/office/word/2010/wordprocessingInk" xmlns:wne="http://schemas.microsoft.com/office/word/2006/wordml" xmlns:wps="http://schemas.microsoft.com/office/word/2010/wordprocessingShape" xmlns:wpsCustomData="http://www.wps.cn/officeDocument/2013/wpsCustomData" mc:Ignorable="w14 w15 wp14">
   <w:body>
     <w:p>
-      <w:bookmarkStart w:id="49" w:name="_GoBack"/>
-      <w:bookmarkEnd w:id="49"/>
+      <w:bookmarkStart w:id="50" w:name="_GoBack"/>
+      <w:bookmarkEnd w:id="50"/>
       <w:r>
         <w:rPr>
           <w:b w:val="0"/>
@@ -160,7 +160,7 @@
         <w:fldChar w:fldCharType="begin"/>
       </w:r>
       <w:r>
-        <w:instrText xml:space="preserve"> HYPERLINK \l _Toc9216 </w:instrText>
+        <w:instrText xml:space="preserve"> HYPERLINK \l _Toc27578 </w:instrText>
       </w:r>
       <w:r>
         <w:fldChar w:fldCharType="separate"/>
@@ -175,7 +175,7 @@
         <w:fldChar w:fldCharType="begin"/>
       </w:r>
       <w:r>
-        <w:instrText xml:space="preserve"> PAGEREF _Toc9216 \h </w:instrText>
+        <w:instrText xml:space="preserve"> PAGEREF _Toc27578 \h </w:instrText>
       </w:r>
       <w:r>
         <w:fldChar w:fldCharType="separate"/>
@@ -201,7 +201,7 @@
         <w:fldChar w:fldCharType="begin"/>
       </w:r>
       <w:r>
-        <w:instrText xml:space="preserve"> HYPERLINK \l _Toc2486 </w:instrText>
+        <w:instrText xml:space="preserve"> HYPERLINK \l _Toc24435 </w:instrText>
       </w:r>
       <w:r>
         <w:fldChar w:fldCharType="separate"/>
@@ -216,7 +216,7 @@
         <w:fldChar w:fldCharType="begin"/>
       </w:r>
       <w:r>
-        <w:instrText xml:space="preserve"> PAGEREF _Toc2486 \h </w:instrText>
+        <w:instrText xml:space="preserve"> PAGEREF _Toc24435 \h </w:instrText>
       </w:r>
       <w:r>
         <w:fldChar w:fldCharType="separate"/>
@@ -242,7 +242,7 @@
         <w:fldChar w:fldCharType="begin"/>
       </w:r>
       <w:r>
-        <w:instrText xml:space="preserve"> HYPERLINK \l _Toc24776 </w:instrText>
+        <w:instrText xml:space="preserve"> HYPERLINK \l _Toc14312 </w:instrText>
       </w:r>
       <w:r>
         <w:fldChar w:fldCharType="separate"/>
@@ -257,7 +257,7 @@
         <w:fldChar w:fldCharType="begin"/>
       </w:r>
       <w:r>
-        <w:instrText xml:space="preserve"> PAGEREF _Toc24776 \h </w:instrText>
+        <w:instrText xml:space="preserve"> PAGEREF _Toc14312 \h </w:instrText>
       </w:r>
       <w:r>
         <w:fldChar w:fldCharType="separate"/>
@@ -283,7 +283,7 @@
         <w:fldChar w:fldCharType="begin"/>
       </w:r>
       <w:r>
-        <w:instrText xml:space="preserve"> HYPERLINK \l _Toc11554 </w:instrText>
+        <w:instrText xml:space="preserve"> HYPERLINK \l _Toc348 </w:instrText>
       </w:r>
       <w:r>
         <w:fldChar w:fldCharType="separate"/>
@@ -298,7 +298,7 @@
         <w:fldChar w:fldCharType="begin"/>
       </w:r>
       <w:r>
-        <w:instrText xml:space="preserve"> PAGEREF _Toc11554 \h </w:instrText>
+        <w:instrText xml:space="preserve"> PAGEREF _Toc348 \h </w:instrText>
       </w:r>
       <w:r>
         <w:fldChar w:fldCharType="separate"/>
@@ -324,7 +324,7 @@
         <w:fldChar w:fldCharType="begin"/>
       </w:r>
       <w:r>
-        <w:instrText xml:space="preserve"> HYPERLINK \l _Toc21712 </w:instrText>
+        <w:instrText xml:space="preserve"> HYPERLINK \l _Toc9084 </w:instrText>
       </w:r>
       <w:r>
         <w:fldChar w:fldCharType="separate"/>
@@ -339,7 +339,7 @@
         <w:fldChar w:fldCharType="begin"/>
       </w:r>
       <w:r>
-        <w:instrText xml:space="preserve"> PAGEREF _Toc21712 \h </w:instrText>
+        <w:instrText xml:space="preserve"> PAGEREF _Toc9084 \h </w:instrText>
       </w:r>
       <w:r>
         <w:fldChar w:fldCharType="separate"/>
@@ -365,7 +365,7 @@
         <w:fldChar w:fldCharType="begin"/>
       </w:r>
       <w:r>
-        <w:instrText xml:space="preserve"> HYPERLINK \l _Toc29509 </w:instrText>
+        <w:instrText xml:space="preserve"> HYPERLINK \l _Toc7382 </w:instrText>
       </w:r>
       <w:r>
         <w:fldChar w:fldCharType="separate"/>
@@ -380,7 +380,7 @@
         <w:fldChar w:fldCharType="begin"/>
       </w:r>
       <w:r>
-        <w:instrText xml:space="preserve"> PAGEREF _Toc29509 \h </w:instrText>
+        <w:instrText xml:space="preserve"> PAGEREF _Toc7382 \h </w:instrText>
       </w:r>
       <w:r>
         <w:fldChar w:fldCharType="separate"/>
@@ -406,7 +406,7 @@
         <w:fldChar w:fldCharType="begin"/>
       </w:r>
       <w:r>
-        <w:instrText xml:space="preserve"> HYPERLINK \l _Toc25691 </w:instrText>
+        <w:instrText xml:space="preserve"> HYPERLINK \l _Toc16396 </w:instrText>
       </w:r>
       <w:r>
         <w:fldChar w:fldCharType="separate"/>
@@ -421,7 +421,7 @@
         <w:fldChar w:fldCharType="begin"/>
       </w:r>
       <w:r>
-        <w:instrText xml:space="preserve"> PAGEREF _Toc25691 \h </w:instrText>
+        <w:instrText xml:space="preserve"> PAGEREF _Toc16396 \h </w:instrText>
       </w:r>
       <w:r>
         <w:fldChar w:fldCharType="separate"/>
@@ -447,7 +447,7 @@
         <w:fldChar w:fldCharType="begin"/>
       </w:r>
       <w:r>
-        <w:instrText xml:space="preserve"> HYPERLINK \l _Toc17642 </w:instrText>
+        <w:instrText xml:space="preserve"> HYPERLINK \l _Toc23881 </w:instrText>
       </w:r>
       <w:r>
         <w:fldChar w:fldCharType="separate"/>
@@ -462,7 +462,7 @@
         <w:fldChar w:fldCharType="begin"/>
       </w:r>
       <w:r>
-        <w:instrText xml:space="preserve"> PAGEREF _Toc17642 \h </w:instrText>
+        <w:instrText xml:space="preserve"> PAGEREF _Toc23881 \h </w:instrText>
       </w:r>
       <w:r>
         <w:fldChar w:fldCharType="separate"/>
@@ -488,7 +488,7 @@
         <w:fldChar w:fldCharType="begin"/>
       </w:r>
       <w:r>
-        <w:instrText xml:space="preserve"> HYPERLINK \l _Toc31800 </w:instrText>
+        <w:instrText xml:space="preserve"> HYPERLINK \l _Toc4836 </w:instrText>
       </w:r>
       <w:r>
         <w:fldChar w:fldCharType="separate"/>
@@ -503,7 +503,7 @@
         <w:fldChar w:fldCharType="begin"/>
       </w:r>
       <w:r>
-        <w:instrText xml:space="preserve"> PAGEREF _Toc31800 \h </w:instrText>
+        <w:instrText xml:space="preserve"> PAGEREF _Toc4836 \h </w:instrText>
       </w:r>
       <w:r>
         <w:fldChar w:fldCharType="separate"/>
@@ -529,7 +529,7 @@
         <w:fldChar w:fldCharType="begin"/>
       </w:r>
       <w:r>
-        <w:instrText xml:space="preserve"> HYPERLINK \l _Toc11794 </w:instrText>
+        <w:instrText xml:space="preserve"> HYPERLINK \l _Toc9297 </w:instrText>
       </w:r>
       <w:r>
         <w:fldChar w:fldCharType="separate"/>
@@ -544,7 +544,7 @@
         <w:fldChar w:fldCharType="begin"/>
       </w:r>
       <w:r>
-        <w:instrText xml:space="preserve"> PAGEREF _Toc11794 \h </w:instrText>
+        <w:instrText xml:space="preserve"> PAGEREF _Toc9297 \h </w:instrText>
       </w:r>
       <w:r>
         <w:fldChar w:fldCharType="separate"/>
@@ -570,7 +570,7 @@
         <w:fldChar w:fldCharType="begin"/>
       </w:r>
       <w:r>
-        <w:instrText xml:space="preserve"> HYPERLINK \l _Toc10532 </w:instrText>
+        <w:instrText xml:space="preserve"> HYPERLINK \l _Toc2753 </w:instrText>
       </w:r>
       <w:r>
         <w:fldChar w:fldCharType="separate"/>
@@ -585,7 +585,7 @@
         <w:fldChar w:fldCharType="begin"/>
       </w:r>
       <w:r>
-        <w:instrText xml:space="preserve"> PAGEREF _Toc10532 \h </w:instrText>
+        <w:instrText xml:space="preserve"> PAGEREF _Toc2753 \h </w:instrText>
       </w:r>
       <w:r>
         <w:fldChar w:fldCharType="separate"/>
@@ -611,7 +611,7 @@
         <w:fldChar w:fldCharType="begin"/>
       </w:r>
       <w:r>
-        <w:instrText xml:space="preserve"> HYPERLINK \l _Toc32318 </w:instrText>
+        <w:instrText xml:space="preserve"> HYPERLINK \l _Toc13051 </w:instrText>
       </w:r>
       <w:r>
         <w:fldChar w:fldCharType="separate"/>
@@ -626,7 +626,7 @@
         <w:fldChar w:fldCharType="begin"/>
       </w:r>
       <w:r>
-        <w:instrText xml:space="preserve"> PAGEREF _Toc32318 \h </w:instrText>
+        <w:instrText xml:space="preserve"> PAGEREF _Toc13051 \h </w:instrText>
       </w:r>
       <w:r>
         <w:fldChar w:fldCharType="separate"/>
@@ -652,7 +652,7 @@
         <w:fldChar w:fldCharType="begin"/>
       </w:r>
       <w:r>
-        <w:instrText xml:space="preserve"> HYPERLINK \l _Toc882 </w:instrText>
+        <w:instrText xml:space="preserve"> HYPERLINK \l _Toc25757 </w:instrText>
       </w:r>
       <w:r>
         <w:fldChar w:fldCharType="separate"/>
@@ -667,7 +667,7 @@
         <w:fldChar w:fldCharType="begin"/>
       </w:r>
       <w:r>
-        <w:instrText xml:space="preserve"> PAGEREF _Toc882 \h </w:instrText>
+        <w:instrText xml:space="preserve"> PAGEREF _Toc25757 \h </w:instrText>
       </w:r>
       <w:r>
         <w:fldChar w:fldCharType="separate"/>
@@ -693,7 +693,7 @@
         <w:fldChar w:fldCharType="begin"/>
       </w:r>
       <w:r>
-        <w:instrText xml:space="preserve"> HYPERLINK \l _Toc8189 </w:instrText>
+        <w:instrText xml:space="preserve"> HYPERLINK \l _Toc23031 </w:instrText>
       </w:r>
       <w:r>
         <w:fldChar w:fldCharType="separate"/>
@@ -708,7 +708,7 @@
         <w:fldChar w:fldCharType="begin"/>
       </w:r>
       <w:r>
-        <w:instrText xml:space="preserve"> PAGEREF _Toc8189 \h </w:instrText>
+        <w:instrText xml:space="preserve"> PAGEREF _Toc23031 \h </w:instrText>
       </w:r>
       <w:r>
         <w:fldChar w:fldCharType="separate"/>
@@ -734,7 +734,7 @@
         <w:fldChar w:fldCharType="begin"/>
       </w:r>
       <w:r>
-        <w:instrText xml:space="preserve"> HYPERLINK \l _Toc22742 </w:instrText>
+        <w:instrText xml:space="preserve"> HYPERLINK \l _Toc32669 </w:instrText>
       </w:r>
       <w:r>
         <w:fldChar w:fldCharType="separate"/>
@@ -749,7 +749,7 @@
         <w:fldChar w:fldCharType="begin"/>
       </w:r>
       <w:r>
-        <w:instrText xml:space="preserve"> PAGEREF _Toc22742 \h </w:instrText>
+        <w:instrText xml:space="preserve"> PAGEREF _Toc32669 \h </w:instrText>
       </w:r>
       <w:r>
         <w:fldChar w:fldCharType="separate"/>
@@ -775,7 +775,7 @@
         <w:fldChar w:fldCharType="begin"/>
       </w:r>
       <w:r>
-        <w:instrText xml:space="preserve"> HYPERLINK \l _Toc2578 </w:instrText>
+        <w:instrText xml:space="preserve"> HYPERLINK \l _Toc20539 </w:instrText>
       </w:r>
       <w:r>
         <w:fldChar w:fldCharType="separate"/>
@@ -790,7 +790,7 @@
         <w:fldChar w:fldCharType="begin"/>
       </w:r>
       <w:r>
-        <w:instrText xml:space="preserve"> PAGEREF _Toc2578 \h </w:instrText>
+        <w:instrText xml:space="preserve"> PAGEREF _Toc20539 \h </w:instrText>
       </w:r>
       <w:r>
         <w:fldChar w:fldCharType="separate"/>
@@ -816,7 +816,7 @@
         <w:fldChar w:fldCharType="begin"/>
       </w:r>
       <w:r>
-        <w:instrText xml:space="preserve"> HYPERLINK \l _Toc3446 </w:instrText>
+        <w:instrText xml:space="preserve"> HYPERLINK \l _Toc24989 </w:instrText>
       </w:r>
       <w:r>
         <w:fldChar w:fldCharType="separate"/>
@@ -831,7 +831,7 @@
         <w:fldChar w:fldCharType="begin"/>
       </w:r>
       <w:r>
-        <w:instrText xml:space="preserve"> PAGEREF _Toc3446 \h </w:instrText>
+        <w:instrText xml:space="preserve"> PAGEREF _Toc24989 \h </w:instrText>
       </w:r>
       <w:r>
         <w:fldChar w:fldCharType="separate"/>
@@ -857,7 +857,7 @@
         <w:fldChar w:fldCharType="begin"/>
       </w:r>
       <w:r>
-        <w:instrText xml:space="preserve"> HYPERLINK \l _Toc32433 </w:instrText>
+        <w:instrText xml:space="preserve"> HYPERLINK \l _Toc3059 </w:instrText>
       </w:r>
       <w:r>
         <w:fldChar w:fldCharType="separate"/>
@@ -872,7 +872,7 @@
         <w:fldChar w:fldCharType="begin"/>
       </w:r>
       <w:r>
-        <w:instrText xml:space="preserve"> PAGEREF _Toc32433 \h </w:instrText>
+        <w:instrText xml:space="preserve"> PAGEREF _Toc3059 \h </w:instrText>
       </w:r>
       <w:r>
         <w:fldChar w:fldCharType="separate"/>
@@ -898,7 +898,7 @@
         <w:fldChar w:fldCharType="begin"/>
       </w:r>
       <w:r>
-        <w:instrText xml:space="preserve"> HYPERLINK \l _Toc14011 </w:instrText>
+        <w:instrText xml:space="preserve"> HYPERLINK \l _Toc30960 </w:instrText>
       </w:r>
       <w:r>
         <w:fldChar w:fldCharType="separate"/>
@@ -913,7 +913,7 @@
         <w:fldChar w:fldCharType="begin"/>
       </w:r>
       <w:r>
-        <w:instrText xml:space="preserve"> PAGEREF _Toc14011 \h </w:instrText>
+        <w:instrText xml:space="preserve"> PAGEREF _Toc30960 \h </w:instrText>
       </w:r>
       <w:r>
         <w:fldChar w:fldCharType="separate"/>
@@ -939,7 +939,7 @@
         <w:fldChar w:fldCharType="begin"/>
       </w:r>
       <w:r>
-        <w:instrText xml:space="preserve"> HYPERLINK \l _Toc12698 </w:instrText>
+        <w:instrText xml:space="preserve"> HYPERLINK \l _Toc6060 </w:instrText>
       </w:r>
       <w:r>
         <w:fldChar w:fldCharType="separate"/>
@@ -954,7 +954,7 @@
         <w:fldChar w:fldCharType="begin"/>
       </w:r>
       <w:r>
-        <w:instrText xml:space="preserve"> PAGEREF _Toc12698 \h </w:instrText>
+        <w:instrText xml:space="preserve"> PAGEREF _Toc6060 \h </w:instrText>
       </w:r>
       <w:r>
         <w:fldChar w:fldCharType="separate"/>
@@ -980,7 +980,7 @@
         <w:fldChar w:fldCharType="begin"/>
       </w:r>
       <w:r>
-        <w:instrText xml:space="preserve"> HYPERLINK \l _Toc17784 </w:instrText>
+        <w:instrText xml:space="preserve"> HYPERLINK \l _Toc19790 </w:instrText>
       </w:r>
       <w:r>
         <w:fldChar w:fldCharType="separate"/>
@@ -995,7 +995,7 @@
         <w:fldChar w:fldCharType="begin"/>
       </w:r>
       <w:r>
-        <w:instrText xml:space="preserve"> PAGEREF _Toc17784 \h </w:instrText>
+        <w:instrText xml:space="preserve"> PAGEREF _Toc19790 \h </w:instrText>
       </w:r>
       <w:r>
         <w:fldChar w:fldCharType="separate"/>
@@ -1021,7 +1021,7 @@
         <w:fldChar w:fldCharType="begin"/>
       </w:r>
       <w:r>
-        <w:instrText xml:space="preserve"> HYPERLINK \l _Toc29727 </w:instrText>
+        <w:instrText xml:space="preserve"> HYPERLINK \l _Toc28188 </w:instrText>
       </w:r>
       <w:r>
         <w:fldChar w:fldCharType="separate"/>
@@ -1036,7 +1036,7 @@
         <w:fldChar w:fldCharType="begin"/>
       </w:r>
       <w:r>
-        <w:instrText xml:space="preserve"> PAGEREF _Toc29727 \h </w:instrText>
+        <w:instrText xml:space="preserve"> PAGEREF _Toc28188 \h </w:instrText>
       </w:r>
       <w:r>
         <w:fldChar w:fldCharType="separate"/>
@@ -1062,7 +1062,7 @@
         <w:fldChar w:fldCharType="begin"/>
       </w:r>
       <w:r>
-        <w:instrText xml:space="preserve"> HYPERLINK \l _Toc598 </w:instrText>
+        <w:instrText xml:space="preserve"> HYPERLINK \l _Toc8453 </w:instrText>
       </w:r>
       <w:r>
         <w:fldChar w:fldCharType="separate"/>
@@ -1077,7 +1077,7 @@
         <w:fldChar w:fldCharType="begin"/>
       </w:r>
       <w:r>
-        <w:instrText xml:space="preserve"> PAGEREF _Toc598 \h </w:instrText>
+        <w:instrText xml:space="preserve"> PAGEREF _Toc8453 \h </w:instrText>
       </w:r>
       <w:r>
         <w:fldChar w:fldCharType="separate"/>
@@ -1103,7 +1103,7 @@
         <w:fldChar w:fldCharType="begin"/>
       </w:r>
       <w:r>
-        <w:instrText xml:space="preserve"> HYPERLINK \l _Toc15965 </w:instrText>
+        <w:instrText xml:space="preserve"> HYPERLINK \l _Toc30973 </w:instrText>
       </w:r>
       <w:r>
         <w:fldChar w:fldCharType="separate"/>
@@ -1118,7 +1118,7 @@
         <w:fldChar w:fldCharType="begin"/>
       </w:r>
       <w:r>
-        <w:instrText xml:space="preserve"> PAGEREF _Toc15965 \h </w:instrText>
+        <w:instrText xml:space="preserve"> PAGEREF _Toc30973 \h </w:instrText>
       </w:r>
       <w:r>
         <w:fldChar w:fldCharType="separate"/>
@@ -1144,7 +1144,7 @@
         <w:fldChar w:fldCharType="begin"/>
       </w:r>
       <w:r>
-        <w:instrText xml:space="preserve"> HYPERLINK \l _Toc30386 </w:instrText>
+        <w:instrText xml:space="preserve"> HYPERLINK \l _Toc19691 </w:instrText>
       </w:r>
       <w:r>
         <w:fldChar w:fldCharType="separate"/>
@@ -1159,7 +1159,7 @@
         <w:fldChar w:fldCharType="begin"/>
       </w:r>
       <w:r>
-        <w:instrText xml:space="preserve"> PAGEREF _Toc30386 \h </w:instrText>
+        <w:instrText xml:space="preserve"> PAGEREF _Toc19691 \h </w:instrText>
       </w:r>
       <w:r>
         <w:fldChar w:fldCharType="separate"/>
@@ -1185,7 +1185,7 @@
         <w:fldChar w:fldCharType="begin"/>
       </w:r>
       <w:r>
-        <w:instrText xml:space="preserve"> HYPERLINK \l _Toc26411 </w:instrText>
+        <w:instrText xml:space="preserve"> HYPERLINK \l _Toc29642 </w:instrText>
       </w:r>
       <w:r>
         <w:fldChar w:fldCharType="separate"/>
@@ -1200,7 +1200,7 @@
         <w:fldChar w:fldCharType="begin"/>
       </w:r>
       <w:r>
-        <w:instrText xml:space="preserve"> PAGEREF _Toc26411 \h </w:instrText>
+        <w:instrText xml:space="preserve"> PAGEREF _Toc29642 \h </w:instrText>
       </w:r>
       <w:r>
         <w:fldChar w:fldCharType="separate"/>
@@ -1226,7 +1226,7 @@
         <w:fldChar w:fldCharType="begin"/>
       </w:r>
       <w:r>
-        <w:instrText xml:space="preserve"> HYPERLINK \l _Toc27976 </w:instrText>
+        <w:instrText xml:space="preserve"> HYPERLINK \l _Toc13476 </w:instrText>
       </w:r>
       <w:r>
         <w:fldChar w:fldCharType="separate"/>
@@ -1241,7 +1241,7 @@
         <w:fldChar w:fldCharType="begin"/>
       </w:r>
       <w:r>
-        <w:instrText xml:space="preserve"> PAGEREF _Toc27976 \h </w:instrText>
+        <w:instrText xml:space="preserve"> PAGEREF _Toc13476 \h </w:instrText>
       </w:r>
       <w:r>
         <w:fldChar w:fldCharType="separate"/>
@@ -1267,7 +1267,7 @@
         <w:fldChar w:fldCharType="begin"/>
       </w:r>
       <w:r>
-        <w:instrText xml:space="preserve"> HYPERLINK \l _Toc10379 </w:instrText>
+        <w:instrText xml:space="preserve"> HYPERLINK \l _Toc14691 </w:instrText>
       </w:r>
       <w:r>
         <w:fldChar w:fldCharType="separate"/>
@@ -1282,7 +1282,7 @@
         <w:fldChar w:fldCharType="begin"/>
       </w:r>
       <w:r>
-        <w:instrText xml:space="preserve"> PAGEREF _Toc10379 \h </w:instrText>
+        <w:instrText xml:space="preserve"> PAGEREF _Toc14691 \h </w:instrText>
       </w:r>
       <w:r>
         <w:fldChar w:fldCharType="separate"/>
@@ -1308,7 +1308,7 @@
         <w:fldChar w:fldCharType="begin"/>
       </w:r>
       <w:r>
-        <w:instrText xml:space="preserve"> HYPERLINK \l _Toc20835 </w:instrText>
+        <w:instrText xml:space="preserve"> HYPERLINK \l _Toc24109 </w:instrText>
       </w:r>
       <w:r>
         <w:fldChar w:fldCharType="separate"/>
@@ -1323,7 +1323,7 @@
         <w:fldChar w:fldCharType="begin"/>
       </w:r>
       <w:r>
-        <w:instrText xml:space="preserve"> PAGEREF _Toc20835 \h </w:instrText>
+        <w:instrText xml:space="preserve"> PAGEREF _Toc24109 \h </w:instrText>
       </w:r>
       <w:r>
         <w:fldChar w:fldCharType="separate"/>
@@ -1349,7 +1349,7 @@
         <w:fldChar w:fldCharType="begin"/>
       </w:r>
       <w:r>
-        <w:instrText xml:space="preserve"> HYPERLINK \l _Toc15524 </w:instrText>
+        <w:instrText xml:space="preserve"> HYPERLINK \l _Toc31720 </w:instrText>
       </w:r>
       <w:r>
         <w:fldChar w:fldCharType="separate"/>
@@ -1364,7 +1364,7 @@
         <w:fldChar w:fldCharType="begin"/>
       </w:r>
       <w:r>
-        <w:instrText xml:space="preserve"> PAGEREF _Toc15524 \h </w:instrText>
+        <w:instrText xml:space="preserve"> PAGEREF _Toc31720 \h </w:instrText>
       </w:r>
       <w:r>
         <w:fldChar w:fldCharType="separate"/>
@@ -1390,7 +1390,7 @@
         <w:fldChar w:fldCharType="begin"/>
       </w:r>
       <w:r>
-        <w:instrText xml:space="preserve"> HYPERLINK \l _Toc10352 </w:instrText>
+        <w:instrText xml:space="preserve"> HYPERLINK \l _Toc20187 </w:instrText>
       </w:r>
       <w:r>
         <w:fldChar w:fldCharType="separate"/>
@@ -1405,7 +1405,7 @@
         <w:fldChar w:fldCharType="begin"/>
       </w:r>
       <w:r>
-        <w:instrText xml:space="preserve"> PAGEREF _Toc10352 \h </w:instrText>
+        <w:instrText xml:space="preserve"> PAGEREF _Toc20187 \h </w:instrText>
       </w:r>
       <w:r>
         <w:fldChar w:fldCharType="separate"/>
@@ -1431,13 +1431,13 @@
         <w:fldChar w:fldCharType="begin"/>
       </w:r>
       <w:r>
-        <w:instrText xml:space="preserve"> HYPERLINK \l _Toc32656 </w:instrText>
+        <w:instrText xml:space="preserve"> HYPERLINK \l _Toc8263 </w:instrText>
       </w:r>
       <w:r>
         <w:fldChar w:fldCharType="separate"/>
       </w:r>
       <w:r>
-        <w:t>6.8 Bảng đối chiếu tiêu chí đã chốt trước</w:t>
+        <w:t>6.8 E11 – Tái lập 3-layer THARM bằng đúng số liệu của paper chính</w:t>
       </w:r>
       <w:r>
         <w:tab/>
@@ -1446,13 +1446,54 @@
         <w:fldChar w:fldCharType="begin"/>
       </w:r>
       <w:r>
-        <w:instrText xml:space="preserve"> PAGEREF _Toc32656 \h </w:instrText>
+        <w:instrText xml:space="preserve"> PAGEREF _Toc8263 \h </w:instrText>
       </w:r>
       <w:r>
         <w:fldChar w:fldCharType="separate"/>
       </w:r>
       <w:r>
-        <w:t>19</w:t>
+        <w:t>20</w:t>
+      </w:r>
+      <w:r>
+        <w:fldChar w:fldCharType="end"/>
+      </w:r>
+      <w:r>
+        <w:fldChar w:fldCharType="end"/>
+      </w:r>
+    </w:p>
+    <w:p>
+      <w:pPr>
+        <w:pStyle w:val="38"/>
+        <w:tabs>
+          <w:tab w:val="right" w:leader="dot" w:pos="9071"/>
+        </w:tabs>
+      </w:pPr>
+      <w:r>
+        <w:fldChar w:fldCharType="begin"/>
+      </w:r>
+      <w:r>
+        <w:instrText xml:space="preserve"> HYPERLINK \l _Toc8488 </w:instrText>
+      </w:r>
+      <w:r>
+        <w:fldChar w:fldCharType="separate"/>
+      </w:r>
+      <w:r>
+        <w:t>6.9 Bảng đối chiếu tiêu chí đã chốt trước</w:t>
+      </w:r>
+      <w:r>
+        <w:tab/>
+      </w:r>
+      <w:r>
+        <w:fldChar w:fldCharType="begin"/>
+      </w:r>
+      <w:r>
+        <w:instrText xml:space="preserve"> PAGEREF _Toc8488 \h </w:instrText>
+      </w:r>
+      <w:r>
+        <w:fldChar w:fldCharType="separate"/>
+      </w:r>
+      <w:r>
+        <w:t>21</w:t>
       </w:r>
       <w:r>
         <w:fldChar w:fldCharType="end"/>
@@ -1472,7 +1513,7 @@
         <w:fldChar w:fldCharType="begin"/>
       </w:r>
       <w:r>
-        <w:instrText xml:space="preserve"> HYPERLINK \l _Toc280 </w:instrText>
+        <w:instrText xml:space="preserve"> HYPERLINK \l _Toc843 </w:instrText>
       </w:r>
       <w:r>
         <w:fldChar w:fldCharType="separate"/>
@@ -1487,13 +1528,13 @@
         <w:fldChar w:fldCharType="begin"/>
       </w:r>
       <w:r>
-        <w:instrText xml:space="preserve"> PAGEREF _Toc280 \h </w:instrText>
+        <w:instrText xml:space="preserve"> PAGEREF _Toc843 \h </w:instrText>
       </w:r>
       <w:r>
         <w:fldChar w:fldCharType="separate"/>
       </w:r>
       <w:r>
-        <w:t>20</w:t>
+        <w:t>21</w:t>
       </w:r>
       <w:r>
         <w:fldChar w:fldCharType="end"/>
@@ -1513,7 +1554,7 @@
         <w:fldChar w:fldCharType="begin"/>
       </w:r>
       <w:r>
-        <w:instrText xml:space="preserve"> HYPERLINK \l _Toc9338 </w:instrText>
+        <w:instrText xml:space="preserve"> HYPERLINK \l _Toc8703 </w:instrText>
       </w:r>
       <w:r>
         <w:fldChar w:fldCharType="separate"/>
@@ -1528,13 +1569,13 @@
         <w:fldChar w:fldCharType="begin"/>
       </w:r>
       <w:r>
-        <w:instrText xml:space="preserve"> PAGEREF _Toc9338 \h </w:instrText>
+        <w:instrText xml:space="preserve"> PAGEREF _Toc8703 \h </w:instrText>
       </w:r>
       <w:r>
         <w:fldChar w:fldCharType="separate"/>
       </w:r>
       <w:r>
-        <w:t>20</w:t>
+        <w:t>21</w:t>
       </w:r>
       <w:r>
         <w:fldChar w:fldCharType="end"/>
@@ -1554,7 +1595,7 @@
         <w:fldChar w:fldCharType="begin"/>
       </w:r>
       <w:r>
-        <w:instrText xml:space="preserve"> HYPERLINK \l _Toc19542 </w:instrText>
+        <w:instrText xml:space="preserve"> HYPERLINK \l _Toc23612 </w:instrText>
       </w:r>
       <w:r>
         <w:fldChar w:fldCharType="separate"/>
@@ -1569,13 +1610,13 @@
         <w:fldChar w:fldCharType="begin"/>
       </w:r>
       <w:r>
-        <w:instrText xml:space="preserve"> PAGEREF _Toc19542 \h </w:instrText>
+        <w:instrText xml:space="preserve"> PAGEREF _Toc23612 \h </w:instrText>
       </w:r>
       <w:r>
         <w:fldChar w:fldCharType="separate"/>
       </w:r>
       <w:r>
-        <w:t>21</w:t>
+        <w:t>22</w:t>
       </w:r>
       <w:r>
         <w:fldChar w:fldCharType="end"/>
@@ -1595,7 +1636,7 @@
         <w:fldChar w:fldCharType="begin"/>
       </w:r>
       <w:r>
-        <w:instrText xml:space="preserve"> HYPERLINK \l _Toc16617 </w:instrText>
+        <w:instrText xml:space="preserve"> HYPERLINK \l _Toc31087 </w:instrText>
       </w:r>
       <w:r>
         <w:fldChar w:fldCharType="separate"/>
@@ -1610,13 +1651,13 @@
         <w:fldChar w:fldCharType="begin"/>
       </w:r>
       <w:r>
-        <w:instrText xml:space="preserve"> PAGEREF _Toc16617 \h </w:instrText>
+        <w:instrText xml:space="preserve"> PAGEREF _Toc31087 \h </w:instrText>
       </w:r>
       <w:r>
         <w:fldChar w:fldCharType="separate"/>
       </w:r>
       <w:r>
-        <w:t>22</w:t>
+        <w:t>23</w:t>
       </w:r>
       <w:r>
         <w:fldChar w:fldCharType="end"/>
@@ -1636,7 +1677,7 @@
         <w:fldChar w:fldCharType="begin"/>
       </w:r>
       <w:r>
-        <w:instrText xml:space="preserve"> HYPERLINK \l _Toc30762 </w:instrText>
+        <w:instrText xml:space="preserve"> HYPERLINK \l _Toc20802 </w:instrText>
       </w:r>
       <w:r>
         <w:fldChar w:fldCharType="separate"/>
@@ -1651,13 +1692,13 @@
         <w:fldChar w:fldCharType="begin"/>
       </w:r>
       <w:r>
-        <w:instrText xml:space="preserve"> PAGEREF _Toc30762 \h </w:instrText>
+        <w:instrText xml:space="preserve"> PAGEREF _Toc20802 \h </w:instrText>
       </w:r>
       <w:r>
         <w:fldChar w:fldCharType="separate"/>
       </w:r>
       <w:r>
-        <w:t>22</w:t>
+        <w:t>24</w:t>
       </w:r>
       <w:r>
         <w:fldChar w:fldCharType="end"/>
@@ -1677,7 +1718,7 @@
         <w:fldChar w:fldCharType="begin"/>
       </w:r>
       <w:r>
-        <w:instrText xml:space="preserve"> HYPERLINK \l _Toc18219 </w:instrText>
+        <w:instrText xml:space="preserve"> HYPERLINK \l _Toc16877 </w:instrText>
       </w:r>
       <w:r>
         <w:fldChar w:fldCharType="separate"/>
@@ -1692,13 +1733,13 @@
         <w:fldChar w:fldCharType="begin"/>
       </w:r>
       <w:r>
-        <w:instrText xml:space="preserve"> PAGEREF _Toc18219 \h </w:instrText>
+        <w:instrText xml:space="preserve"> PAGEREF _Toc16877 \h </w:instrText>
       </w:r>
       <w:r>
         <w:fldChar w:fldCharType="separate"/>
       </w:r>
       <w:r>
-        <w:t>23</w:t>
+        <w:t>25</w:t>
       </w:r>
       <w:r>
         <w:fldChar w:fldCharType="end"/>
@@ -1718,7 +1759,7 @@
         <w:fldChar w:fldCharType="begin"/>
       </w:r>
       <w:r>
-        <w:instrText xml:space="preserve"> HYPERLINK \l _Toc8394 </w:instrText>
+        <w:instrText xml:space="preserve"> HYPERLINK \l _Toc13363 </w:instrText>
       </w:r>
       <w:r>
         <w:fldChar w:fldCharType="separate"/>
@@ -1733,13 +1774,13 @@
         <w:fldChar w:fldCharType="begin"/>
       </w:r>
       <w:r>
-        <w:instrText xml:space="preserve"> PAGEREF _Toc8394 \h </w:instrText>
+        <w:instrText xml:space="preserve"> PAGEREF _Toc13363 \h </w:instrText>
       </w:r>
       <w:r>
         <w:fldChar w:fldCharType="separate"/>
       </w:r>
       <w:r>
-        <w:t>23</w:t>
+        <w:t>25</w:t>
       </w:r>
       <w:r>
         <w:fldChar w:fldCharType="end"/>
@@ -1759,7 +1800,7 @@
         <w:fldChar w:fldCharType="begin"/>
       </w:r>
       <w:r>
-        <w:instrText xml:space="preserve"> HYPERLINK \l _Toc4406 </w:instrText>
+        <w:instrText xml:space="preserve"> HYPERLINK \l _Toc19071 </w:instrText>
       </w:r>
       <w:r>
         <w:fldChar w:fldCharType="separate"/>
@@ -1774,13 +1815,13 @@
         <w:fldChar w:fldCharType="begin"/>
       </w:r>
       <w:r>
-        <w:instrText xml:space="preserve"> PAGEREF _Toc4406 \h </w:instrText>
+        <w:instrText xml:space="preserve"> PAGEREF _Toc19071 \h </w:instrText>
       </w:r>
       <w:r>
         <w:fldChar w:fldCharType="separate"/>
       </w:r>
       <w:r>
-        <w:t>24</w:t>
+        <w:t>26</w:t>
       </w:r>
       <w:r>
         <w:fldChar w:fldCharType="end"/>
@@ -1800,7 +1841,7 @@
         <w:fldChar w:fldCharType="begin"/>
       </w:r>
       <w:r>
-        <w:instrText xml:space="preserve"> HYPERLINK \l _Toc5256 </w:instrText>
+        <w:instrText xml:space="preserve"> HYPERLINK \l _Toc21103 </w:instrText>
       </w:r>
       <w:r>
         <w:fldChar w:fldCharType="separate"/>
@@ -1815,13 +1856,13 @@
         <w:fldChar w:fldCharType="begin"/>
       </w:r>
       <w:r>
-        <w:instrText xml:space="preserve"> PAGEREF _Toc5256 \h </w:instrText>
+        <w:instrText xml:space="preserve"> PAGEREF _Toc21103 \h </w:instrText>
       </w:r>
       <w:r>
         <w:fldChar w:fldCharType="separate"/>
       </w:r>
       <w:r>
-        <w:t>25</w:t>
+        <w:t>27</w:t>
       </w:r>
       <w:r>
         <w:fldChar w:fldCharType="end"/>
@@ -1841,7 +1882,7 @@
         <w:fldChar w:fldCharType="begin"/>
       </w:r>
       <w:r>
-        <w:instrText xml:space="preserve"> HYPERLINK \l _Toc26495 </w:instrText>
+        <w:instrText xml:space="preserve"> HYPERLINK \l _Toc25493 </w:instrText>
       </w:r>
       <w:r>
         <w:fldChar w:fldCharType="separate"/>
@@ -1856,13 +1897,13 @@
         <w:fldChar w:fldCharType="begin"/>
       </w:r>
       <w:r>
-        <w:instrText xml:space="preserve"> PAGEREF _Toc26495 \h </w:instrText>
+        <w:instrText xml:space="preserve"> PAGEREF _Toc25493 \h </w:instrText>
       </w:r>
       <w:r>
         <w:fldChar w:fldCharType="separate"/>
       </w:r>
       <w:r>
-        <w:t>25</w:t>
+        <w:t>27</w:t>
       </w:r>
       <w:r>
         <w:fldChar w:fldCharType="end"/>
@@ -1882,7 +1923,7 @@
         <w:fldChar w:fldCharType="begin"/>
       </w:r>
       <w:r>
-        <w:instrText xml:space="preserve"> HYPERLINK \l _Toc1992 </w:instrText>
+        <w:instrText xml:space="preserve"> HYPERLINK \l _Toc22770 </w:instrText>
       </w:r>
       <w:r>
         <w:fldChar w:fldCharType="separate"/>
@@ -1897,13 +1938,13 @@
         <w:fldChar w:fldCharType="begin"/>
       </w:r>
       <w:r>
-        <w:instrText xml:space="preserve"> PAGEREF _Toc1992 \h </w:instrText>
+        <w:instrText xml:space="preserve"> PAGEREF _Toc22770 \h </w:instrText>
       </w:r>
       <w:r>
         <w:fldChar w:fldCharType="separate"/>
       </w:r>
       <w:r>
-        <w:t>25</w:t>
+        <w:t>27</w:t>
       </w:r>
       <w:r>
         <w:fldChar w:fldCharType="end"/>
@@ -1923,7 +1964,7 @@
         <w:fldChar w:fldCharType="begin"/>
       </w:r>
       <w:r>
-        <w:instrText xml:space="preserve"> HYPERLINK \l _Toc2961 </w:instrText>
+        <w:instrText xml:space="preserve"> HYPERLINK \l _Toc21339 </w:instrText>
       </w:r>
       <w:r>
         <w:fldChar w:fldCharType="separate"/>
@@ -1938,13 +1979,13 @@
         <w:fldChar w:fldCharType="begin"/>
       </w:r>
       <w:r>
-        <w:instrText xml:space="preserve"> PAGEREF _Toc2961 \h </w:instrText>
+        <w:instrText xml:space="preserve"> PAGEREF _Toc21339 \h </w:instrText>
       </w:r>
       <w:r>
         <w:fldChar w:fldCharType="separate"/>
       </w:r>
       <w:r>
-        <w:t>26</w:t>
+        <w:t>28</w:t>
       </w:r>
       <w:r>
         <w:fldChar w:fldCharType="end"/>
@@ -1964,7 +2005,7 @@
         <w:fldChar w:fldCharType="begin"/>
       </w:r>
       <w:r>
-        <w:instrText xml:space="preserve"> HYPERLINK \l _Toc438 </w:instrText>
+        <w:instrText xml:space="preserve"> HYPERLINK \l _Toc5589 </w:instrText>
       </w:r>
       <w:r>
         <w:fldChar w:fldCharType="separate"/>
@@ -1979,13 +2020,13 @@
         <w:fldChar w:fldCharType="begin"/>
       </w:r>
       <w:r>
-        <w:instrText xml:space="preserve"> PAGEREF _Toc438 \h </w:instrText>
+        <w:instrText xml:space="preserve"> PAGEREF _Toc5589 \h </w:instrText>
       </w:r>
       <w:r>
         <w:fldChar w:fldCharType="separate"/>
       </w:r>
       <w:r>
-        <w:t>26</w:t>
+        <w:t>28</w:t>
       </w:r>
       <w:r>
         <w:fldChar w:fldCharType="end"/>
@@ -2005,7 +2046,7 @@
         <w:fldChar w:fldCharType="begin"/>
       </w:r>
       <w:r>
-        <w:instrText xml:space="preserve"> HYPERLINK \l _Toc19573 </w:instrText>
+        <w:instrText xml:space="preserve"> HYPERLINK \l _Toc13754 </w:instrText>
       </w:r>
       <w:r>
         <w:fldChar w:fldCharType="separate"/>
@@ -2020,13 +2061,13 @@
         <w:fldChar w:fldCharType="begin"/>
       </w:r>
       <w:r>
-        <w:instrText xml:space="preserve"> PAGEREF _Toc19573 \h </w:instrText>
+        <w:instrText xml:space="preserve"> PAGEREF _Toc13754 \h </w:instrText>
       </w:r>
       <w:r>
         <w:fldChar w:fldCharType="separate"/>
       </w:r>
       <w:r>
-        <w:t>27</w:t>
+        <w:t>28</w:t>
       </w:r>
       <w:r>
         <w:fldChar w:fldCharType="end"/>
@@ -2046,7 +2087,7 @@
         <w:fldChar w:fldCharType="begin"/>
       </w:r>
       <w:r>
-        <w:instrText xml:space="preserve"> HYPERLINK \l _Toc3999 </w:instrText>
+        <w:instrText xml:space="preserve"> HYPERLINK \l _Toc27330 </w:instrText>
       </w:r>
       <w:r>
         <w:fldChar w:fldCharType="separate"/>
@@ -2061,13 +2102,13 @@
         <w:fldChar w:fldCharType="begin"/>
       </w:r>
       <w:r>
-        <w:instrText xml:space="preserve"> PAGEREF _Toc3999 \h </w:instrText>
+        <w:instrText xml:space="preserve"> PAGEREF _Toc27330 \h </w:instrText>
       </w:r>
       <w:r>
         <w:fldChar w:fldCharType="separate"/>
       </w:r>
       <w:r>
-        <w:t>27</w:t>
+        <w:t>28</w:t>
       </w:r>
       <w:r>
         <w:fldChar w:fldCharType="end"/>
@@ -2087,7 +2128,7 @@
         <w:fldChar w:fldCharType="begin"/>
       </w:r>
       <w:r>
-        <w:instrText xml:space="preserve"> HYPERLINK \l _Toc6943 </w:instrText>
+        <w:instrText xml:space="preserve"> HYPERLINK \l _Toc28019 </w:instrText>
       </w:r>
       <w:r>
         <w:fldChar w:fldCharType="separate"/>
@@ -2102,13 +2143,13 @@
         <w:fldChar w:fldCharType="begin"/>
       </w:r>
       <w:r>
-        <w:instrText xml:space="preserve"> PAGEREF _Toc6943 \h </w:instrText>
+        <w:instrText xml:space="preserve"> PAGEREF _Toc28019 \h </w:instrText>
       </w:r>
       <w:r>
         <w:fldChar w:fldCharType="separate"/>
       </w:r>
       <w:r>
-        <w:t>27</w:t>
+        <w:t>29</w:t>
       </w:r>
       <w:r>
         <w:fldChar w:fldCharType="end"/>
@@ -2128,7 +2169,7 @@
         <w:fldChar w:fldCharType="begin"/>
       </w:r>
       <w:r>
-        <w:instrText xml:space="preserve"> HYPERLINK \l _Toc31766 </w:instrText>
+        <w:instrText xml:space="preserve"> HYPERLINK \l _Toc8241 </w:instrText>
       </w:r>
       <w:r>
         <w:fldChar w:fldCharType="separate"/>
@@ -2143,13 +2184,13 @@
         <w:fldChar w:fldCharType="begin"/>
       </w:r>
       <w:r>
-        <w:instrText xml:space="preserve"> PAGEREF _Toc31766 \h </w:instrText>
+        <w:instrText xml:space="preserve"> PAGEREF _Toc8241 \h </w:instrText>
       </w:r>
       <w:r>
         <w:fldChar w:fldCharType="separate"/>
       </w:r>
       <w:r>
-        <w:t>27</w:t>
+        <w:t>29</w:t>
       </w:r>
       <w:r>
         <w:fldChar w:fldCharType="end"/>
@@ -2172,7 +2213,7 @@
       <w:pPr>
         <w:pStyle w:val="2"/>
       </w:pPr>
-      <w:bookmarkStart w:id="0" w:name="_Toc9216"/>
+      <w:bookmarkStart w:id="0" w:name="_Toc27578"/>
       <w:r>
         <w:t>Chương 1. Mở đầu</w:t>
       </w:r>
@@ -2182,7 +2223,7 @@
       <w:pPr>
         <w:pStyle w:val="3"/>
       </w:pPr>
-      <w:bookmarkStart w:id="1" w:name="_Toc2486"/>
+      <w:bookmarkStart w:id="1" w:name="_Toc24435"/>
       <w:r>
         <w:t>1.1 Bối cảnh</w:t>
       </w:r>
@@ -2218,7 +2259,7 @@
       <w:pPr>
         <w:pStyle w:val="3"/>
       </w:pPr>
-      <w:bookmarkStart w:id="2" w:name="_Toc24776"/>
+      <w:bookmarkStart w:id="2" w:name="_Toc14312"/>
       <w:r>
         <w:t>1.2 Mục tiêu và phạm vi</w:t>
       </w:r>
@@ -2276,7 +2317,7 @@
       <w:pPr>
         <w:pStyle w:val="3"/>
       </w:pPr>
-      <w:bookmarkStart w:id="3" w:name="_Toc11554"/>
+      <w:bookmarkStart w:id="3" w:name="_Toc348"/>
       <w:r>
         <w:t>1.3 Câu hỏi nghiên cứu, giả thuyết và tiêu chí thành công</w:t>
       </w:r>
@@ -2797,7 +2838,7 @@
       <w:pPr>
         <w:pStyle w:val="3"/>
       </w:pPr>
-      <w:bookmarkStart w:id="4" w:name="_Toc21712"/>
+      <w:bookmarkStart w:id="4" w:name="_Toc9084"/>
       <w:r>
         <w:t>1.4 Đóng góp riêng của đề tài</w:t>
       </w:r>
@@ -2941,7 +2982,7 @@
       <w:pPr>
         <w:pStyle w:val="2"/>
       </w:pPr>
-      <w:bookmarkStart w:id="5" w:name="_Toc29509"/>
+      <w:bookmarkStart w:id="5" w:name="_Toc7382"/>
       <w:r>
         <w:t>Chương 2. Tài liệu nền và phiếu tái lập</w:t>
       </w:r>
@@ -2951,7 +2992,7 @@
       <w:pPr>
         <w:pStyle w:val="3"/>
       </w:pPr>
-      <w:bookmarkStart w:id="6" w:name="_Toc25691"/>
+      <w:bookmarkStart w:id="6" w:name="_Toc16396"/>
       <w:r>
         <w:t>2.1 Paper chính: hybrid Moving Target Defence trong IoT</w:t>
       </w:r>
@@ -3041,7 +3082,21 @@
           <w:b w:val="0"/>
           <w:i w:val="0"/>
         </w:rPr>
-        <w:t xml:space="preserve"> của paper chính bằng mô hình đồ thị tấn công rút gọn, rồi nối hai track bằng biến thể MTD lai kích hoạt bởi cảnh báo của AE.</w:t>
+        <w:t xml:space="preserve"> của paper chính bằng mô hình đồ thị tấn công rút gọn, rồi nối hai track bằng biến thể MTD lai kích hoạt bởi cảnh báo của AE. Sau khi có toàn văn, Track B được bổ sung thí nghiệm </w:t>
+      </w:r>
+      <w:r>
+        <w:rPr>
+          <w:b/>
+          <w:i w:val="0"/>
+        </w:rPr>
+        <w:t>E11 tái lập 3-layer THARM bằng đúng số liệu của paper</w:t>
+      </w:r>
+      <w:r>
+        <w:rPr>
+          <w:b w:val="0"/>
+          <w:i w:val="0"/>
+        </w:rPr>
+        <w:t xml:space="preserve"> (mục 6.8).</w:t>
       </w:r>
     </w:p>
     <w:p>
@@ -3221,7 +3276,7 @@
               <w:rPr>
                 <w:sz w:val="20"/>
               </w:rPr>
-              <w:t>3-layer THARM: trạng thái mạng theo thời gian → đồ thị tiếp cận → cây lỗ hổng → metric</w:t>
+              <w:t>3-layer THARM (N, U, S, L, C): đồ thị VM, đồ thị dịch vụ, cây lỗ hổng OR của từng VM → metric</w:t>
             </w:r>
           </w:p>
         </w:tc>
@@ -3255,7 +3310,7 @@
               <w:rPr>
                 <w:sz w:val="20"/>
               </w:rPr>
-              <w:t>Kỹ thuật</w:t>
+              <w:t>Kịch bản</w:t>
             </w:r>
           </w:p>
         </w:tc>
@@ -3268,7 +3323,7 @@
               <w:rPr>
                 <w:sz w:val="20"/>
               </w:rPr>
-              <w:t>Shuffle, diversity và tổ hợp (cần đối chiếu toàn văn về redundancy, chu kỳ)</w:t>
+              <w:t>Không dùng dataset; 4 host, 8 VM (Linux/Windows 11/FreeBSD), 14 dịch vụ, V8 là CSDL đích; 18 CVE hệ điều hành (Bảng 1) + 14 CVE dịch vụ (Bảng 2) kèm CVSS, impact, exploitability, cost</w:t>
             </w:r>
           </w:p>
         </w:tc>
@@ -3302,7 +3357,7 @@
               <w:rPr>
                 <w:sz w:val="20"/>
               </w:rPr>
-              <w:t>Metric</w:t>
+              <w:t>Kỹ thuật</w:t>
             </w:r>
           </w:p>
         </w:tc>
@@ -3315,7 +3370,7 @@
               <w:rPr>
                 <w:sz w:val="20"/>
               </w:rPr>
-              <w:t>Xác suất tấn công thành công, attack risk, attack cost, đường tấn công</w:t>
+              <w:t>Shuffle (VM live migration, IP shuffling qua SDN), diversity (đổi OS), redundancy (nhân bản VM); time-based, chu kỳ 10 phút</w:t>
             </w:r>
           </w:p>
         </w:tc>
@@ -3349,7 +3404,7 @@
               <w:rPr>
                 <w:sz w:val="20"/>
               </w:rPr>
-              <w:t>Kết quả mục tiêu</w:t>
+              <w:t>Metric</w:t>
             </w:r>
           </w:p>
         </w:tc>
@@ -3362,7 +3417,7 @@
               <w:rPr>
                 <w:sz w:val="20"/>
               </w:rPr>
-              <w:t>Kết hợp shuffle + diversity tốt hơn dùng riêng</w:t>
+              <w:t>ASP, attack risk, attack cost, return on attack, độ trung tâm, IPV, PSV</w:t>
             </w:r>
           </w:p>
         </w:tc>
@@ -3396,6 +3451,53 @@
               <w:rPr>
                 <w:sz w:val="20"/>
               </w:rPr>
+              <w:t>Kết quả mục tiêu</w:t>
+            </w:r>
+          </w:p>
+        </w:tc>
+        <w:tc>
+          <w:tcPr>
+            <w:tcW w:w="7087" w:type="dxa"/>
+          </w:tcPr>
+          <w:p>
+            <w:r>
+              <w:rPr>
+                <w:sz w:val="20"/>
+              </w:rPr>
+              <w:t>Ví dụ V5: R_s = 167.38, R_d = 163.73, R_r = 260.84; shuffle + diversity tốt nhất</w:t>
+            </w:r>
+          </w:p>
+        </w:tc>
+      </w:tr>
+      <w:tr>
+        <w:tblPrEx>
+          <w:tblBorders>
+            <w:top w:val="single" w:color="auto" w:sz="4" w:space="0"/>
+            <w:left w:val="single" w:color="auto" w:sz="4" w:space="0"/>
+            <w:bottom w:val="single" w:color="auto" w:sz="4" w:space="0"/>
+            <w:right w:val="single" w:color="auto" w:sz="4" w:space="0"/>
+            <w:insideH w:val="single" w:color="auto" w:sz="4" w:space="0"/>
+            <w:insideV w:val="single" w:color="auto" w:sz="4" w:space="0"/>
+          </w:tblBorders>
+          <w:tblCellMar>
+            <w:top w:w="0" w:type="dxa"/>
+            <w:left w:w="108" w:type="dxa"/>
+            <w:bottom w:w="0" w:type="dxa"/>
+            <w:right w:w="108" w:type="dxa"/>
+          </w:tblCellMar>
+        </w:tblPrEx>
+        <w:trPr>
+          <w:jc w:val="center"/>
+        </w:trPr>
+        <w:tc>
+          <w:tcPr>
+            <w:tcW w:w="1984" w:type="dxa"/>
+          </w:tcPr>
+          <w:p>
+            <w:r>
+              <w:rPr>
+                <w:sz w:val="20"/>
+              </w:rPr>
               <w:t>Liên hệ DT043</w:t>
             </w:r>
           </w:p>
@@ -3420,7 +3522,7 @@
       <w:pPr>
         <w:pStyle w:val="4"/>
       </w:pPr>
-      <w:bookmarkStart w:id="7" w:name="_Toc17642"/>
+      <w:bookmarkStart w:id="7" w:name="_Toc23881"/>
       <w:r>
         <w:t>Hạn chế và điểm cần tái lập (≥ 5)</w:t>
       </w:r>
@@ -3444,7 +3546,7 @@
         <w:rPr>
           <w:b w:val="0"/>
         </w:rPr>
-        <w:t>Đánh giá bằng mô hình đồ thị tấn công (mô phỏng), không triển khai trên thiết bị thật.</w:t>
+        <w:t>Chỉ đánh giá bằng mô hình đồ thị (mô phỏng), không triển khai thiết bị thật; tác giả tự nêu chưa đo QoS.</w:t>
       </w:r>
     </w:p>
     <w:p>
@@ -3465,7 +3567,7 @@
         <w:rPr>
           <w:b w:val="0"/>
         </w:rPr>
-        <w:t>Xác suất khai thác thường gán tĩnh theo CVSS, không phản ánh kẻ tấn công thích nghi.</w:t>
+        <w:t>Xác suất khai thác gán tĩnh theo CVSS, không mô hình kẻ tấn công thích nghi (mục 6 tự nêu "fixed vulnerability").</w:t>
       </w:r>
     </w:p>
     <w:p>
@@ -3486,7 +3588,7 @@
         <w:rPr>
           <w:b w:val="0"/>
         </w:rPr>
-        <w:t>Không mô hình hóa bộ phát hiện kích hoạt MTD và sai số của nó (FP gây move vô ích, FN/độ trễ gây lộ diện) – khoảng trống Track B khai thác.</w:t>
+        <w:t>Chỉ xét MTD time-based dù có nêu hybrid; không mô hình hóa bộ phát hiện kích hoạt MTD và sai số của nó (FP gây move vô ích, FN gây lộ diện) – khoảng trống Track B khai thác.</w:t>
       </w:r>
     </w:p>
     <w:p>
@@ -3507,7 +3609,7 @@
         <w:rPr>
           <w:b w:val="0"/>
         </w:rPr>
-        <w:t>Chi phí tài nguyên của MTD được nêu là vấn đề nhưng chưa có số đo trên thiết bị edge cụ thể.</w:t>
+        <w:t>Chi phí tài nguyên của MTD được nêu là vấn đề nhưng không đo trên thiết bị.</w:t>
       </w:r>
     </w:p>
     <w:p>
@@ -3528,7 +3630,7 @@
         <w:rPr>
           <w:b w:val="0"/>
         </w:rPr>
-        <w:t>Khả năng mở rộng khi số node/lỗ hổng tăng (bùng nổ số đường tấn công).</w:t>
+        <w:t>Công thức bản in mâu thuẫn: Eq. 1 "1 − (∏ + ∏)" có thể âm, Eq. 2–3 ghi tích nhưng số trong bài là tổng; danh sách cạnh sau shuffle bị cắt bằng "…".</w:t>
       </w:r>
     </w:p>
     <w:p>
@@ -3549,7 +3651,7 @@
         <w:rPr>
           <w:b w:val="0"/>
         </w:rPr>
-        <w:t>Sự sẵn có của mã nguồn/cấu hình topology quyết định khả năng tái lập số liệu tuyệt đối; DT043 chỉ tái lập xu hướng.</w:t>
+        <w:t>Không công bố mã nguồn và dữ liệu ("No data was used"); Bảng 4 không nêu đủ cách tính để tái lập.</w:t>
       </w:r>
     </w:p>
     <w:p>
@@ -3570,7 +3672,7 @@
         <w:rPr>
           <w:b w:val="0"/>
         </w:rPr>
-        <w:t>Độ nhạy của kết quả theo chu kỳ MTD.</w:t>
+        <w:t>Topology không nhất quán: Definition 2 thiếu cạnh V6 → V4 có trong Hình 3, và kết luận "S+D tốt nhất" phụ thuộc vào cạnh này (phát hiện khi tái lập E11).</w:t>
       </w:r>
     </w:p>
     <w:p>
@@ -3583,14 +3685,14 @@
           <w:i/>
           <w:sz w:val="22"/>
         </w:rPr>
-        <w:t>Các mục 2, 4, 5, 6, 7 được đánh dấu cần đối chiếu với toàn văn (xem docs/phieu_tai_lap_paper.md), vì khi lập phiếu chỉ truy cập được metadata và abstract chính thức.</w:t>
+        <w:t>Phiếu đã đối chiếu với toàn văn PDF Open Access (docs/phieu_tai_lap_paper.md); mục 5 và 7 là phát hiện trong quá trình tái lập E11.</w:t>
       </w:r>
     </w:p>
     <w:p>
       <w:pPr>
         <w:pStyle w:val="3"/>
       </w:pPr>
-      <w:bookmarkStart w:id="8" w:name="_Toc31800"/>
+      <w:bookmarkStart w:id="8" w:name="_Toc4836"/>
       <w:r>
         <w:t>2.2 Paper tham chiếu kỹ thuật: N-BaIoT (Meidan et al., 2018)</w:t>
       </w:r>
@@ -3963,7 +4065,7 @@
       <w:pPr>
         <w:pStyle w:val="3"/>
       </w:pPr>
-      <w:bookmarkStart w:id="9" w:name="_Toc11794"/>
+      <w:bookmarkStart w:id="9" w:name="_Toc9297"/>
       <w:r>
         <w:t>2.3 Kỹ thuật nền</w:t>
       </w:r>
@@ -4045,7 +4147,7 @@
       <w:pPr>
         <w:pStyle w:val="2"/>
       </w:pPr>
-      <w:bookmarkStart w:id="10" w:name="_Toc10532"/>
+      <w:bookmarkStart w:id="10" w:name="_Toc2753"/>
       <w:r>
         <w:t>Chương 3. Dữ liệu, EDA và threat model</w:t>
       </w:r>
@@ -4055,7 +4157,7 @@
       <w:pPr>
         <w:pStyle w:val="3"/>
       </w:pPr>
-      <w:bookmarkStart w:id="11" w:name="_Toc32318"/>
+      <w:bookmarkStart w:id="11" w:name="_Toc13051"/>
       <w:r>
         <w:t>3.1 Nguồn, giấy phép, phiên bản và tính toàn vẹn</w:t>
       </w:r>
@@ -4496,7 +4598,7 @@
       <w:pPr>
         <w:pStyle w:val="3"/>
       </w:pPr>
-      <w:bookmarkStart w:id="12" w:name="_Toc882"/>
+      <w:bookmarkStart w:id="12" w:name="_Toc25757"/>
       <w:r>
         <w:t>3.2 Chất lượng dữ liệu</w:t>
       </w:r>
@@ -5698,7 +5800,7 @@
       <w:pPr>
         <w:pStyle w:val="3"/>
       </w:pPr>
-      <w:bookmarkStart w:id="13" w:name="_Toc8189"/>
+      <w:bookmarkStart w:id="13" w:name="_Toc23031"/>
       <w:r>
         <w:t>3.3 EDA</w:t>
       </w:r>
@@ -5898,7 +6000,7 @@
       <w:pPr>
         <w:pStyle w:val="3"/>
       </w:pPr>
-      <w:bookmarkStart w:id="14" w:name="_Toc22742"/>
+      <w:bookmarkStart w:id="14" w:name="_Toc32669"/>
       <w:r>
         <w:t>3.4 Chống rò rỉ train–test</w:t>
       </w:r>
@@ -6055,7 +6157,7 @@
       <w:pPr>
         <w:pStyle w:val="3"/>
       </w:pPr>
-      <w:bookmarkStart w:id="15" w:name="_Toc2578"/>
+      <w:bookmarkStart w:id="15" w:name="_Toc20539"/>
       <w:r>
         <w:t>3.5 Threat model</w:t>
       </w:r>
@@ -6675,7 +6777,7 @@
       <w:pPr>
         <w:pStyle w:val="2"/>
       </w:pPr>
-      <w:bookmarkStart w:id="16" w:name="_Toc3446"/>
+      <w:bookmarkStart w:id="16" w:name="_Toc24989"/>
       <w:r>
         <w:t>Chương 4. Phương pháp và hệ thống</w:t>
       </w:r>
@@ -6685,7 +6787,7 @@
       <w:pPr>
         <w:pStyle w:val="3"/>
       </w:pPr>
-      <w:bookmarkStart w:id="17" w:name="_Toc32433"/>
+      <w:bookmarkStart w:id="17" w:name="_Toc3059"/>
       <w:r>
         <w:t>4.1 Pipeline</w:t>
       </w:r>
@@ -6800,7 +6902,7 @@
       <w:pPr>
         <w:pStyle w:val="3"/>
       </w:pPr>
-      <w:bookmarkStart w:id="18" w:name="_Toc14011"/>
+      <w:bookmarkStart w:id="18" w:name="_Toc30960"/>
       <w:r>
         <w:t>4.2 Baseline và biến thể</w:t>
       </w:r>
@@ -7462,7 +7564,7 @@
       <w:pPr>
         <w:pStyle w:val="3"/>
       </w:pPr>
-      <w:bookmarkStart w:id="19" w:name="_Toc12698"/>
+      <w:bookmarkStart w:id="19" w:name="_Toc6060"/>
       <w:r>
         <w:t>4.3 Edge benchmark</w:t>
       </w:r>
@@ -7550,7 +7652,7 @@
       <w:pPr>
         <w:pStyle w:val="3"/>
       </w:pPr>
-      <w:bookmarkStart w:id="20" w:name="_Toc17784"/>
+      <w:bookmarkStart w:id="20" w:name="_Toc19790"/>
       <w:r>
         <w:t>4.4 Mô phỏng MTD (Track B)</w:t>
       </w:r>
@@ -7596,7 +7698,7 @@
       <w:pPr>
         <w:pStyle w:val="3"/>
       </w:pPr>
-      <w:bookmarkStart w:id="21" w:name="_Toc29727"/>
+      <w:bookmarkStart w:id="21" w:name="_Toc28188"/>
       <w:r>
         <w:t>4.5 Kiến trúc hệ thống demo: AI / BE / DB / FE</w:t>
       </w:r>
@@ -7790,7 +7892,7 @@
       <w:pPr>
         <w:pStyle w:val="2"/>
       </w:pPr>
-      <w:bookmarkStart w:id="22" w:name="_Toc598"/>
+      <w:bookmarkStart w:id="22" w:name="_Toc8453"/>
       <w:r>
         <w:t>Chương 5. Thiết lập thực nghiệm</w:t>
       </w:r>
@@ -8035,6 +8137,12 @@
             <w:insideH w:val="single" w:color="auto" w:sz="4" w:space="0"/>
             <w:insideV w:val="single" w:color="auto" w:sz="4" w:space="0"/>
           </w:tblBorders>
+          <w:tblCellMar>
+            <w:top w:w="0" w:type="dxa"/>
+            <w:left w:w="108" w:type="dxa"/>
+            <w:bottom w:w="0" w:type="dxa"/>
+            <w:right w:w="108" w:type="dxa"/>
+          </w:tblCellMar>
         </w:tblPrEx>
         <w:trPr>
           <w:jc w:val="center"/>
@@ -9077,7 +9185,7 @@
       <w:pPr>
         <w:pStyle w:val="2"/>
       </w:pPr>
-      <w:bookmarkStart w:id="23" w:name="_Toc15965"/>
+      <w:bookmarkStart w:id="23" w:name="_Toc30973"/>
       <w:r>
         <w:t>Chương 6. Kết quả</w:t>
       </w:r>
@@ -9113,7 +9221,7 @@
       <w:pPr>
         <w:pStyle w:val="3"/>
       </w:pPr>
-      <w:bookmarkStart w:id="24" w:name="_Toc30386"/>
+      <w:bookmarkStart w:id="24" w:name="_Toc19691"/>
       <w:r>
         <w:t>6.1 Tổng quan các cấu hình</w:t>
       </w:r>
@@ -11054,7 +11162,7 @@
       <w:pPr>
         <w:pStyle w:val="3"/>
       </w:pPr>
-      <w:bookmarkStart w:id="25" w:name="_Toc26411"/>
+      <w:bookmarkStart w:id="25" w:name="_Toc29642"/>
       <w:r>
         <w:t>6.2 RQ1 – Tái lập baseline Meidan (B0)</w:t>
       </w:r>
@@ -12634,7 +12742,7 @@
       <w:pPr>
         <w:pStyle w:val="3"/>
       </w:pPr>
-      <w:bookmarkStart w:id="26" w:name="_Toc27976"/>
+      <w:bookmarkStart w:id="26" w:name="_Toc13476"/>
       <w:r>
         <w:t>6.3 RQ2 – Per-device so với model chung</w:t>
       </w:r>
@@ -12750,7 +12858,7 @@
       <w:pPr>
         <w:pStyle w:val="3"/>
       </w:pPr>
-      <w:bookmarkStart w:id="27" w:name="_Toc10379"/>
+      <w:bookmarkStart w:id="27" w:name="_Toc14691"/>
       <w:r>
         <w:t>6.4 RQ3 – Model nhẹ</w:t>
       </w:r>
@@ -13536,7 +13644,7 @@
       <w:pPr>
         <w:pStyle w:val="3"/>
       </w:pPr>
-      <w:bookmarkStart w:id="28" w:name="_Toc20835"/>
+      <w:bookmarkStart w:id="28" w:name="_Toc24109"/>
       <w:r>
         <w:t>6.5 RQ4 – Lượng tử hóa và hiệu chỉnh ngưỡng</w:t>
       </w:r>
@@ -13595,12 +13703,6 @@
             <w:insideH w:val="single" w:color="auto" w:sz="4" w:space="0"/>
             <w:insideV w:val="single" w:color="auto" w:sz="4" w:space="0"/>
           </w:tblBorders>
-          <w:tblCellMar>
-            <w:top w:w="0" w:type="dxa"/>
-            <w:left w:w="108" w:type="dxa"/>
-            <w:bottom w:w="0" w:type="dxa"/>
-            <w:right w:w="108" w:type="dxa"/>
-          </w:tblCellMar>
         </w:tblPrEx>
         <w:trPr>
           <w:jc w:val="center"/>
@@ -16073,7 +16175,7 @@
       <w:pPr>
         <w:pStyle w:val="3"/>
       </w:pPr>
-      <w:bookmarkStart w:id="29" w:name="_Toc15524"/>
+      <w:bookmarkStart w:id="29" w:name="_Toc31720"/>
       <w:r>
         <w:t>6.6 RQ5 – Edge benchmark</w:t>
       </w:r>
@@ -18292,7 +18394,7 @@
       <w:pPr>
         <w:pStyle w:val="3"/>
       </w:pPr>
-      <w:bookmarkStart w:id="30" w:name="_Toc10352"/>
+      <w:bookmarkStart w:id="30" w:name="_Toc20187"/>
       <w:r>
         <w:t>6.7 RQ6 – Mô phỏng MTD</w:t>
       </w:r>
@@ -21179,14 +21281,45 @@
       </w:r>
     </w:p>
     <w:p>
+      <w:r>
+        <w:br w:type="page"/>
+      </w:r>
+    </w:p>
+    <w:p>
       <w:pPr>
         <w:pStyle w:val="3"/>
       </w:pPr>
-      <w:bookmarkStart w:id="31" w:name="_Toc32656"/>
-      <w:r>
-        <w:t>6.8 Bảng đối chiếu tiêu chí đã chốt trước</w:t>
+      <w:bookmarkStart w:id="31" w:name="_Toc8263"/>
+      <w:r>
+        <w:t>6.8 E11 – Tái lập 3-layer THARM bằng đúng số liệu của paper chính</w:t>
       </w:r>
       <w:bookmarkEnd w:id="31"/>
+    </w:p>
+    <w:p>
+      <w:pPr>
+        <w:jc w:val="both"/>
+      </w:pPr>
+      <w:r>
+        <w:rPr>
+          <w:b w:val="0"/>
+          <w:i w:val="0"/>
+        </w:rPr>
+        <w:t xml:space="preserve">Sau khi có toàn văn, mô hình 3-layer THARM được dựng lại bằng </w:t>
+      </w:r>
+      <w:r>
+        <w:rPr>
+          <w:b/>
+          <w:i w:val="0"/>
+        </w:rPr>
+        <w:t>dữ liệu của chính paper</w:t>
+      </w:r>
+      <w:r>
+        <w:rPr>
+          <w:b w:val="0"/>
+          <w:i w:val="0"/>
+        </w:rPr>
+        <w:t>: 18 CVE hệ điều hành (Bảng 1) và 14 CVE dịch vụ (Bảng 2) với exploitability E, impact I, cost; gán OS cho 8 VM theo Hình 1, dịch vụ theo Hình 3, đồ thị tấn công theo Definition 2; shuffle (V5 di trú host 2 → host 4), diversity (đổi OS dự phòng) và redundancy (nhân bản V5) theo mục 4.2–4.4 (ai/src/nbaiot/mtd/tharm.py, 12 test so khớp số của paper).</w:t>
+      </w:r>
     </w:p>
     <w:p>
       <w:pPr>
@@ -21197,7 +21330,1633 @@
           <w:i/>
           <w:sz w:val="22"/>
         </w:rPr>
-        <w:t>Bảng 17. Kết quả so với tiêu chí thành công (docs/tieu_chi_thanh_cong.md)</w:t>
+        <w:t>Bảng 17. Rủi ro mức VM và mức đường tấn công so với số paper công bố</w:t>
+      </w:r>
+    </w:p>
+    <w:tbl>
+      <w:tblPr>
+        <w:tblStyle w:val="35"/>
+        <w:tblW w:w="0" w:type="auto"/>
+        <w:jc w:val="center"/>
+        <w:tblBorders>
+          <w:top w:val="single" w:color="auto" w:sz="4" w:space="0"/>
+          <w:left w:val="single" w:color="auto" w:sz="4" w:space="0"/>
+          <w:bottom w:val="single" w:color="auto" w:sz="4" w:space="0"/>
+          <w:right w:val="single" w:color="auto" w:sz="4" w:space="0"/>
+          <w:insideH w:val="single" w:color="auto" w:sz="4" w:space="0"/>
+          <w:insideV w:val="single" w:color="auto" w:sz="4" w:space="0"/>
+        </w:tblBorders>
+        <w:tblLayout w:type="autofit"/>
+        <w:tblCellMar>
+          <w:top w:w="0" w:type="dxa"/>
+          <w:left w:w="108" w:type="dxa"/>
+          <w:bottom w:w="0" w:type="dxa"/>
+          <w:right w:w="108" w:type="dxa"/>
+        </w:tblCellMar>
+      </w:tblPr>
+      <w:tblGrid>
+        <w:gridCol w:w="4252"/>
+        <w:gridCol w:w="1701"/>
+        <w:gridCol w:w="3118"/>
+      </w:tblGrid>
+      <w:tr>
+        <w:tblPrEx>
+          <w:tblBorders>
+            <w:top w:val="single" w:color="auto" w:sz="4" w:space="0"/>
+            <w:left w:val="single" w:color="auto" w:sz="4" w:space="0"/>
+            <w:bottom w:val="single" w:color="auto" w:sz="4" w:space="0"/>
+            <w:right w:val="single" w:color="auto" w:sz="4" w:space="0"/>
+            <w:insideH w:val="single" w:color="auto" w:sz="4" w:space="0"/>
+            <w:insideV w:val="single" w:color="auto" w:sz="4" w:space="0"/>
+          </w:tblBorders>
+          <w:tblCellMar>
+            <w:top w:w="0" w:type="dxa"/>
+            <w:left w:w="108" w:type="dxa"/>
+            <w:bottom w:w="0" w:type="dxa"/>
+            <w:right w:w="108" w:type="dxa"/>
+          </w:tblCellMar>
+        </w:tblPrEx>
+        <w:trPr>
+          <w:jc w:val="center"/>
+        </w:trPr>
+        <w:tc>
+          <w:tcPr>
+            <w:tcW w:w="4252" w:type="dxa"/>
+            <w:shd w:val="clear" w:color="auto" w:fill="D9E2F3"/>
+          </w:tcPr>
+          <w:p>
+            <w:r>
+              <w:rPr>
+                <w:b/>
+                <w:sz w:val="18"/>
+              </w:rPr>
+              <w:t>Rủi ro (VM / đường tấn công)</w:t>
+            </w:r>
+          </w:p>
+        </w:tc>
+        <w:tc>
+          <w:tcPr>
+            <w:tcW w:w="1701" w:type="dxa"/>
+            <w:shd w:val="clear" w:color="auto" w:fill="D9E2F3"/>
+          </w:tcPr>
+          <w:p>
+            <w:r>
+              <w:rPr>
+                <w:b/>
+                <w:sz w:val="18"/>
+              </w:rPr>
+              <w:t>Paper</w:t>
+            </w:r>
+          </w:p>
+        </w:tc>
+        <w:tc>
+          <w:tcPr>
+            <w:tcW w:w="3118" w:type="dxa"/>
+            <w:shd w:val="clear" w:color="auto" w:fill="D9E2F3"/>
+          </w:tcPr>
+          <w:p>
+            <w:r>
+              <w:rPr>
+                <w:b/>
+                <w:sz w:val="18"/>
+              </w:rPr>
+              <w:t>Tái lập</w:t>
+            </w:r>
+          </w:p>
+        </w:tc>
+      </w:tr>
+      <w:tr>
+        <w:tblPrEx>
+          <w:tblBorders>
+            <w:top w:val="single" w:color="auto" w:sz="4" w:space="0"/>
+            <w:left w:val="single" w:color="auto" w:sz="4" w:space="0"/>
+            <w:bottom w:val="single" w:color="auto" w:sz="4" w:space="0"/>
+            <w:right w:val="single" w:color="auto" w:sz="4" w:space="0"/>
+            <w:insideH w:val="single" w:color="auto" w:sz="4" w:space="0"/>
+            <w:insideV w:val="single" w:color="auto" w:sz="4" w:space="0"/>
+          </w:tblBorders>
+          <w:tblCellMar>
+            <w:top w:w="0" w:type="dxa"/>
+            <w:left w:w="108" w:type="dxa"/>
+            <w:bottom w:w="0" w:type="dxa"/>
+            <w:right w:w="108" w:type="dxa"/>
+          </w:tblCellMar>
+        </w:tblPrEx>
+        <w:trPr>
+          <w:jc w:val="center"/>
+        </w:trPr>
+        <w:tc>
+          <w:tcPr>
+            <w:tcW w:w="4252" w:type="dxa"/>
+          </w:tcPr>
+          <w:p>
+            <w:r>
+              <w:rPr>
+                <w:sz w:val="18"/>
+              </w:rPr>
+              <w:t>V2</w:t>
+            </w:r>
+          </w:p>
+        </w:tc>
+        <w:tc>
+          <w:tcPr>
+            <w:tcW w:w="1701" w:type="dxa"/>
+          </w:tcPr>
+          <w:p>
+            <w:r>
+              <w:rPr>
+                <w:sz w:val="18"/>
+              </w:rPr>
+              <w:t>16.28</w:t>
+            </w:r>
+          </w:p>
+        </w:tc>
+        <w:tc>
+          <w:tcPr>
+            <w:tcW w:w="3118" w:type="dxa"/>
+          </w:tcPr>
+          <w:p>
+            <w:r>
+              <w:rPr>
+                <w:sz w:val="18"/>
+              </w:rPr>
+              <w:t>15.941</w:t>
+            </w:r>
+          </w:p>
+        </w:tc>
+      </w:tr>
+      <w:tr>
+        <w:tblPrEx>
+          <w:tblBorders>
+            <w:top w:val="single" w:color="auto" w:sz="4" w:space="0"/>
+            <w:left w:val="single" w:color="auto" w:sz="4" w:space="0"/>
+            <w:bottom w:val="single" w:color="auto" w:sz="4" w:space="0"/>
+            <w:right w:val="single" w:color="auto" w:sz="4" w:space="0"/>
+            <w:insideH w:val="single" w:color="auto" w:sz="4" w:space="0"/>
+            <w:insideV w:val="single" w:color="auto" w:sz="4" w:space="0"/>
+          </w:tblBorders>
+          <w:tblCellMar>
+            <w:top w:w="0" w:type="dxa"/>
+            <w:left w:w="108" w:type="dxa"/>
+            <w:bottom w:w="0" w:type="dxa"/>
+            <w:right w:w="108" w:type="dxa"/>
+          </w:tblCellMar>
+        </w:tblPrEx>
+        <w:trPr>
+          <w:jc w:val="center"/>
+        </w:trPr>
+        <w:tc>
+          <w:tcPr>
+            <w:tcW w:w="4252" w:type="dxa"/>
+          </w:tcPr>
+          <w:p>
+            <w:r>
+              <w:rPr>
+                <w:sz w:val="18"/>
+              </w:rPr>
+              <w:t>V4</w:t>
+            </w:r>
+          </w:p>
+        </w:tc>
+        <w:tc>
+          <w:tcPr>
+            <w:tcW w:w="1701" w:type="dxa"/>
+          </w:tcPr>
+          <w:p>
+            <w:r>
+              <w:rPr>
+                <w:sz w:val="18"/>
+              </w:rPr>
+              <w:t>12.47</w:t>
+            </w:r>
+          </w:p>
+        </w:tc>
+        <w:tc>
+          <w:tcPr>
+            <w:tcW w:w="3118" w:type="dxa"/>
+          </w:tcPr>
+          <w:p>
+            <w:r>
+              <w:rPr>
+                <w:sz w:val="18"/>
+              </w:rPr>
+              <w:t>12.473</w:t>
+            </w:r>
+          </w:p>
+        </w:tc>
+      </w:tr>
+      <w:tr>
+        <w:tblPrEx>
+          <w:tblBorders>
+            <w:top w:val="single" w:color="auto" w:sz="4" w:space="0"/>
+            <w:left w:val="single" w:color="auto" w:sz="4" w:space="0"/>
+            <w:bottom w:val="single" w:color="auto" w:sz="4" w:space="0"/>
+            <w:right w:val="single" w:color="auto" w:sz="4" w:space="0"/>
+            <w:insideH w:val="single" w:color="auto" w:sz="4" w:space="0"/>
+            <w:insideV w:val="single" w:color="auto" w:sz="4" w:space="0"/>
+          </w:tblBorders>
+          <w:tblCellMar>
+            <w:top w:w="0" w:type="dxa"/>
+            <w:left w:w="108" w:type="dxa"/>
+            <w:bottom w:w="0" w:type="dxa"/>
+            <w:right w:w="108" w:type="dxa"/>
+          </w:tblCellMar>
+        </w:tblPrEx>
+        <w:trPr>
+          <w:jc w:val="center"/>
+        </w:trPr>
+        <w:tc>
+          <w:tcPr>
+            <w:tcW w:w="4252" w:type="dxa"/>
+          </w:tcPr>
+          <w:p>
+            <w:r>
+              <w:rPr>
+                <w:sz w:val="18"/>
+              </w:rPr>
+              <w:t>V5</w:t>
+            </w:r>
+          </w:p>
+        </w:tc>
+        <w:tc>
+          <w:tcPr>
+            <w:tcW w:w="1701" w:type="dxa"/>
+          </w:tcPr>
+          <w:p>
+            <w:r>
+              <w:rPr>
+                <w:sz w:val="18"/>
+              </w:rPr>
+              <w:t>12.58</w:t>
+            </w:r>
+          </w:p>
+        </w:tc>
+        <w:tc>
+          <w:tcPr>
+            <w:tcW w:w="3118" w:type="dxa"/>
+          </w:tcPr>
+          <w:p>
+            <w:r>
+              <w:rPr>
+                <w:sz w:val="18"/>
+              </w:rPr>
+              <w:t>12.578</w:t>
+            </w:r>
+          </w:p>
+        </w:tc>
+      </w:tr>
+      <w:tr>
+        <w:tblPrEx>
+          <w:tblBorders>
+            <w:top w:val="single" w:color="auto" w:sz="4" w:space="0"/>
+            <w:left w:val="single" w:color="auto" w:sz="4" w:space="0"/>
+            <w:bottom w:val="single" w:color="auto" w:sz="4" w:space="0"/>
+            <w:right w:val="single" w:color="auto" w:sz="4" w:space="0"/>
+            <w:insideH w:val="single" w:color="auto" w:sz="4" w:space="0"/>
+            <w:insideV w:val="single" w:color="auto" w:sz="4" w:space="0"/>
+          </w:tblBorders>
+          <w:tblCellMar>
+            <w:top w:w="0" w:type="dxa"/>
+            <w:left w:w="108" w:type="dxa"/>
+            <w:bottom w:w="0" w:type="dxa"/>
+            <w:right w:w="108" w:type="dxa"/>
+          </w:tblCellMar>
+        </w:tblPrEx>
+        <w:trPr>
+          <w:jc w:val="center"/>
+        </w:trPr>
+        <w:tc>
+          <w:tcPr>
+            <w:tcW w:w="4252" w:type="dxa"/>
+          </w:tcPr>
+          <w:p>
+            <w:r>
+              <w:rPr>
+                <w:sz w:val="18"/>
+              </w:rPr>
+              <w:t>V7</w:t>
+            </w:r>
+          </w:p>
+        </w:tc>
+        <w:tc>
+          <w:tcPr>
+            <w:tcW w:w="1701" w:type="dxa"/>
+          </w:tcPr>
+          <w:p>
+            <w:r>
+              <w:rPr>
+                <w:sz w:val="18"/>
+              </w:rPr>
+              <w:t>8.67</w:t>
+            </w:r>
+          </w:p>
+        </w:tc>
+        <w:tc>
+          <w:tcPr>
+            <w:tcW w:w="3118" w:type="dxa"/>
+          </w:tcPr>
+          <w:p>
+            <w:r>
+              <w:rPr>
+                <w:sz w:val="18"/>
+              </w:rPr>
+              <w:t>8.667</w:t>
+            </w:r>
+          </w:p>
+        </w:tc>
+      </w:tr>
+      <w:tr>
+        <w:tblPrEx>
+          <w:tblBorders>
+            <w:top w:val="single" w:color="auto" w:sz="4" w:space="0"/>
+            <w:left w:val="single" w:color="auto" w:sz="4" w:space="0"/>
+            <w:bottom w:val="single" w:color="auto" w:sz="4" w:space="0"/>
+            <w:right w:val="single" w:color="auto" w:sz="4" w:space="0"/>
+            <w:insideH w:val="single" w:color="auto" w:sz="4" w:space="0"/>
+            <w:insideV w:val="single" w:color="auto" w:sz="4" w:space="0"/>
+          </w:tblBorders>
+          <w:tblCellMar>
+            <w:top w:w="0" w:type="dxa"/>
+            <w:left w:w="108" w:type="dxa"/>
+            <w:bottom w:w="0" w:type="dxa"/>
+            <w:right w:w="108" w:type="dxa"/>
+          </w:tblCellMar>
+        </w:tblPrEx>
+        <w:trPr>
+          <w:jc w:val="center"/>
+        </w:trPr>
+        <w:tc>
+          <w:tcPr>
+            <w:tcW w:w="4252" w:type="dxa"/>
+          </w:tcPr>
+          <w:p>
+            <w:r>
+              <w:rPr>
+                <w:sz w:val="18"/>
+              </w:rPr>
+              <w:t>V8</w:t>
+            </w:r>
+          </w:p>
+        </w:tc>
+        <w:tc>
+          <w:tcPr>
+            <w:tcW w:w="1701" w:type="dxa"/>
+          </w:tcPr>
+          <w:p>
+            <w:r>
+              <w:rPr>
+                <w:sz w:val="18"/>
+              </w:rPr>
+              <w:t>5.62</w:t>
+            </w:r>
+          </w:p>
+        </w:tc>
+        <w:tc>
+          <w:tcPr>
+            <w:tcW w:w="3118" w:type="dxa"/>
+          </w:tcPr>
+          <w:p>
+            <w:r>
+              <w:rPr>
+                <w:sz w:val="18"/>
+              </w:rPr>
+              <w:t>5.625</w:t>
+            </w:r>
+          </w:p>
+        </w:tc>
+      </w:tr>
+      <w:tr>
+        <w:tblPrEx>
+          <w:tblBorders>
+            <w:top w:val="single" w:color="auto" w:sz="4" w:space="0"/>
+            <w:left w:val="single" w:color="auto" w:sz="4" w:space="0"/>
+            <w:bottom w:val="single" w:color="auto" w:sz="4" w:space="0"/>
+            <w:right w:val="single" w:color="auto" w:sz="4" w:space="0"/>
+            <w:insideH w:val="single" w:color="auto" w:sz="4" w:space="0"/>
+            <w:insideV w:val="single" w:color="auto" w:sz="4" w:space="0"/>
+          </w:tblBorders>
+          <w:tblCellMar>
+            <w:top w:w="0" w:type="dxa"/>
+            <w:left w:w="108" w:type="dxa"/>
+            <w:bottom w:w="0" w:type="dxa"/>
+            <w:right w:w="108" w:type="dxa"/>
+          </w:tblCellMar>
+        </w:tblPrEx>
+        <w:trPr>
+          <w:jc w:val="center"/>
+        </w:trPr>
+        <w:tc>
+          <w:tcPr>
+            <w:tcW w:w="4252" w:type="dxa"/>
+          </w:tcPr>
+          <w:p>
+            <w:r>
+              <w:rPr>
+                <w:sz w:val="18"/>
+              </w:rPr>
+              <w:t>shuffle A-V2-V7-V5-V8</w:t>
+            </w:r>
+          </w:p>
+        </w:tc>
+        <w:tc>
+          <w:tcPr>
+            <w:tcW w:w="1701" w:type="dxa"/>
+          </w:tcPr>
+          <w:p>
+            <w:r>
+              <w:rPr>
+                <w:sz w:val="18"/>
+              </w:rPr>
+              <w:t>43.15</w:t>
+            </w:r>
+          </w:p>
+        </w:tc>
+        <w:tc>
+          <w:tcPr>
+            <w:tcW w:w="3118" w:type="dxa"/>
+          </w:tcPr>
+          <w:p>
+            <w:r>
+              <w:rPr>
+                <w:sz w:val="18"/>
+              </w:rPr>
+              <w:t>42.81 (-0.8%)</w:t>
+            </w:r>
+          </w:p>
+        </w:tc>
+      </w:tr>
+      <w:tr>
+        <w:tblPrEx>
+          <w:tblBorders>
+            <w:top w:val="single" w:color="auto" w:sz="4" w:space="0"/>
+            <w:left w:val="single" w:color="auto" w:sz="4" w:space="0"/>
+            <w:bottom w:val="single" w:color="auto" w:sz="4" w:space="0"/>
+            <w:right w:val="single" w:color="auto" w:sz="4" w:space="0"/>
+            <w:insideH w:val="single" w:color="auto" w:sz="4" w:space="0"/>
+            <w:insideV w:val="single" w:color="auto" w:sz="4" w:space="0"/>
+          </w:tblBorders>
+          <w:tblCellMar>
+            <w:top w:w="0" w:type="dxa"/>
+            <w:left w:w="108" w:type="dxa"/>
+            <w:bottom w:w="0" w:type="dxa"/>
+            <w:right w:w="108" w:type="dxa"/>
+          </w:tblCellMar>
+        </w:tblPrEx>
+        <w:trPr>
+          <w:jc w:val="center"/>
+        </w:trPr>
+        <w:tc>
+          <w:tcPr>
+            <w:tcW w:w="4252" w:type="dxa"/>
+          </w:tcPr>
+          <w:p>
+            <w:r>
+              <w:rPr>
+                <w:sz w:val="18"/>
+              </w:rPr>
+              <w:t>diversity A-V2-V4-V5(Linux)-V8</w:t>
+            </w:r>
+          </w:p>
+        </w:tc>
+        <w:tc>
+          <w:tcPr>
+            <w:tcW w:w="1701" w:type="dxa"/>
+          </w:tcPr>
+          <w:p>
+            <w:r>
+              <w:rPr>
+                <w:sz w:val="18"/>
+              </w:rPr>
+              <w:t>43.31</w:t>
+            </w:r>
+          </w:p>
+        </w:tc>
+        <w:tc>
+          <w:tcPr>
+            <w:tcW w:w="3118" w:type="dxa"/>
+          </w:tcPr>
+          <w:p>
+            <w:r>
+              <w:rPr>
+                <w:sz w:val="18"/>
+              </w:rPr>
+              <w:t>42.97 (-0.8%)</w:t>
+            </w:r>
+          </w:p>
+        </w:tc>
+      </w:tr>
+      <w:tr>
+        <w:tblPrEx>
+          <w:tblBorders>
+            <w:top w:val="single" w:color="auto" w:sz="4" w:space="0"/>
+            <w:left w:val="single" w:color="auto" w:sz="4" w:space="0"/>
+            <w:bottom w:val="single" w:color="auto" w:sz="4" w:space="0"/>
+            <w:right w:val="single" w:color="auto" w:sz="4" w:space="0"/>
+            <w:insideH w:val="single" w:color="auto" w:sz="4" w:space="0"/>
+            <w:insideV w:val="single" w:color="auto" w:sz="4" w:space="0"/>
+          </w:tblBorders>
+          <w:tblCellMar>
+            <w:top w:w="0" w:type="dxa"/>
+            <w:left w:w="108" w:type="dxa"/>
+            <w:bottom w:w="0" w:type="dxa"/>
+            <w:right w:w="108" w:type="dxa"/>
+          </w:tblCellMar>
+        </w:tblPrEx>
+        <w:trPr>
+          <w:jc w:val="center"/>
+        </w:trPr>
+        <w:tc>
+          <w:tcPr>
+            <w:tcW w:w="4252" w:type="dxa"/>
+          </w:tcPr>
+          <w:p>
+            <w:r>
+              <w:rPr>
+                <w:sz w:val="18"/>
+              </w:rPr>
+              <w:t>redundancy A-V2-V4-V5'-V8</w:t>
+            </w:r>
+          </w:p>
+        </w:tc>
+        <w:tc>
+          <w:tcPr>
+            <w:tcW w:w="1701" w:type="dxa"/>
+          </w:tcPr>
+          <w:p>
+            <w:r>
+              <w:rPr>
+                <w:sz w:val="18"/>
+              </w:rPr>
+              <w:t>43.31</w:t>
+            </w:r>
+          </w:p>
+        </w:tc>
+        <w:tc>
+          <w:tcPr>
+            <w:tcW w:w="3118" w:type="dxa"/>
+          </w:tcPr>
+          <w:p>
+            <w:r>
+              <w:rPr>
+                <w:sz w:val="18"/>
+              </w:rPr>
+              <w:t>42.97 (-0.8%)</w:t>
+            </w:r>
+          </w:p>
+        </w:tc>
+      </w:tr>
+    </w:tbl>
+    <w:p/>
+    <w:p>
+      <w:pPr>
+        <w:jc w:val="both"/>
+      </w:pPr>
+      <w:r>
+        <w:rPr>
+          <w:b w:val="0"/>
+          <w:i w:val="0"/>
+        </w:rPr>
+        <w:t xml:space="preserve">Rủi ro mức VM khớp tới ±0.01 khi diễn giải Eq. 2 là </w:t>
+      </w:r>
+      <w:r>
+        <w:rPr>
+          <w:b/>
+          <w:i w:val="0"/>
+        </w:rPr>
+        <w:t>tổng</w:t>
+      </w:r>
+      <w:r>
+        <w:rPr>
+          <w:b w:val="0"/>
+          <w:i w:val="0"/>
+        </w:rPr>
+        <w:t xml:space="preserve"> R = Σ E·I (bản in ghi tích); chỉ R_V2 lệch (paper 16.28, Bảng 1–2 cho 15.94) và chính sai khác này tạo ra mức lệch −0.8% ở cả ba đường tấn công ví dụ. Attack cost từng VM khớp Bảng 4 ở V1 (8.17) và V8 (6.27); ASP của Bảng 4 không tái lập được vì Eq. 1 bản in có thể âm và paper không công bố mã nguồn.</w:t>
+      </w:r>
+    </w:p>
+    <w:p>
+      <w:pPr>
+        <w:jc w:val="center"/>
+      </w:pPr>
+      <w:r>
+        <w:rPr>
+          <w:i/>
+          <w:sz w:val="22"/>
+        </w:rPr>
+        <w:t>Bảng 18. Tổng toàn mạng: không tái lập được số tuyệt đối</w:t>
+      </w:r>
+    </w:p>
+    <w:tbl>
+      <w:tblPr>
+        <w:tblStyle w:val="35"/>
+        <w:tblW w:w="0" w:type="auto"/>
+        <w:jc w:val="center"/>
+        <w:tblBorders>
+          <w:top w:val="single" w:color="auto" w:sz="4" w:space="0"/>
+          <w:left w:val="single" w:color="auto" w:sz="4" w:space="0"/>
+          <w:bottom w:val="single" w:color="auto" w:sz="4" w:space="0"/>
+          <w:right w:val="single" w:color="auto" w:sz="4" w:space="0"/>
+          <w:insideH w:val="single" w:color="auto" w:sz="4" w:space="0"/>
+          <w:insideV w:val="single" w:color="auto" w:sz="4" w:space="0"/>
+        </w:tblBorders>
+        <w:tblLayout w:type="autofit"/>
+        <w:tblCellMar>
+          <w:top w:w="0" w:type="dxa"/>
+          <w:left w:w="108" w:type="dxa"/>
+          <w:bottom w:w="0" w:type="dxa"/>
+          <w:right w:w="108" w:type="dxa"/>
+        </w:tblCellMar>
+      </w:tblPr>
+      <w:tblGrid>
+        <w:gridCol w:w="1814"/>
+        <w:gridCol w:w="1814"/>
+        <w:gridCol w:w="1814"/>
+        <w:gridCol w:w="1814"/>
+        <w:gridCol w:w="1814"/>
+      </w:tblGrid>
+      <w:tr>
+        <w:tblPrEx>
+          <w:tblBorders>
+            <w:top w:val="single" w:color="auto" w:sz="4" w:space="0"/>
+            <w:left w:val="single" w:color="auto" w:sz="4" w:space="0"/>
+            <w:bottom w:val="single" w:color="auto" w:sz="4" w:space="0"/>
+            <w:right w:val="single" w:color="auto" w:sz="4" w:space="0"/>
+            <w:insideH w:val="single" w:color="auto" w:sz="4" w:space="0"/>
+            <w:insideV w:val="single" w:color="auto" w:sz="4" w:space="0"/>
+          </w:tblBorders>
+          <w:tblCellMar>
+            <w:top w:w="0" w:type="dxa"/>
+            <w:left w:w="108" w:type="dxa"/>
+            <w:bottom w:w="0" w:type="dxa"/>
+            <w:right w:w="108" w:type="dxa"/>
+          </w:tblCellMar>
+        </w:tblPrEx>
+        <w:trPr>
+          <w:jc w:val="center"/>
+        </w:trPr>
+        <w:tc>
+          <w:tcPr>
+            <w:tcW w:w="1814" w:type="dxa"/>
+            <w:shd w:val="clear" w:color="auto" w:fill="D9E2F3"/>
+          </w:tcPr>
+          <w:p>
+            <w:r>
+              <w:rPr>
+                <w:b/>
+                <w:sz w:val="18"/>
+              </w:rPr>
+              <w:t>MTD trên V5</w:t>
+            </w:r>
+          </w:p>
+        </w:tc>
+        <w:tc>
+          <w:tcPr>
+            <w:tcW w:w="1814" w:type="dxa"/>
+            <w:shd w:val="clear" w:color="auto" w:fill="D9E2F3"/>
+          </w:tcPr>
+          <w:p>
+            <w:r>
+              <w:rPr>
+                <w:b/>
+                <w:sz w:val="18"/>
+              </w:rPr>
+              <w:t>R paper</w:t>
+            </w:r>
+          </w:p>
+        </w:tc>
+        <w:tc>
+          <w:tcPr>
+            <w:tcW w:w="1814" w:type="dxa"/>
+            <w:shd w:val="clear" w:color="auto" w:fill="D9E2F3"/>
+          </w:tcPr>
+          <w:p>
+            <w:r>
+              <w:rPr>
+                <w:b/>
+                <w:sz w:val="18"/>
+              </w:rPr>
+              <w:t>R tái lập</w:t>
+            </w:r>
+          </w:p>
+        </w:tc>
+        <w:tc>
+          <w:tcPr>
+            <w:tcW w:w="1814" w:type="dxa"/>
+            <w:shd w:val="clear" w:color="auto" w:fill="D9E2F3"/>
+          </w:tcPr>
+          <w:p>
+            <w:r>
+              <w:rPr>
+                <w:b/>
+                <w:sz w:val="18"/>
+              </w:rPr>
+              <w:t>AC paper</w:t>
+            </w:r>
+          </w:p>
+        </w:tc>
+        <w:tc>
+          <w:tcPr>
+            <w:tcW w:w="1814" w:type="dxa"/>
+            <w:shd w:val="clear" w:color="auto" w:fill="D9E2F3"/>
+          </w:tcPr>
+          <w:p>
+            <w:r>
+              <w:rPr>
+                <w:b/>
+                <w:sz w:val="18"/>
+              </w:rPr>
+              <w:t>AC tái lập</w:t>
+            </w:r>
+          </w:p>
+        </w:tc>
+      </w:tr>
+      <w:tr>
+        <w:tblPrEx>
+          <w:tblBorders>
+            <w:top w:val="single" w:color="auto" w:sz="4" w:space="0"/>
+            <w:left w:val="single" w:color="auto" w:sz="4" w:space="0"/>
+            <w:bottom w:val="single" w:color="auto" w:sz="4" w:space="0"/>
+            <w:right w:val="single" w:color="auto" w:sz="4" w:space="0"/>
+            <w:insideH w:val="single" w:color="auto" w:sz="4" w:space="0"/>
+            <w:insideV w:val="single" w:color="auto" w:sz="4" w:space="0"/>
+          </w:tblBorders>
+          <w:tblCellMar>
+            <w:top w:w="0" w:type="dxa"/>
+            <w:left w:w="108" w:type="dxa"/>
+            <w:bottom w:w="0" w:type="dxa"/>
+            <w:right w:w="108" w:type="dxa"/>
+          </w:tblCellMar>
+        </w:tblPrEx>
+        <w:trPr>
+          <w:jc w:val="center"/>
+        </w:trPr>
+        <w:tc>
+          <w:tcPr>
+            <w:tcW w:w="1814" w:type="dxa"/>
+          </w:tcPr>
+          <w:p>
+            <w:r>
+              <w:rPr>
+                <w:sz w:val="18"/>
+              </w:rPr>
+              <w:t>shuffle</w:t>
+            </w:r>
+          </w:p>
+        </w:tc>
+        <w:tc>
+          <w:tcPr>
+            <w:tcW w:w="1814" w:type="dxa"/>
+          </w:tcPr>
+          <w:p>
+            <w:r>
+              <w:rPr>
+                <w:sz w:val="18"/>
+              </w:rPr>
+              <w:t>167.38</w:t>
+            </w:r>
+          </w:p>
+        </w:tc>
+        <w:tc>
+          <w:tcPr>
+            <w:tcW w:w="1814" w:type="dxa"/>
+          </w:tcPr>
+          <w:p>
+            <w:r>
+              <w:rPr>
+                <w:sz w:val="18"/>
+              </w:rPr>
+              <w:t>173.63</w:t>
+            </w:r>
+          </w:p>
+        </w:tc>
+        <w:tc>
+          <w:tcPr>
+            <w:tcW w:w="1814" w:type="dxa"/>
+          </w:tcPr>
+          <w:p>
+            <w:r>
+              <w:rPr>
+                <w:sz w:val="18"/>
+              </w:rPr>
+              <w:t>666.2</w:t>
+            </w:r>
+          </w:p>
+        </w:tc>
+        <w:tc>
+          <w:tcPr>
+            <w:tcW w:w="1814" w:type="dxa"/>
+          </w:tcPr>
+          <w:p>
+            <w:r>
+              <w:rPr>
+                <w:sz w:val="18"/>
+              </w:rPr>
+              <w:t>113.9</w:t>
+            </w:r>
+          </w:p>
+        </w:tc>
+      </w:tr>
+      <w:tr>
+        <w:tblPrEx>
+          <w:tblBorders>
+            <w:top w:val="single" w:color="auto" w:sz="4" w:space="0"/>
+            <w:left w:val="single" w:color="auto" w:sz="4" w:space="0"/>
+            <w:bottom w:val="single" w:color="auto" w:sz="4" w:space="0"/>
+            <w:right w:val="single" w:color="auto" w:sz="4" w:space="0"/>
+            <w:insideH w:val="single" w:color="auto" w:sz="4" w:space="0"/>
+            <w:insideV w:val="single" w:color="auto" w:sz="4" w:space="0"/>
+          </w:tblBorders>
+          <w:tblCellMar>
+            <w:top w:w="0" w:type="dxa"/>
+            <w:left w:w="108" w:type="dxa"/>
+            <w:bottom w:w="0" w:type="dxa"/>
+            <w:right w:w="108" w:type="dxa"/>
+          </w:tblCellMar>
+        </w:tblPrEx>
+        <w:trPr>
+          <w:jc w:val="center"/>
+        </w:trPr>
+        <w:tc>
+          <w:tcPr>
+            <w:tcW w:w="1814" w:type="dxa"/>
+          </w:tcPr>
+          <w:p>
+            <w:r>
+              <w:rPr>
+                <w:sz w:val="18"/>
+              </w:rPr>
+              <w:t>diversity</w:t>
+            </w:r>
+          </w:p>
+        </w:tc>
+        <w:tc>
+          <w:tcPr>
+            <w:tcW w:w="1814" w:type="dxa"/>
+          </w:tcPr>
+          <w:p>
+            <w:r>
+              <w:rPr>
+                <w:sz w:val="18"/>
+              </w:rPr>
+              <w:t>163.73</w:t>
+            </w:r>
+          </w:p>
+        </w:tc>
+        <w:tc>
+          <w:tcPr>
+            <w:tcW w:w="1814" w:type="dxa"/>
+          </w:tcPr>
+          <w:p>
+            <w:r>
+              <w:rPr>
+                <w:sz w:val="18"/>
+              </w:rPr>
+              <w:t>142.26</w:t>
+            </w:r>
+          </w:p>
+        </w:tc>
+        <w:tc>
+          <w:tcPr>
+            <w:tcW w:w="1814" w:type="dxa"/>
+          </w:tcPr>
+          <w:p>
+            <w:r>
+              <w:rPr>
+                <w:sz w:val="18"/>
+              </w:rPr>
+              <w:t>624.7</w:t>
+            </w:r>
+          </w:p>
+        </w:tc>
+        <w:tc>
+          <w:tcPr>
+            <w:tcW w:w="1814" w:type="dxa"/>
+          </w:tcPr>
+          <w:p>
+            <w:r>
+              <w:rPr>
+                <w:sz w:val="18"/>
+              </w:rPr>
+              <w:t>102.0</w:t>
+            </w:r>
+          </w:p>
+        </w:tc>
+      </w:tr>
+      <w:tr>
+        <w:tblPrEx>
+          <w:tblBorders>
+            <w:top w:val="single" w:color="auto" w:sz="4" w:space="0"/>
+            <w:left w:val="single" w:color="auto" w:sz="4" w:space="0"/>
+            <w:bottom w:val="single" w:color="auto" w:sz="4" w:space="0"/>
+            <w:right w:val="single" w:color="auto" w:sz="4" w:space="0"/>
+            <w:insideH w:val="single" w:color="auto" w:sz="4" w:space="0"/>
+            <w:insideV w:val="single" w:color="auto" w:sz="4" w:space="0"/>
+          </w:tblBorders>
+          <w:tblCellMar>
+            <w:top w:w="0" w:type="dxa"/>
+            <w:left w:w="108" w:type="dxa"/>
+            <w:bottom w:w="0" w:type="dxa"/>
+            <w:right w:w="108" w:type="dxa"/>
+          </w:tblCellMar>
+        </w:tblPrEx>
+        <w:trPr>
+          <w:jc w:val="center"/>
+        </w:trPr>
+        <w:tc>
+          <w:tcPr>
+            <w:tcW w:w="1814" w:type="dxa"/>
+          </w:tcPr>
+          <w:p>
+            <w:r>
+              <w:rPr>
+                <w:sz w:val="18"/>
+              </w:rPr>
+              <w:t>redundancy</w:t>
+            </w:r>
+          </w:p>
+        </w:tc>
+        <w:tc>
+          <w:tcPr>
+            <w:tcW w:w="1814" w:type="dxa"/>
+          </w:tcPr>
+          <w:p>
+            <w:r>
+              <w:rPr>
+                <w:sz w:val="18"/>
+              </w:rPr>
+              <w:t>260.84</w:t>
+            </w:r>
+          </w:p>
+        </w:tc>
+        <w:tc>
+          <w:tcPr>
+            <w:tcW w:w="1814" w:type="dxa"/>
+          </w:tcPr>
+          <w:p>
+            <w:r>
+              <w:rPr>
+                <w:sz w:val="18"/>
+              </w:rPr>
+              <w:t>217.58</w:t>
+            </w:r>
+          </w:p>
+        </w:tc>
+        <w:tc>
+          <w:tcPr>
+            <w:tcW w:w="1814" w:type="dxa"/>
+          </w:tcPr>
+          <w:p>
+            <w:r>
+              <w:rPr>
+                <w:sz w:val="18"/>
+              </w:rPr>
+              <w:t>878.3</w:t>
+            </w:r>
+          </w:p>
+        </w:tc>
+        <w:tc>
+          <w:tcPr>
+            <w:tcW w:w="1814" w:type="dxa"/>
+          </w:tcPr>
+          <w:p>
+            <w:r>
+              <w:rPr>
+                <w:sz w:val="18"/>
+              </w:rPr>
+              <w:t>151.0</w:t>
+            </w:r>
+          </w:p>
+        </w:tc>
+      </w:tr>
+    </w:tbl>
+    <w:p/>
+    <w:p>
+      <w:pPr>
+        <w:jc w:val="center"/>
+      </w:pPr>
+      <w:r>
+        <w:rPr>
+          <w:i/>
+          <w:sz w:val="22"/>
+        </w:rPr>
+        <w:t>Bảng 19. Xu hướng định tính của paper trên hai topology</w:t>
+      </w:r>
+    </w:p>
+    <w:tbl>
+      <w:tblPr>
+        <w:tblStyle w:val="35"/>
+        <w:tblW w:w="0" w:type="auto"/>
+        <w:jc w:val="center"/>
+        <w:tblBorders>
+          <w:top w:val="single" w:color="auto" w:sz="4" w:space="0"/>
+          <w:left w:val="single" w:color="auto" w:sz="4" w:space="0"/>
+          <w:bottom w:val="single" w:color="auto" w:sz="4" w:space="0"/>
+          <w:right w:val="single" w:color="auto" w:sz="4" w:space="0"/>
+          <w:insideH w:val="single" w:color="auto" w:sz="4" w:space="0"/>
+          <w:insideV w:val="single" w:color="auto" w:sz="4" w:space="0"/>
+        </w:tblBorders>
+        <w:tblLayout w:type="autofit"/>
+        <w:tblCellMar>
+          <w:top w:w="0" w:type="dxa"/>
+          <w:left w:w="108" w:type="dxa"/>
+          <w:bottom w:w="0" w:type="dxa"/>
+          <w:right w:w="108" w:type="dxa"/>
+        </w:tblCellMar>
+      </w:tblPr>
+      <w:tblGrid>
+        <w:gridCol w:w="5386"/>
+        <w:gridCol w:w="1814"/>
+        <w:gridCol w:w="1871"/>
+      </w:tblGrid>
+      <w:tr>
+        <w:tblPrEx>
+          <w:tblBorders>
+            <w:top w:val="single" w:color="auto" w:sz="4" w:space="0"/>
+            <w:left w:val="single" w:color="auto" w:sz="4" w:space="0"/>
+            <w:bottom w:val="single" w:color="auto" w:sz="4" w:space="0"/>
+            <w:right w:val="single" w:color="auto" w:sz="4" w:space="0"/>
+            <w:insideH w:val="single" w:color="auto" w:sz="4" w:space="0"/>
+            <w:insideV w:val="single" w:color="auto" w:sz="4" w:space="0"/>
+          </w:tblBorders>
+          <w:tblCellMar>
+            <w:top w:w="0" w:type="dxa"/>
+            <w:left w:w="108" w:type="dxa"/>
+            <w:bottom w:w="0" w:type="dxa"/>
+            <w:right w:w="108" w:type="dxa"/>
+          </w:tblCellMar>
+        </w:tblPrEx>
+        <w:trPr>
+          <w:jc w:val="center"/>
+        </w:trPr>
+        <w:tc>
+          <w:tcPr>
+            <w:tcW w:w="5386" w:type="dxa"/>
+            <w:shd w:val="clear" w:color="auto" w:fill="D9E2F3"/>
+          </w:tcPr>
+          <w:p>
+            <w:r>
+              <w:rPr>
+                <w:b/>
+                <w:sz w:val="18"/>
+              </w:rPr>
+              <w:t>Kết luận của paper</w:t>
+            </w:r>
+          </w:p>
+        </w:tc>
+        <w:tc>
+          <w:tcPr>
+            <w:tcW w:w="1814" w:type="dxa"/>
+            <w:shd w:val="clear" w:color="auto" w:fill="D9E2F3"/>
+          </w:tcPr>
+          <w:p>
+            <w:r>
+              <w:rPr>
+                <w:b/>
+                <w:sz w:val="18"/>
+              </w:rPr>
+              <w:t>Definition 2</w:t>
+            </w:r>
+          </w:p>
+        </w:tc>
+        <w:tc>
+          <w:tcPr>
+            <w:tcW w:w="1871" w:type="dxa"/>
+            <w:shd w:val="clear" w:color="auto" w:fill="D9E2F3"/>
+          </w:tcPr>
+          <w:p>
+            <w:r>
+              <w:rPr>
+                <w:b/>
+                <w:sz w:val="18"/>
+              </w:rPr>
+              <w:t>Hình 3 (+V6→V4)</w:t>
+            </w:r>
+          </w:p>
+        </w:tc>
+      </w:tr>
+      <w:tr>
+        <w:tblPrEx>
+          <w:tblBorders>
+            <w:top w:val="single" w:color="auto" w:sz="4" w:space="0"/>
+            <w:left w:val="single" w:color="auto" w:sz="4" w:space="0"/>
+            <w:bottom w:val="single" w:color="auto" w:sz="4" w:space="0"/>
+            <w:right w:val="single" w:color="auto" w:sz="4" w:space="0"/>
+            <w:insideH w:val="single" w:color="auto" w:sz="4" w:space="0"/>
+            <w:insideV w:val="single" w:color="auto" w:sz="4" w:space="0"/>
+          </w:tblBorders>
+          <w:tblCellMar>
+            <w:top w:w="0" w:type="dxa"/>
+            <w:left w:w="108" w:type="dxa"/>
+            <w:bottom w:w="0" w:type="dxa"/>
+            <w:right w:w="108" w:type="dxa"/>
+          </w:tblCellMar>
+        </w:tblPrEx>
+        <w:trPr>
+          <w:jc w:val="center"/>
+        </w:trPr>
+        <w:tc>
+          <w:tcPr>
+            <w:tcW w:w="5386" w:type="dxa"/>
+          </w:tcPr>
+          <w:p>
+            <w:r>
+              <w:rPr>
+                <w:sz w:val="18"/>
+              </w:rPr>
+              <w:t>Shuffle làm giảm rủi ro mạng so với không MTD</w:t>
+            </w:r>
+          </w:p>
+        </w:tc>
+        <w:tc>
+          <w:tcPr>
+            <w:tcW w:w="1814" w:type="dxa"/>
+          </w:tcPr>
+          <w:p>
+            <w:r>
+              <w:rPr>
+                <w:sz w:val="18"/>
+              </w:rPr>
+              <w:t>Không</w:t>
+            </w:r>
+          </w:p>
+        </w:tc>
+        <w:tc>
+          <w:tcPr>
+            <w:tcW w:w="1871" w:type="dxa"/>
+          </w:tcPr>
+          <w:p>
+            <w:r>
+              <w:rPr>
+                <w:sz w:val="18"/>
+              </w:rPr>
+              <w:t>Tái lập</w:t>
+            </w:r>
+          </w:p>
+        </w:tc>
+      </w:tr>
+      <w:tr>
+        <w:tblPrEx>
+          <w:tblBorders>
+            <w:top w:val="single" w:color="auto" w:sz="4" w:space="0"/>
+            <w:left w:val="single" w:color="auto" w:sz="4" w:space="0"/>
+            <w:bottom w:val="single" w:color="auto" w:sz="4" w:space="0"/>
+            <w:right w:val="single" w:color="auto" w:sz="4" w:space="0"/>
+            <w:insideH w:val="single" w:color="auto" w:sz="4" w:space="0"/>
+            <w:insideV w:val="single" w:color="auto" w:sz="4" w:space="0"/>
+          </w:tblBorders>
+          <w:tblCellMar>
+            <w:top w:w="0" w:type="dxa"/>
+            <w:left w:w="108" w:type="dxa"/>
+            <w:bottom w:w="0" w:type="dxa"/>
+            <w:right w:w="108" w:type="dxa"/>
+          </w:tblCellMar>
+        </w:tblPrEx>
+        <w:trPr>
+          <w:jc w:val="center"/>
+        </w:trPr>
+        <w:tc>
+          <w:tcPr>
+            <w:tcW w:w="5386" w:type="dxa"/>
+          </w:tcPr>
+          <w:p>
+            <w:r>
+              <w:rPr>
+                <w:sz w:val="18"/>
+              </w:rPr>
+              <w:t>Diversity làm giảm rủi ro mạng so với không MTD</w:t>
+            </w:r>
+          </w:p>
+        </w:tc>
+        <w:tc>
+          <w:tcPr>
+            <w:tcW w:w="1814" w:type="dxa"/>
+          </w:tcPr>
+          <w:p>
+            <w:r>
+              <w:rPr>
+                <w:sz w:val="18"/>
+              </w:rPr>
+              <w:t>Tái lập</w:t>
+            </w:r>
+          </w:p>
+        </w:tc>
+        <w:tc>
+          <w:tcPr>
+            <w:tcW w:w="1871" w:type="dxa"/>
+          </w:tcPr>
+          <w:p>
+            <w:r>
+              <w:rPr>
+                <w:sz w:val="18"/>
+              </w:rPr>
+              <w:t>Tái lập</w:t>
+            </w:r>
+          </w:p>
+        </w:tc>
+      </w:tr>
+      <w:tr>
+        <w:tblPrEx>
+          <w:tblBorders>
+            <w:top w:val="single" w:color="auto" w:sz="4" w:space="0"/>
+            <w:left w:val="single" w:color="auto" w:sz="4" w:space="0"/>
+            <w:bottom w:val="single" w:color="auto" w:sz="4" w:space="0"/>
+            <w:right w:val="single" w:color="auto" w:sz="4" w:space="0"/>
+            <w:insideH w:val="single" w:color="auto" w:sz="4" w:space="0"/>
+            <w:insideV w:val="single" w:color="auto" w:sz="4" w:space="0"/>
+          </w:tblBorders>
+          <w:tblCellMar>
+            <w:top w:w="0" w:type="dxa"/>
+            <w:left w:w="108" w:type="dxa"/>
+            <w:bottom w:w="0" w:type="dxa"/>
+            <w:right w:w="108" w:type="dxa"/>
+          </w:tblCellMar>
+        </w:tblPrEx>
+        <w:trPr>
+          <w:jc w:val="center"/>
+        </w:trPr>
+        <w:tc>
+          <w:tcPr>
+            <w:tcW w:w="5386" w:type="dxa"/>
+          </w:tcPr>
+          <w:p>
+            <w:r>
+              <w:rPr>
+                <w:sz w:val="18"/>
+              </w:rPr>
+              <w:t>Redundancy làm tăng rủi ro (thêm VM, thêm lỗ hổng)</w:t>
+            </w:r>
+          </w:p>
+        </w:tc>
+        <w:tc>
+          <w:tcPr>
+            <w:tcW w:w="1814" w:type="dxa"/>
+          </w:tcPr>
+          <w:p>
+            <w:r>
+              <w:rPr>
+                <w:sz w:val="18"/>
+              </w:rPr>
+              <w:t>Tái lập</w:t>
+            </w:r>
+          </w:p>
+        </w:tc>
+        <w:tc>
+          <w:tcPr>
+            <w:tcW w:w="1871" w:type="dxa"/>
+          </w:tcPr>
+          <w:p>
+            <w:r>
+              <w:rPr>
+                <w:sz w:val="18"/>
+              </w:rPr>
+              <w:t>Tái lập</w:t>
+            </w:r>
+          </w:p>
+        </w:tc>
+      </w:tr>
+      <w:tr>
+        <w:tblPrEx>
+          <w:tblBorders>
+            <w:top w:val="single" w:color="auto" w:sz="4" w:space="0"/>
+            <w:left w:val="single" w:color="auto" w:sz="4" w:space="0"/>
+            <w:bottom w:val="single" w:color="auto" w:sz="4" w:space="0"/>
+            <w:right w:val="single" w:color="auto" w:sz="4" w:space="0"/>
+            <w:insideH w:val="single" w:color="auto" w:sz="4" w:space="0"/>
+            <w:insideV w:val="single" w:color="auto" w:sz="4" w:space="0"/>
+          </w:tblBorders>
+          <w:tblCellMar>
+            <w:top w:w="0" w:type="dxa"/>
+            <w:left w:w="108" w:type="dxa"/>
+            <w:bottom w:w="0" w:type="dxa"/>
+            <w:right w:w="108" w:type="dxa"/>
+          </w:tblCellMar>
+        </w:tblPrEx>
+        <w:trPr>
+          <w:jc w:val="center"/>
+        </w:trPr>
+        <w:tc>
+          <w:tcPr>
+            <w:tcW w:w="5386" w:type="dxa"/>
+          </w:tcPr>
+          <w:p>
+            <w:r>
+              <w:rPr>
+                <w:sz w:val="18"/>
+              </w:rPr>
+              <w:t>Rủi ro diversity &lt; redundancy (paper: 163.73 &lt; 260.84)</w:t>
+            </w:r>
+          </w:p>
+        </w:tc>
+        <w:tc>
+          <w:tcPr>
+            <w:tcW w:w="1814" w:type="dxa"/>
+          </w:tcPr>
+          <w:p>
+            <w:r>
+              <w:rPr>
+                <w:sz w:val="18"/>
+              </w:rPr>
+              <w:t>Tái lập</w:t>
+            </w:r>
+          </w:p>
+        </w:tc>
+        <w:tc>
+          <w:tcPr>
+            <w:tcW w:w="1871" w:type="dxa"/>
+          </w:tcPr>
+          <w:p>
+            <w:r>
+              <w:rPr>
+                <w:sz w:val="18"/>
+              </w:rPr>
+              <w:t>Tái lập</w:t>
+            </w:r>
+          </w:p>
+        </w:tc>
+      </w:tr>
+      <w:tr>
+        <w:tblPrEx>
+          <w:tblBorders>
+            <w:top w:val="single" w:color="auto" w:sz="4" w:space="0"/>
+            <w:left w:val="single" w:color="auto" w:sz="4" w:space="0"/>
+            <w:bottom w:val="single" w:color="auto" w:sz="4" w:space="0"/>
+            <w:right w:val="single" w:color="auto" w:sz="4" w:space="0"/>
+            <w:insideH w:val="single" w:color="auto" w:sz="4" w:space="0"/>
+            <w:insideV w:val="single" w:color="auto" w:sz="4" w:space="0"/>
+          </w:tblBorders>
+          <w:tblCellMar>
+            <w:top w:w="0" w:type="dxa"/>
+            <w:left w:w="108" w:type="dxa"/>
+            <w:bottom w:w="0" w:type="dxa"/>
+            <w:right w:w="108" w:type="dxa"/>
+          </w:tblCellMar>
+        </w:tblPrEx>
+        <w:trPr>
+          <w:jc w:val="center"/>
+        </w:trPr>
+        <w:tc>
+          <w:tcPr>
+            <w:tcW w:w="5386" w:type="dxa"/>
+          </w:tcPr>
+          <w:p>
+            <w:r>
+              <w:rPr>
+                <w:sz w:val="18"/>
+              </w:rPr>
+              <w:t>S+D có rủi ro mạng thấp nhất trong các phương án</w:t>
+            </w:r>
+          </w:p>
+        </w:tc>
+        <w:tc>
+          <w:tcPr>
+            <w:tcW w:w="1814" w:type="dxa"/>
+          </w:tcPr>
+          <w:p>
+            <w:r>
+              <w:rPr>
+                <w:sz w:val="18"/>
+              </w:rPr>
+              <w:t>Không</w:t>
+            </w:r>
+          </w:p>
+        </w:tc>
+        <w:tc>
+          <w:tcPr>
+            <w:tcW w:w="1871" w:type="dxa"/>
+          </w:tcPr>
+          <w:p>
+            <w:r>
+              <w:rPr>
+                <w:sz w:val="18"/>
+              </w:rPr>
+              <w:t>Tái lập</w:t>
+            </w:r>
+          </w:p>
+        </w:tc>
+      </w:tr>
+      <w:tr>
+        <w:tblPrEx>
+          <w:tblBorders>
+            <w:top w:val="single" w:color="auto" w:sz="4" w:space="0"/>
+            <w:left w:val="single" w:color="auto" w:sz="4" w:space="0"/>
+            <w:bottom w:val="single" w:color="auto" w:sz="4" w:space="0"/>
+            <w:right w:val="single" w:color="auto" w:sz="4" w:space="0"/>
+            <w:insideH w:val="single" w:color="auto" w:sz="4" w:space="0"/>
+            <w:insideV w:val="single" w:color="auto" w:sz="4" w:space="0"/>
+          </w:tblBorders>
+          <w:tblCellMar>
+            <w:top w:w="0" w:type="dxa"/>
+            <w:left w:w="108" w:type="dxa"/>
+            <w:bottom w:w="0" w:type="dxa"/>
+            <w:right w:w="108" w:type="dxa"/>
+          </w:tblCellMar>
+        </w:tblPrEx>
+        <w:trPr>
+          <w:jc w:val="center"/>
+        </w:trPr>
+        <w:tc>
+          <w:tcPr>
+            <w:tcW w:w="5386" w:type="dxa"/>
+          </w:tcPr>
+          <w:p>
+            <w:r>
+              <w:rPr>
+                <w:sz w:val="18"/>
+              </w:rPr>
+              <w:t>S+D có ASP trung bình các đường thấp hơn S và D riêng</w:t>
+            </w:r>
+          </w:p>
+        </w:tc>
+        <w:tc>
+          <w:tcPr>
+            <w:tcW w:w="1814" w:type="dxa"/>
+          </w:tcPr>
+          <w:p>
+            <w:r>
+              <w:rPr>
+                <w:sz w:val="18"/>
+              </w:rPr>
+              <w:t>Không</w:t>
+            </w:r>
+          </w:p>
+        </w:tc>
+        <w:tc>
+          <w:tcPr>
+            <w:tcW w:w="1871" w:type="dxa"/>
+          </w:tcPr>
+          <w:p>
+            <w:r>
+              <w:rPr>
+                <w:sz w:val="18"/>
+              </w:rPr>
+              <w:t>Không</w:t>
+            </w:r>
+          </w:p>
+        </w:tc>
+      </w:tr>
+      <w:tr>
+        <w:tblPrEx>
+          <w:tblBorders>
+            <w:top w:val="single" w:color="auto" w:sz="4" w:space="0"/>
+            <w:left w:val="single" w:color="auto" w:sz="4" w:space="0"/>
+            <w:bottom w:val="single" w:color="auto" w:sz="4" w:space="0"/>
+            <w:right w:val="single" w:color="auto" w:sz="4" w:space="0"/>
+            <w:insideH w:val="single" w:color="auto" w:sz="4" w:space="0"/>
+            <w:insideV w:val="single" w:color="auto" w:sz="4" w:space="0"/>
+          </w:tblBorders>
+          <w:tblCellMar>
+            <w:top w:w="0" w:type="dxa"/>
+            <w:left w:w="108" w:type="dxa"/>
+            <w:bottom w:w="0" w:type="dxa"/>
+            <w:right w:w="108" w:type="dxa"/>
+          </w:tblCellMar>
+        </w:tblPrEx>
+        <w:trPr>
+          <w:jc w:val="center"/>
+        </w:trPr>
+        <w:tc>
+          <w:tcPr>
+            <w:tcW w:w="5386" w:type="dxa"/>
+          </w:tcPr>
+          <w:p>
+            <w:r>
+              <w:rPr>
+                <w:sz w:val="18"/>
+              </w:rPr>
+              <w:t>S+D+R giảm rủi ro so với chỉ R</w:t>
+            </w:r>
+          </w:p>
+        </w:tc>
+        <w:tc>
+          <w:tcPr>
+            <w:tcW w:w="1814" w:type="dxa"/>
+          </w:tcPr>
+          <w:p>
+            <w:r>
+              <w:rPr>
+                <w:sz w:val="18"/>
+              </w:rPr>
+              <w:t>Không</w:t>
+            </w:r>
+          </w:p>
+        </w:tc>
+        <w:tc>
+          <w:tcPr>
+            <w:tcW w:w="1871" w:type="dxa"/>
+          </w:tcPr>
+          <w:p>
+            <w:r>
+              <w:rPr>
+                <w:sz w:val="18"/>
+              </w:rPr>
+              <w:t>Tái lập</w:t>
+            </w:r>
+          </w:p>
+        </w:tc>
+      </w:tr>
+    </w:tbl>
+    <w:p/>
+    <w:p>
+      <w:pPr>
+        <w:jc w:val="both"/>
+      </w:pPr>
+      <w:r>
+        <w:rPr>
+          <w:b w:val="0"/>
+          <w:i w:val="0"/>
+        </w:rPr>
+        <w:t xml:space="preserve">Tổng toàn mạng của paper không suy ra được từ dữ liệu công bố (danh sách cạnh sau shuffle bị cắt; AC theo VM ở mục 4.2 lớn gấp 5–8 lần tổng cost của Bảng 1–2; RoC toàn mạng không bằng R/AC của chính paper), nên chỉ so xu hướng. Với topology vẽ trong Hình 3, </w:t>
+      </w:r>
+      <w:r>
+        <w:rPr>
+          <w:b/>
+          <w:i w:val="0"/>
+        </w:rPr>
+        <w:t>6/7 kết luận định tính</w:t>
+      </w:r>
+      <w:r>
+        <w:rPr>
+          <w:b w:val="0"/>
+          <w:i w:val="0"/>
+        </w:rPr>
+        <w:t xml:space="preserve"> tái lập được, gồm kết luận chính "shuffle + diversity có rủi ro thấp nhất"; với đúng danh sách cạnh của Definition 2 chỉ còn 3/7 – kết luận của paper nhạy với một cạnh (V6 → V4) mà định nghĩa và hình vẽ ghi không thống nhất. Chi tiết: docs/tai_lap_paper_chinh.md.</w:t>
+      </w:r>
+    </w:p>
+    <w:p>
+      <w:pPr>
+        <w:jc w:val="center"/>
+      </w:pPr>
+      <w:r>
+        <w:drawing>
+          <wp:inline distT="0" distB="0" distL="114300" distR="114300">
+            <wp:extent cx="5579745" cy="1630680"/>
+            <wp:effectExtent l="0" t="0" r="13335" b="0"/>
+            <wp:docPr id="8" name="Picture 8"/>
+            <wp:cNvGraphicFramePr>
+              <a:graphicFrameLocks xmlns:a="http://schemas.openxmlformats.org/drawingml/2006/main" noChangeAspect="1"/>
+            </wp:cNvGraphicFramePr>
+            <a:graphic xmlns:a="http://schemas.openxmlformats.org/drawingml/2006/main">
+              <a:graphicData uri="http://schemas.openxmlformats.org/drawingml/2006/picture">
+                <pic:pic xmlns:pic="http://schemas.openxmlformats.org/drawingml/2006/picture">
+                  <pic:nvPicPr>
+                    <pic:cNvPr id="8" name="Picture 8"/>
+                    <pic:cNvPicPr>
+                      <a:picLocks noChangeAspect="1"/>
+                    </pic:cNvPicPr>
+                  </pic:nvPicPr>
+                  <pic:blipFill>
+                    <a:blip r:embed="rId14"/>
+                    <a:stretch>
+                      <a:fillRect/>
+                    </a:stretch>
+                  </pic:blipFill>
+                  <pic:spPr>
+                    <a:xfrm>
+                      <a:off x="0" y="0"/>
+                      <a:ext cx="5580000" cy="1631077"/>
+                    </a:xfrm>
+                    <a:prstGeom prst="rect">
+                      <a:avLst/>
+                    </a:prstGeom>
+                  </pic:spPr>
+                </pic:pic>
+              </a:graphicData>
+            </a:graphic>
+          </wp:inline>
+        </w:drawing>
+      </w:r>
+    </w:p>
+    <w:p>
+      <w:pPr>
+        <w:jc w:val="center"/>
+      </w:pPr>
+      <w:r>
+        <w:rPr>
+          <w:i/>
+          <w:sz w:val="22"/>
+        </w:rPr>
+        <w:t>Hình 8. Tái lập 3-layer THARM: rủi ro, chi phí và ASP theo kịch bản MTD</w:t>
+      </w:r>
+    </w:p>
+    <w:p>
+      <w:pPr>
+        <w:pStyle w:val="3"/>
+      </w:pPr>
+      <w:bookmarkStart w:id="32" w:name="_Toc8488"/>
+      <w:r>
+        <w:t>6.9 Bảng đối chiếu tiêu chí đã chốt trước</w:t>
+      </w:r>
+      <w:bookmarkEnd w:id="32"/>
+    </w:p>
+    <w:p>
+      <w:pPr>
+        <w:jc w:val="center"/>
+      </w:pPr>
+      <w:r>
+        <w:rPr>
+          <w:i/>
+          <w:sz w:val="22"/>
+        </w:rPr>
+        <w:t>Bảng 20. Kết quả so với tiêu chí thành công (docs/tieu_chi_thanh_cong.md)</w:t>
       </w:r>
     </w:p>
     <w:tbl>
@@ -21679,21 +23438,21 @@
       <w:pPr>
         <w:pStyle w:val="2"/>
       </w:pPr>
-      <w:bookmarkStart w:id="32" w:name="_Toc280"/>
+      <w:bookmarkStart w:id="33" w:name="_Toc843"/>
       <w:r>
         <w:t>Chương 7. Phân tích lỗi, độ ổn định, ablation và chi phí</w:t>
       </w:r>
-      <w:bookmarkEnd w:id="32"/>
+      <w:bookmarkEnd w:id="33"/>
     </w:p>
     <w:p>
       <w:pPr>
         <w:pStyle w:val="3"/>
       </w:pPr>
-      <w:bookmarkStart w:id="33" w:name="_Toc9338"/>
+      <w:bookmarkStart w:id="34" w:name="_Toc8703"/>
       <w:r>
         <w:t>7.1 Phân tích lỗi: bỏ sót BASHLITE tcp/udp</w:t>
       </w:r>
-      <w:bookmarkEnd w:id="33"/>
+      <w:bookmarkEnd w:id="34"/>
     </w:p>
     <w:p>
       <w:pPr>
@@ -21704,7 +23463,7 @@
           <w:i/>
           <w:sz w:val="22"/>
         </w:rPr>
-        <w:t>Bảng 18. Recall trung bình theo nhóm tấn công</w:t>
+        <w:t>Bảng 21. Recall trung bình theo nhóm tấn công</w:t>
       </w:r>
     </w:p>
     <w:tbl>
@@ -22114,62 +23873,6 @@
           <wp:inline distT="0" distB="0" distL="114300" distR="114300">
             <wp:extent cx="5039995" cy="2303780"/>
             <wp:effectExtent l="0" t="0" r="4445" b="12700"/>
-            <wp:docPr id="8" name="Picture 8"/>
-            <wp:cNvGraphicFramePr>
-              <a:graphicFrameLocks xmlns:a="http://schemas.openxmlformats.org/drawingml/2006/main" noChangeAspect="1"/>
-            </wp:cNvGraphicFramePr>
-            <a:graphic xmlns:a="http://schemas.openxmlformats.org/drawingml/2006/main">
-              <a:graphicData uri="http://schemas.openxmlformats.org/drawingml/2006/picture">
-                <pic:pic xmlns:pic="http://schemas.openxmlformats.org/drawingml/2006/picture">
-                  <pic:nvPicPr>
-                    <pic:cNvPr id="8" name="Picture 8"/>
-                    <pic:cNvPicPr>
-                      <a:picLocks noChangeAspect="1"/>
-                    </pic:cNvPicPr>
-                  </pic:nvPicPr>
-                  <pic:blipFill>
-                    <a:blip r:embed="rId14"/>
-                    <a:stretch>
-                      <a:fillRect/>
-                    </a:stretch>
-                  </pic:blipFill>
-                  <pic:spPr>
-                    <a:xfrm>
-                      <a:off x="0" y="0"/>
-                      <a:ext cx="5040000" cy="2304000"/>
-                    </a:xfrm>
-                    <a:prstGeom prst="rect">
-                      <a:avLst/>
-                    </a:prstGeom>
-                  </pic:spPr>
-                </pic:pic>
-              </a:graphicData>
-            </a:graphic>
-          </wp:inline>
-        </w:drawing>
-      </w:r>
-    </w:p>
-    <w:p>
-      <w:pPr>
-        <w:jc w:val="center"/>
-      </w:pPr>
-      <w:r>
-        <w:rPr>
-          <w:i/>
-          <w:sz w:val="22"/>
-        </w:rPr>
-        <w:t>Hình 8. Phân phối MSE của B0 trên Ennio: tcp và udp trùng nhau ở MSE ≈ 0.17, dưới ngưỡng mean+std</w:t>
-      </w:r>
-    </w:p>
-    <w:p>
-      <w:pPr>
-        <w:jc w:val="center"/>
-      </w:pPr>
-      <w:r>
-        <w:drawing>
-          <wp:inline distT="0" distB="0" distL="114300" distR="114300">
-            <wp:extent cx="5039995" cy="2015490"/>
-            <wp:effectExtent l="0" t="0" r="4445" b="11430"/>
             <wp:docPr id="9" name="Picture 9"/>
             <wp:cNvGraphicFramePr>
               <a:graphicFrameLocks xmlns:a="http://schemas.openxmlformats.org/drawingml/2006/main" noChangeAspect="1"/>
@@ -22192,6 +23895,62 @@
                   <pic:spPr>
                     <a:xfrm>
                       <a:off x="0" y="0"/>
+                      <a:ext cx="5040000" cy="2304000"/>
+                    </a:xfrm>
+                    <a:prstGeom prst="rect">
+                      <a:avLst/>
+                    </a:prstGeom>
+                  </pic:spPr>
+                </pic:pic>
+              </a:graphicData>
+            </a:graphic>
+          </wp:inline>
+        </w:drawing>
+      </w:r>
+    </w:p>
+    <w:p>
+      <w:pPr>
+        <w:jc w:val="center"/>
+      </w:pPr>
+      <w:r>
+        <w:rPr>
+          <w:i/>
+          <w:sz w:val="22"/>
+        </w:rPr>
+        <w:t>Hình 9. Phân phối MSE của B0 trên Ennio: tcp và udp trùng nhau ở MSE ≈ 0.17, dưới ngưỡng mean+std</w:t>
+      </w:r>
+    </w:p>
+    <w:p>
+      <w:pPr>
+        <w:jc w:val="center"/>
+      </w:pPr>
+      <w:r>
+        <w:drawing>
+          <wp:inline distT="0" distB="0" distL="114300" distR="114300">
+            <wp:extent cx="5039995" cy="2015490"/>
+            <wp:effectExtent l="0" t="0" r="4445" b="11430"/>
+            <wp:docPr id="10" name="Picture 10"/>
+            <wp:cNvGraphicFramePr>
+              <a:graphicFrameLocks xmlns:a="http://schemas.openxmlformats.org/drawingml/2006/main" noChangeAspect="1"/>
+            </wp:cNvGraphicFramePr>
+            <a:graphic xmlns:a="http://schemas.openxmlformats.org/drawingml/2006/main">
+              <a:graphicData uri="http://schemas.openxmlformats.org/drawingml/2006/picture">
+                <pic:pic xmlns:pic="http://schemas.openxmlformats.org/drawingml/2006/picture">
+                  <pic:nvPicPr>
+                    <pic:cNvPr id="10" name="Picture 10"/>
+                    <pic:cNvPicPr>
+                      <a:picLocks noChangeAspect="1"/>
+                    </pic:cNvPicPr>
+                  </pic:nvPicPr>
+                  <pic:blipFill>
+                    <a:blip r:embed="rId16"/>
+                    <a:stretch>
+                      <a:fillRect/>
+                    </a:stretch>
+                  </pic:blipFill>
+                  <pic:spPr>
+                    <a:xfrm>
+                      <a:off x="0" y="0"/>
                       <a:ext cx="5040000" cy="2016000"/>
                     </a:xfrm>
                     <a:prstGeom prst="rect">
@@ -22214,7 +23973,7 @@
           <w:i/>
           <w:sz w:val="22"/>
         </w:rPr>
-        <w:t>Hình 9. Recall theo loại tấn công</w:t>
+        <w:t>Hình 10. Recall theo loại tấn công</w:t>
       </w:r>
     </w:p>
     <w:p>
@@ -22240,11 +23999,11 @@
       <w:pPr>
         <w:pStyle w:val="4"/>
       </w:pPr>
-      <w:bookmarkStart w:id="34" w:name="_Toc19542"/>
+      <w:bookmarkStart w:id="35" w:name="_Toc23612"/>
       <w:r>
         <w:t>Phân tích khám phá hậu kiểm (không thuộc tiêu chí chốt trước)</w:t>
       </w:r>
-      <w:bookmarkEnd w:id="34"/>
+      <w:bookmarkEnd w:id="35"/>
     </w:p>
     <w:p>
       <w:pPr>
@@ -22255,7 +24014,7 @@
           <w:i/>
           <w:sz w:val="22"/>
         </w:rPr>
-        <w:t>Bảng 19. Hậu kiểm: ngưỡng theo percentile DSopt + ws* (FPR=0 trên DSopt, tối đa 5000) – seed 42</w:t>
+        <w:t>Bảng 22. Hậu kiểm: ngưỡng theo percentile DSopt + ws* (FPR=0 trên DSopt, tối đa 5000) – seed 42</w:t>
       </w:r>
     </w:p>
     <w:tbl>
@@ -23984,11 +25743,11 @@
       <w:pPr>
         <w:pStyle w:val="3"/>
       </w:pPr>
-      <w:bookmarkStart w:id="35" w:name="_Toc16617"/>
+      <w:bookmarkStart w:id="36" w:name="_Toc31087"/>
       <w:r>
         <w:t>7.2 Độ ổn định theo seed</w:t>
       </w:r>
-      <w:bookmarkEnd w:id="35"/>
+      <w:bookmarkEnd w:id="36"/>
     </w:p>
     <w:p>
       <w:pPr>
@@ -23999,7 +25758,7 @@
           <wp:inline distT="0" distB="0" distL="114300" distR="114300">
             <wp:extent cx="5039995" cy="1889760"/>
             <wp:effectExtent l="0" t="0" r="4445" b="0"/>
-            <wp:docPr id="10" name="Picture 10"/>
+            <wp:docPr id="11" name="Picture 11"/>
             <wp:cNvGraphicFramePr>
               <a:graphicFrameLocks xmlns:a="http://schemas.openxmlformats.org/drawingml/2006/main" noChangeAspect="1"/>
             </wp:cNvGraphicFramePr>
@@ -24007,13 +25766,13 @@
               <a:graphicData uri="http://schemas.openxmlformats.org/drawingml/2006/picture">
                 <pic:pic xmlns:pic="http://schemas.openxmlformats.org/drawingml/2006/picture">
                   <pic:nvPicPr>
-                    <pic:cNvPr id="10" name="Picture 10"/>
+                    <pic:cNvPr id="11" name="Picture 11"/>
                     <pic:cNvPicPr>
                       <a:picLocks noChangeAspect="1"/>
                     </pic:cNvPicPr>
                   </pic:nvPicPr>
                   <pic:blipFill>
-                    <a:blip r:embed="rId16"/>
+                    <a:blip r:embed="rId17"/>
                     <a:stretch>
                       <a:fillRect/>
                     </a:stretch>
@@ -24043,7 +25802,7 @@
           <w:i/>
           <w:sz w:val="22"/>
         </w:rPr>
-        <w:t>Hình 10. Phân bố macro-F1 qua 5 seed theo thiết bị (B0 và V1)</w:t>
+        <w:t>Hình 11. Phân bố macro-F1 qua 5 seed theo thiết bị (B0 và V1)</w:t>
       </w:r>
     </w:p>
     <w:p>
@@ -24055,7 +25814,7 @@
           <w:i/>
           <w:sz w:val="22"/>
         </w:rPr>
-        <w:t>Bảng 20. Các thiết bị có TPR dao động &gt; 0.05 giữa các seed</w:t>
+        <w:t>Bảng 23. Các thiết bị có TPR dao động &gt; 0.05 giữa các seed</w:t>
       </w:r>
     </w:p>
     <w:tbl>
@@ -24737,11 +26496,11 @@
       <w:pPr>
         <w:pStyle w:val="3"/>
       </w:pPr>
-      <w:bookmarkStart w:id="36" w:name="_Toc30762"/>
+      <w:bookmarkStart w:id="37" w:name="_Toc20802"/>
       <w:r>
         <w:t>7.3 Ablation</w:t>
       </w:r>
-      <w:bookmarkEnd w:id="36"/>
+      <w:bookmarkEnd w:id="37"/>
     </w:p>
     <w:p>
       <w:pPr>
@@ -24752,7 +26511,7 @@
           <w:i/>
           <w:sz w:val="22"/>
         </w:rPr>
-        <w:t>Bảng 21. B0: quy tắc ngưỡng × kích thước cửa sổ (trung bình 9 thiết bị × 5 seed)</w:t>
+        <w:t>Bảng 24. B0: quy tắc ngưỡng × kích thước cửa sổ (trung bình 9 thiết bị × 5 seed)</w:t>
       </w:r>
     </w:p>
     <w:tbl>
@@ -26446,7 +28205,7 @@
           <wp:inline distT="0" distB="0" distL="114300" distR="114300">
             <wp:extent cx="5039995" cy="1889760"/>
             <wp:effectExtent l="0" t="0" r="4445" b="0"/>
-            <wp:docPr id="11" name="Picture 11"/>
+            <wp:docPr id="12" name="Picture 12"/>
             <wp:cNvGraphicFramePr>
               <a:graphicFrameLocks xmlns:a="http://schemas.openxmlformats.org/drawingml/2006/main" noChangeAspect="1"/>
             </wp:cNvGraphicFramePr>
@@ -26454,13 +28213,13 @@
               <a:graphicData uri="http://schemas.openxmlformats.org/drawingml/2006/picture">
                 <pic:pic xmlns:pic="http://schemas.openxmlformats.org/drawingml/2006/picture">
                   <pic:nvPicPr>
-                    <pic:cNvPr id="11" name="Picture 11"/>
+                    <pic:cNvPr id="12" name="Picture 12"/>
                     <pic:cNvPicPr>
                       <a:picLocks noChangeAspect="1"/>
                     </pic:cNvPicPr>
                   </pic:nvPicPr>
                   <pic:blipFill>
-                    <a:blip r:embed="rId17"/>
+                    <a:blip r:embed="rId18"/>
                     <a:stretch>
                       <a:fillRect/>
                     </a:stretch>
@@ -26490,7 +28249,7 @@
           <w:i/>
           <w:sz w:val="22"/>
         </w:rPr>
-        <w:t>Hình 11. Ablation quy tắc ngưỡng và cửa sổ (B0)</w:t>
+        <w:t>Hình 12. Ablation quy tắc ngưỡng và cửa sổ (B0)</w:t>
       </w:r>
     </w:p>
     <w:p>
@@ -26587,11 +28346,11 @@
       <w:pPr>
         <w:pStyle w:val="4"/>
       </w:pPr>
-      <w:bookmarkStart w:id="37" w:name="_Toc18219"/>
+      <w:bookmarkStart w:id="38" w:name="_Toc16877"/>
       <w:r>
         <w:t>Đối chứng rò rỉ (E6)</w:t>
       </w:r>
-      <w:bookmarkEnd w:id="37"/>
+      <w:bookmarkEnd w:id="38"/>
     </w:p>
     <w:p>
       <w:pPr>
@@ -26609,11 +28368,11 @@
       <w:pPr>
         <w:pStyle w:val="3"/>
       </w:pPr>
-      <w:bookmarkStart w:id="38" w:name="_Toc8394"/>
+      <w:bookmarkStart w:id="39" w:name="_Toc13363"/>
       <w:r>
         <w:t>7.4 Robustness (tấn công được phép, offline)</w:t>
       </w:r>
-      <w:bookmarkEnd w:id="38"/>
+      <w:bookmarkEnd w:id="39"/>
     </w:p>
     <w:p>
       <w:pPr>
@@ -26624,7 +28383,7 @@
           <w:i/>
           <w:sz w:val="22"/>
         </w:rPr>
-        <w:t>Bảng 22. Né tránh kiểu mimicry: x' = (1−α)·x + α·μ_benign (V1, 3 seed)</w:t>
+        <w:t>Bảng 25. Né tránh kiểu mimicry: x' = (1−α)·x + α·μ_benign (V1, 3 seed)</w:t>
       </w:r>
     </w:p>
     <w:tbl>
@@ -27225,7 +28984,7 @@
           <wp:inline distT="0" distB="0" distL="114300" distR="114300">
             <wp:extent cx="3239770" cy="2159635"/>
             <wp:effectExtent l="0" t="0" r="6350" b="4445"/>
-            <wp:docPr id="12" name="Picture 12"/>
+            <wp:docPr id="13" name="Picture 13"/>
             <wp:cNvGraphicFramePr>
               <a:graphicFrameLocks xmlns:a="http://schemas.openxmlformats.org/drawingml/2006/main" noChangeAspect="1"/>
             </wp:cNvGraphicFramePr>
@@ -27233,13 +28992,13 @@
               <a:graphicData uri="http://schemas.openxmlformats.org/drawingml/2006/picture">
                 <pic:pic xmlns:pic="http://schemas.openxmlformats.org/drawingml/2006/picture">
                   <pic:nvPicPr>
-                    <pic:cNvPr id="12" name="Picture 12"/>
+                    <pic:cNvPr id="13" name="Picture 13"/>
                     <pic:cNvPicPr>
                       <a:picLocks noChangeAspect="1"/>
                     </pic:cNvPicPr>
                   </pic:nvPicPr>
                   <pic:blipFill>
-                    <a:blip r:embed="rId18"/>
+                    <a:blip r:embed="rId19"/>
                     <a:stretch>
                       <a:fillRect/>
                     </a:stretch>
@@ -27269,7 +29028,7 @@
           <w:i/>
           <w:sz w:val="22"/>
         </w:rPr>
-        <w:t>Hình 12. TPR theo mức né tránh α</w:t>
+        <w:t>Hình 13. TPR theo mức né tránh α</w:t>
       </w:r>
     </w:p>
     <w:p>
@@ -27281,7 +29040,7 @@
           <w:i/>
           <w:sz w:val="22"/>
         </w:rPr>
-        <w:t>Bảng 23. Đầu độc dữ liệu huấn luyện (3 seed)</w:t>
+        <w:t>Bảng 26. Đầu độc dữ liệu huấn luyện (3 seed)</w:t>
       </w:r>
     </w:p>
     <w:tbl>
@@ -27656,11 +29415,11 @@
       <w:pPr>
         <w:pStyle w:val="3"/>
       </w:pPr>
-      <w:bookmarkStart w:id="39" w:name="_Toc4406"/>
+      <w:bookmarkStart w:id="40" w:name="_Toc19071"/>
       <w:r>
         <w:t>7.5 Chi phí tính toán và triển khai</w:t>
       </w:r>
-      <w:bookmarkEnd w:id="39"/>
+      <w:bookmarkEnd w:id="40"/>
     </w:p>
     <w:p>
       <w:pPr>
@@ -27671,7 +29430,7 @@
           <w:i/>
           <w:sz w:val="22"/>
         </w:rPr>
-        <w:t>Bảng 24. Chi phí huấn luyện (2 luồng CPU / process)</w:t>
+        <w:t>Bảng 27. Chi phí huấn luyện (2 luồng CPU / process)</w:t>
       </w:r>
     </w:p>
     <w:tbl>
@@ -28084,21 +29843,21 @@
       <w:pPr>
         <w:pStyle w:val="2"/>
       </w:pPr>
-      <w:bookmarkStart w:id="40" w:name="_Toc5256"/>
+      <w:bookmarkStart w:id="41" w:name="_Toc21103"/>
       <w:r>
         <w:t>Chương 8. Bảng ánh xạ, giới hạn và kết luận</w:t>
       </w:r>
-      <w:bookmarkEnd w:id="40"/>
+      <w:bookmarkEnd w:id="41"/>
     </w:p>
     <w:p>
       <w:pPr>
         <w:pStyle w:val="3"/>
       </w:pPr>
-      <w:bookmarkStart w:id="41" w:name="_Toc26495"/>
+      <w:bookmarkStart w:id="42" w:name="_Toc25493"/>
       <w:r>
         <w:t>8.1 Bảng ánh xạ kết quả với paper</w:t>
       </w:r>
-      <w:bookmarkEnd w:id="41"/>
+      <w:bookmarkEnd w:id="42"/>
     </w:p>
     <w:p>
       <w:pPr>
@@ -28109,7 +29868,7 @@
           <w:i/>
           <w:sz w:val="22"/>
         </w:rPr>
-        <w:t>Bảng 25. Ánh xạ với Meidan 2018</w:t>
+        <w:t>Bảng 28. Ánh xạ với Meidan 2018</w:t>
       </w:r>
     </w:p>
     <w:tbl>
@@ -28763,7 +30522,7 @@
           <w:i/>
           <w:sz w:val="22"/>
         </w:rPr>
-        <w:t>Bảng 26. Ánh xạ với paper chính</w:t>
+        <w:t>Bảng 29. Ánh xạ với paper chính</w:t>
       </w:r>
     </w:p>
     <w:tbl>
@@ -28903,7 +30662,7 @@
               <w:rPr>
                 <w:sz w:val="18"/>
               </w:rPr>
-              <w:t>Xếp hạng chiến lược</w:t>
+              <w:t>Xếp hạng chiến lược (HARM rút gọn)</w:t>
             </w:r>
           </w:p>
         </w:tc>
@@ -28976,7 +30735,7 @@
               <w:rPr>
                 <w:sz w:val="18"/>
               </w:rPr>
-              <w:t>Số liệu tuyệt đối</w:t>
+              <w:t>Rủi ro mức VM / đường (E11)</w:t>
             </w:r>
           </w:p>
         </w:tc>
@@ -28989,7 +30748,7 @@
               <w:rPr>
                 <w:sz w:val="18"/>
               </w:rPr>
-              <w:t>Theo topology/CVE của paper</w:t>
+              <w:t>R_V4 12.47, R_V5 12.58, R_V7 8.67, R_V8 5.62; đường 43.15 / 43.31</w:t>
             </w:r>
           </w:p>
         </w:tc>
@@ -29002,7 +30761,7 @@
               <w:rPr>
                 <w:sz w:val="18"/>
               </w:rPr>
-              <w:t>Topology và xác suất giả định</w:t>
+              <w:t>Khớp ±0.01 mức VM; −0.8% mức đường</w:t>
             </w:r>
           </w:p>
         </w:tc>
@@ -29015,7 +30774,7 @@
               <w:rPr>
                 <w:sz w:val="18"/>
               </w:rPr>
-              <w:t>Không so được</w:t>
+              <w:t>Tái lập được</w:t>
             </w:r>
           </w:p>
         </w:tc>
@@ -29049,6 +30808,152 @@
               <w:rPr>
                 <w:sz w:val="18"/>
               </w:rPr>
+              <w:t>Tổng toàn mạng (E11)</w:t>
+            </w:r>
+          </w:p>
+        </w:tc>
+        <w:tc>
+          <w:tcPr>
+            <w:tcW w:w="2381" w:type="dxa"/>
+          </w:tcPr>
+          <w:p>
+            <w:r>
+              <w:rPr>
+                <w:sz w:val="18"/>
+              </w:rPr>
+              <w:t>R_s 167.38, R_d 163.73, R_r 260.84</w:t>
+            </w:r>
+          </w:p>
+        </w:tc>
+        <w:tc>
+          <w:tcPr>
+            <w:tcW w:w="3288" w:type="dxa"/>
+          </w:tcPr>
+          <w:p>
+            <w:r>
+              <w:rPr>
+                <w:sz w:val="18"/>
+              </w:rPr>
+              <w:t>173.6 / 142.3 / 217.6</w:t>
+            </w:r>
+          </w:p>
+        </w:tc>
+        <w:tc>
+          <w:tcPr>
+            <w:tcW w:w="1701" w:type="dxa"/>
+          </w:tcPr>
+          <w:p>
+            <w:r>
+              <w:rPr>
+                <w:sz w:val="18"/>
+              </w:rPr>
+              <w:t>Không tái lập số tuyệt đối</w:t>
+            </w:r>
+          </w:p>
+        </w:tc>
+      </w:tr>
+      <w:tr>
+        <w:tblPrEx>
+          <w:tblBorders>
+            <w:top w:val="single" w:color="auto" w:sz="4" w:space="0"/>
+            <w:left w:val="single" w:color="auto" w:sz="4" w:space="0"/>
+            <w:bottom w:val="single" w:color="auto" w:sz="4" w:space="0"/>
+            <w:right w:val="single" w:color="auto" w:sz="4" w:space="0"/>
+            <w:insideH w:val="single" w:color="auto" w:sz="4" w:space="0"/>
+            <w:insideV w:val="single" w:color="auto" w:sz="4" w:space="0"/>
+          </w:tblBorders>
+          <w:tblCellMar>
+            <w:top w:w="0" w:type="dxa"/>
+            <w:left w:w="108" w:type="dxa"/>
+            <w:bottom w:w="0" w:type="dxa"/>
+            <w:right w:w="108" w:type="dxa"/>
+          </w:tblCellMar>
+        </w:tblPrEx>
+        <w:trPr>
+          <w:jc w:val="center"/>
+        </w:trPr>
+        <w:tc>
+          <w:tcPr>
+            <w:tcW w:w="1701" w:type="dxa"/>
+          </w:tcPr>
+          <w:p>
+            <w:r>
+              <w:rPr>
+                <w:sz w:val="18"/>
+              </w:rPr>
+              <w:t>Kết luận định tính (E11)</w:t>
+            </w:r>
+          </w:p>
+        </w:tc>
+        <w:tc>
+          <w:tcPr>
+            <w:tcW w:w="2381" w:type="dxa"/>
+          </w:tcPr>
+          <w:p>
+            <w:r>
+              <w:rPr>
+                <w:sz w:val="18"/>
+              </w:rPr>
+              <w:t>S+D tốt nhất; D &lt; R</w:t>
+            </w:r>
+          </w:p>
+        </w:tc>
+        <w:tc>
+          <w:tcPr>
+            <w:tcW w:w="3288" w:type="dxa"/>
+          </w:tcPr>
+          <w:p>
+            <w:r>
+              <w:rPr>
+                <w:sz w:val="18"/>
+              </w:rPr>
+              <w:t>6/7 với topology Hình 3; 3/7 với Definition 2</w:t>
+            </w:r>
+          </w:p>
+        </w:tc>
+        <w:tc>
+          <w:tcPr>
+            <w:tcW w:w="1701" w:type="dxa"/>
+          </w:tcPr>
+          <w:p>
+            <w:r>
+              <w:rPr>
+                <w:sz w:val="18"/>
+              </w:rPr>
+              <w:t>Khớp với Hình 3</w:t>
+            </w:r>
+          </w:p>
+        </w:tc>
+      </w:tr>
+      <w:tr>
+        <w:tblPrEx>
+          <w:tblBorders>
+            <w:top w:val="single" w:color="auto" w:sz="4" w:space="0"/>
+            <w:left w:val="single" w:color="auto" w:sz="4" w:space="0"/>
+            <w:bottom w:val="single" w:color="auto" w:sz="4" w:space="0"/>
+            <w:right w:val="single" w:color="auto" w:sz="4" w:space="0"/>
+            <w:insideH w:val="single" w:color="auto" w:sz="4" w:space="0"/>
+            <w:insideV w:val="single" w:color="auto" w:sz="4" w:space="0"/>
+          </w:tblBorders>
+          <w:tblCellMar>
+            <w:top w:w="0" w:type="dxa"/>
+            <w:left w:w="108" w:type="dxa"/>
+            <w:bottom w:w="0" w:type="dxa"/>
+            <w:right w:w="108" w:type="dxa"/>
+          </w:tblCellMar>
+        </w:tblPrEx>
+        <w:trPr>
+          <w:jc w:val="center"/>
+        </w:trPr>
+        <w:tc>
+          <w:tcPr>
+            <w:tcW w:w="1701" w:type="dxa"/>
+          </w:tcPr>
+          <w:p>
+            <w:r>
+              <w:rPr>
+                <w:sz w:val="18"/>
+              </w:rPr>
               <w:t>Bộ kích hoạt MTD</w:t>
             </w:r>
           </w:p>
@@ -29099,11 +31004,11 @@
       <w:pPr>
         <w:pStyle w:val="3"/>
       </w:pPr>
-      <w:bookmarkStart w:id="42" w:name="_Toc1992"/>
+      <w:bookmarkStart w:id="43" w:name="_Toc22770"/>
       <w:r>
         <w:t>8.2 Giới hạn và mối đe dọa với tính hợp lệ</w:t>
       </w:r>
-      <w:bookmarkEnd w:id="42"/>
+      <w:bookmarkEnd w:id="43"/>
     </w:p>
     <w:p>
       <w:pPr>
@@ -29217,11 +31122,11 @@
       <w:pPr>
         <w:pStyle w:val="3"/>
       </w:pPr>
-      <w:bookmarkStart w:id="43" w:name="_Toc2961"/>
+      <w:bookmarkStart w:id="44" w:name="_Toc21339"/>
       <w:r>
         <w:t>8.3 Kết luận</w:t>
       </w:r>
-      <w:bookmarkEnd w:id="43"/>
+      <w:bookmarkEnd w:id="44"/>
     </w:p>
     <w:p>
       <w:pPr>
@@ -29251,11 +31156,11 @@
       <w:pPr>
         <w:pStyle w:val="3"/>
       </w:pPr>
-      <w:bookmarkStart w:id="44" w:name="_Toc438"/>
+      <w:bookmarkStart w:id="45" w:name="_Toc5589"/>
       <w:r>
         <w:t>8.4 Tài liệu tham khảo</w:t>
       </w:r>
-      <w:bookmarkEnd w:id="44"/>
+      <w:bookmarkEnd w:id="45"/>
     </w:p>
     <w:p>
       <w:pPr>
@@ -29366,21 +31271,21 @@
       <w:pPr>
         <w:pStyle w:val="2"/>
       </w:pPr>
-      <w:bookmarkStart w:id="45" w:name="_Toc19573"/>
+      <w:bookmarkStart w:id="46" w:name="_Toc13754"/>
       <w:r>
         <w:t>Phụ lục</w:t>
       </w:r>
-      <w:bookmarkEnd w:id="45"/>
+      <w:bookmarkEnd w:id="46"/>
     </w:p>
     <w:p>
       <w:pPr>
         <w:pStyle w:val="3"/>
       </w:pPr>
-      <w:bookmarkStart w:id="46" w:name="_Toc3999"/>
+      <w:bookmarkStart w:id="47" w:name="_Toc27330"/>
       <w:r>
         <w:t>A. Hướng dẫn tái lập</w:t>
       </w:r>
-      <w:bookmarkEnd w:id="46"/>
+      <w:bookmarkEnd w:id="47"/>
     </w:p>
     <w:p>
       <w:pPr>
@@ -29451,11 +31356,11 @@
       <w:pPr>
         <w:pStyle w:val="3"/>
       </w:pPr>
-      <w:bookmarkStart w:id="47" w:name="_Toc6943"/>
+      <w:bookmarkStart w:id="48" w:name="_Toc28019"/>
       <w:r>
         <w:t>B. Kiểm thử</w:t>
       </w:r>
-      <w:bookmarkEnd w:id="47"/>
+      <w:bookmarkEnd w:id="48"/>
     </w:p>
     <w:p>
       <w:pPr>
@@ -29473,11 +31378,11 @@
       <w:pPr>
         <w:pStyle w:val="3"/>
       </w:pPr>
-      <w:bookmarkStart w:id="48" w:name="_Toc31766"/>
+      <w:bookmarkStart w:id="49" w:name="_Toc8241"/>
       <w:r>
         <w:t>C. Cấu trúc kết quả</w:t>
       </w:r>
-      <w:bookmarkEnd w:id="48"/>
+      <w:bookmarkEnd w:id="49"/>
     </w:p>
     <w:p>
       <w:pPr>
@@ -29826,7 +31731,7 @@
     <w:lsdException w:uiPriority="99" w:name="Normal Indent"/>
     <w:lsdException w:uiPriority="99" w:name="footnote text"/>
     <w:lsdException w:uiPriority="99" w:name="annotation text"/>
-    <w:lsdException w:qFormat="1" w:uiPriority="99" w:semiHidden="0" w:name="header"/>
+    <w:lsdException w:uiPriority="99" w:semiHidden="0" w:name="header"/>
     <w:lsdException w:uiPriority="99" w:semiHidden="0" w:name="footer"/>
     <w:lsdException w:uiPriority="99" w:name="index heading"/>
     <w:lsdException w:qFormat="1" w:uiPriority="35" w:name="caption"/>
@@ -29840,32 +31745,32 @@
     <w:lsdException w:uiPriority="99" w:name="endnote reference"/>
     <w:lsdException w:uiPriority="99" w:name="endnote text"/>
     <w:lsdException w:uiPriority="99" w:name="table of authorities"/>
-    <w:lsdException w:qFormat="1" w:uiPriority="99" w:semiHidden="0" w:name="macro"/>
+    <w:lsdException w:uiPriority="99" w:semiHidden="0" w:name="macro"/>
     <w:lsdException w:uiPriority="99" w:name="toa heading"/>
-    <w:lsdException w:qFormat="1" w:uiPriority="99" w:semiHidden="0" w:name="List"/>
-    <w:lsdException w:qFormat="1" w:uiPriority="99" w:semiHidden="0" w:name="List Bullet"/>
-    <w:lsdException w:qFormat="1" w:uiPriority="99" w:semiHidden="0" w:name="List Number"/>
-    <w:lsdException w:qFormat="1" w:uiPriority="99" w:semiHidden="0" w:name="List 2"/>
-    <w:lsdException w:qFormat="1" w:uiPriority="99" w:semiHidden="0" w:name="List 3"/>
+    <w:lsdException w:uiPriority="99" w:semiHidden="0" w:name="List"/>
+    <w:lsdException w:uiPriority="99" w:semiHidden="0" w:name="List Bullet"/>
+    <w:lsdException w:uiPriority="99" w:semiHidden="0" w:name="List Number"/>
+    <w:lsdException w:uiPriority="99" w:semiHidden="0" w:name="List 2"/>
+    <w:lsdException w:uiPriority="99" w:semiHidden="0" w:name="List 3"/>
     <w:lsdException w:uiPriority="99" w:name="List 4"/>
     <w:lsdException w:uiPriority="99" w:name="List 5"/>
-    <w:lsdException w:qFormat="1" w:uiPriority="99" w:semiHidden="0" w:name="List Bullet 2"/>
-    <w:lsdException w:qFormat="1" w:uiPriority="99" w:semiHidden="0" w:name="List Bullet 3"/>
+    <w:lsdException w:uiPriority="99" w:semiHidden="0" w:name="List Bullet 2"/>
+    <w:lsdException w:uiPriority="99" w:semiHidden="0" w:name="List Bullet 3"/>
     <w:lsdException w:uiPriority="99" w:name="List Bullet 4"/>
     <w:lsdException w:uiPriority="99" w:name="List Bullet 5"/>
-    <w:lsdException w:qFormat="1" w:uiPriority="99" w:semiHidden="0" w:name="List Number 2"/>
-    <w:lsdException w:qFormat="1" w:uiPriority="99" w:semiHidden="0" w:name="List Number 3"/>
+    <w:lsdException w:uiPriority="99" w:semiHidden="0" w:name="List Number 2"/>
+    <w:lsdException w:uiPriority="99" w:semiHidden="0" w:name="List Number 3"/>
     <w:lsdException w:uiPriority="99" w:name="List Number 4"/>
     <w:lsdException w:uiPriority="99" w:name="List Number 5"/>
     <w:lsdException w:qFormat="1" w:unhideWhenUsed="0" w:uiPriority="10" w:semiHidden="0" w:name="Title"/>
     <w:lsdException w:uiPriority="99" w:name="Closing"/>
     <w:lsdException w:uiPriority="99" w:name="Signature"/>
     <w:lsdException w:uiPriority="1" w:name="Default Paragraph Font"/>
-    <w:lsdException w:qFormat="1" w:uiPriority="99" w:semiHidden="0" w:name="Body Text"/>
+    <w:lsdException w:uiPriority="99" w:semiHidden="0" w:name="Body Text"/>
     <w:lsdException w:uiPriority="99" w:name="Body Text Indent"/>
-    <w:lsdException w:qFormat="1" w:uiPriority="99" w:semiHidden="0" w:name="List Continue"/>
-    <w:lsdException w:qFormat="1" w:uiPriority="99" w:semiHidden="0" w:name="List Continue 2"/>
-    <w:lsdException w:qFormat="1" w:uiPriority="99" w:semiHidden="0" w:name="List Continue 3"/>
+    <w:lsdException w:uiPriority="99" w:semiHidden="0" w:name="List Continue"/>
+    <w:lsdException w:uiPriority="99" w:semiHidden="0" w:name="List Continue 2"/>
+    <w:lsdException w:uiPriority="99" w:semiHidden="0" w:name="List Continue 3"/>
     <w:lsdException w:uiPriority="99" w:name="List Continue 4"/>
     <w:lsdException w:uiPriority="99" w:name="List Continue 5"/>
     <w:lsdException w:uiPriority="99" w:name="Message Header"/>
@@ -29875,8 +31780,8 @@
     <w:lsdException w:uiPriority="99" w:name="Body Text First Indent"/>
     <w:lsdException w:uiPriority="99" w:name="Body Text First Indent 2"/>
     <w:lsdException w:uiPriority="99" w:name="Note Heading"/>
-    <w:lsdException w:qFormat="1" w:uiPriority="99" w:semiHidden="0" w:name="Body Text 2"/>
-    <w:lsdException w:qFormat="1" w:uiPriority="99" w:semiHidden="0" w:name="Body Text 3"/>
+    <w:lsdException w:uiPriority="99" w:semiHidden="0" w:name="Body Text 2"/>
+    <w:lsdException w:uiPriority="99" w:semiHidden="0" w:name="Body Text 3"/>
     <w:lsdException w:uiPriority="99" w:name="Body Text Indent 2"/>
     <w:lsdException w:uiPriority="99" w:name="Body Text Indent 3"/>
     <w:lsdException w:uiPriority="99" w:name="Block Text"/>
@@ -29898,7 +31803,7 @@
     <w:lsdException w:uiPriority="99" w:name="HTML Sample"/>
     <w:lsdException w:uiPriority="99" w:name="HTML Typewriter"/>
     <w:lsdException w:uiPriority="99" w:name="HTML Variable"/>
-    <w:lsdException w:qFormat="1" w:uiPriority="99" w:name="Normal Table"/>
+    <w:lsdException w:uiPriority="99" w:name="Normal Table"/>
     <w:lsdException w:uiPriority="99" w:name="annotation subject"/>
     <w:lsdException w:uiPriority="99" w:name="Table Simple 1"/>
     <w:lsdException w:uiPriority="99" w:name="Table Simple 2"/>
@@ -29943,109 +31848,109 @@
     <w:lsdException w:uiPriority="99" w:name="Table Web 2"/>
     <w:lsdException w:uiPriority="99" w:name="Table Web 3"/>
     <w:lsdException w:uiPriority="99" w:name="Balloon Text"/>
-    <w:lsdException w:qFormat="1" w:unhideWhenUsed="0" w:uiPriority="59" w:semiHidden="0" w:name="Table Grid"/>
+    <w:lsdException w:unhideWhenUsed="0" w:uiPriority="59" w:semiHidden="0" w:name="Table Grid"/>
     <w:lsdException w:uiPriority="99" w:name="Table Theme"/>
     <w:lsdException w:qFormat="1" w:unhideWhenUsed="0" w:uiPriority="1" w:semiHidden="0" w:name="No Spacing"/>
     <w:lsdException w:qFormat="1" w:unhideWhenUsed="0" w:uiPriority="60" w:semiHidden="0" w:name="Light Shading"/>
-    <w:lsdException w:qFormat="1" w:unhideWhenUsed="0" w:uiPriority="61" w:semiHidden="0" w:name="Light List"/>
-    <w:lsdException w:qFormat="1" w:unhideWhenUsed="0" w:uiPriority="62" w:semiHidden="0" w:name="Light Grid"/>
-    <w:lsdException w:qFormat="1" w:unhideWhenUsed="0" w:uiPriority="63" w:semiHidden="0" w:name="Medium Shading 1"/>
+    <w:lsdException w:unhideWhenUsed="0" w:uiPriority="61" w:semiHidden="0" w:name="Light List"/>
+    <w:lsdException w:unhideWhenUsed="0" w:uiPriority="62" w:semiHidden="0" w:name="Light Grid"/>
+    <w:lsdException w:unhideWhenUsed="0" w:uiPriority="63" w:semiHidden="0" w:name="Medium Shading 1"/>
     <w:lsdException w:unhideWhenUsed="0" w:uiPriority="64" w:semiHidden="0" w:name="Medium Shading 2"/>
-    <w:lsdException w:qFormat="1" w:unhideWhenUsed="0" w:uiPriority="65" w:semiHidden="0" w:name="Medium List 1"/>
+    <w:lsdException w:unhideWhenUsed="0" w:uiPriority="65" w:semiHidden="0" w:name="Medium List 1"/>
     <w:lsdException w:unhideWhenUsed="0" w:uiPriority="66" w:semiHidden="0" w:name="Medium List 2"/>
-    <w:lsdException w:qFormat="1" w:unhideWhenUsed="0" w:uiPriority="67" w:semiHidden="0" w:name="Medium Grid 1"/>
+    <w:lsdException w:unhideWhenUsed="0" w:uiPriority="67" w:semiHidden="0" w:name="Medium Grid 1"/>
     <w:lsdException w:unhideWhenUsed="0" w:uiPriority="68" w:semiHidden="0" w:name="Medium Grid 2"/>
     <w:lsdException w:unhideWhenUsed="0" w:uiPriority="69" w:semiHidden="0" w:name="Medium Grid 3"/>
     <w:lsdException w:unhideWhenUsed="0" w:uiPriority="70" w:semiHidden="0" w:name="Dark List"/>
     <w:lsdException w:unhideWhenUsed="0" w:uiPriority="71" w:semiHidden="0" w:name="Colorful Shading"/>
     <w:lsdException w:unhideWhenUsed="0" w:uiPriority="72" w:semiHidden="0" w:name="Colorful List"/>
     <w:lsdException w:unhideWhenUsed="0" w:uiPriority="73" w:semiHidden="0" w:name="Colorful Grid"/>
-    <w:lsdException w:qFormat="1" w:unhideWhenUsed="0" w:uiPriority="60" w:semiHidden="0" w:name="Light Shading Accent 1"/>
-    <w:lsdException w:qFormat="1" w:unhideWhenUsed="0" w:uiPriority="61" w:semiHidden="0" w:name="Light List Accent 1"/>
-    <w:lsdException w:qFormat="1" w:unhideWhenUsed="0" w:uiPriority="62" w:semiHidden="0" w:name="Light Grid Accent 1"/>
-    <w:lsdException w:qFormat="1" w:unhideWhenUsed="0" w:uiPriority="63" w:semiHidden="0" w:name="Medium Shading 1 Accent 1"/>
+    <w:lsdException w:unhideWhenUsed="0" w:uiPriority="60" w:semiHidden="0" w:name="Light Shading Accent 1"/>
+    <w:lsdException w:unhideWhenUsed="0" w:uiPriority="61" w:semiHidden="0" w:name="Light List Accent 1"/>
+    <w:lsdException w:unhideWhenUsed="0" w:uiPriority="62" w:semiHidden="0" w:name="Light Grid Accent 1"/>
+    <w:lsdException w:unhideWhenUsed="0" w:uiPriority="63" w:semiHidden="0" w:name="Medium Shading 1 Accent 1"/>
     <w:lsdException w:unhideWhenUsed="0" w:uiPriority="64" w:semiHidden="0" w:name="Medium Shading 2 Accent 1"/>
     <w:lsdException w:unhideWhenUsed="0" w:uiPriority="65" w:semiHidden="0" w:name="Medium List 1 Accent 1"/>
     <w:lsdException w:qFormat="1" w:unhideWhenUsed="0" w:uiPriority="34" w:semiHidden="0" w:name="List Paragraph"/>
     <w:lsdException w:qFormat="1" w:unhideWhenUsed="0" w:uiPriority="29" w:semiHidden="0" w:name="Quote"/>
     <w:lsdException w:qFormat="1" w:unhideWhenUsed="0" w:uiPriority="30" w:semiHidden="0" w:name="Intense Quote"/>
-    <w:lsdException w:qFormat="1" w:unhideWhenUsed="0" w:uiPriority="66" w:semiHidden="0" w:name="Medium List 2 Accent 1"/>
+    <w:lsdException w:unhideWhenUsed="0" w:uiPriority="66" w:semiHidden="0" w:name="Medium List 2 Accent 1"/>
     <w:lsdException w:unhideWhenUsed="0" w:uiPriority="67" w:semiHidden="0" w:name="Medium Grid 1 Accent 1"/>
-    <w:lsdException w:qFormat="1" w:unhideWhenUsed="0" w:uiPriority="68" w:semiHidden="0" w:name="Medium Grid 2 Accent 1"/>
+    <w:lsdException w:unhideWhenUsed="0" w:uiPriority="68" w:semiHidden="0" w:name="Medium Grid 2 Accent 1"/>
     <w:lsdException w:unhideWhenUsed="0" w:uiPriority="69" w:semiHidden="0" w:name="Medium Grid 3 Accent 1"/>
     <w:lsdException w:unhideWhenUsed="0" w:uiPriority="70" w:semiHidden="0" w:name="Dark List Accent 1"/>
     <w:lsdException w:unhideWhenUsed="0" w:uiPriority="71" w:semiHidden="0" w:name="Colorful Shading Accent 1"/>
     <w:lsdException w:unhideWhenUsed="0" w:uiPriority="72" w:semiHidden="0" w:name="Colorful List Accent 1"/>
-    <w:lsdException w:qFormat="1" w:unhideWhenUsed="0" w:uiPriority="73" w:semiHidden="0" w:name="Colorful Grid Accent 1"/>
-    <w:lsdException w:qFormat="1" w:unhideWhenUsed="0" w:uiPriority="60" w:semiHidden="0" w:name="Light Shading Accent 2"/>
-    <w:lsdException w:qFormat="1" w:unhideWhenUsed="0" w:uiPriority="61" w:semiHidden="0" w:name="Light List Accent 2"/>
-    <w:lsdException w:qFormat="1" w:unhideWhenUsed="0" w:uiPriority="62" w:semiHidden="0" w:name="Light Grid Accent 2"/>
-    <w:lsdException w:qFormat="1" w:unhideWhenUsed="0" w:uiPriority="63" w:semiHidden="0" w:name="Medium Shading 1 Accent 2"/>
-    <w:lsdException w:qFormat="1" w:unhideWhenUsed="0" w:uiPriority="64" w:semiHidden="0" w:name="Medium Shading 2 Accent 2"/>
+    <w:lsdException w:unhideWhenUsed="0" w:uiPriority="73" w:semiHidden="0" w:name="Colorful Grid Accent 1"/>
+    <w:lsdException w:unhideWhenUsed="0" w:uiPriority="60" w:semiHidden="0" w:name="Light Shading Accent 2"/>
+    <w:lsdException w:unhideWhenUsed="0" w:uiPriority="61" w:semiHidden="0" w:name="Light List Accent 2"/>
+    <w:lsdException w:unhideWhenUsed="0" w:uiPriority="62" w:semiHidden="0" w:name="Light Grid Accent 2"/>
+    <w:lsdException w:unhideWhenUsed="0" w:uiPriority="63" w:semiHidden="0" w:name="Medium Shading 1 Accent 2"/>
+    <w:lsdException w:unhideWhenUsed="0" w:uiPriority="64" w:semiHidden="0" w:name="Medium Shading 2 Accent 2"/>
     <w:lsdException w:unhideWhenUsed="0" w:uiPriority="65" w:semiHidden="0" w:name="Medium List 1 Accent 2"/>
-    <w:lsdException w:qFormat="1" w:unhideWhenUsed="0" w:uiPriority="66" w:semiHidden="0" w:name="Medium List 2 Accent 2"/>
-    <w:lsdException w:qFormat="1" w:unhideWhenUsed="0" w:uiPriority="67" w:semiHidden="0" w:name="Medium Grid 1 Accent 2"/>
+    <w:lsdException w:unhideWhenUsed="0" w:uiPriority="66" w:semiHidden="0" w:name="Medium List 2 Accent 2"/>
+    <w:lsdException w:unhideWhenUsed="0" w:uiPriority="67" w:semiHidden="0" w:name="Medium Grid 1 Accent 2"/>
     <w:lsdException w:unhideWhenUsed="0" w:uiPriority="68" w:semiHidden="0" w:name="Medium Grid 2 Accent 2"/>
     <w:lsdException w:unhideWhenUsed="0" w:uiPriority="69" w:semiHidden="0" w:name="Medium Grid 3 Accent 2"/>
     <w:lsdException w:unhideWhenUsed="0" w:uiPriority="70" w:semiHidden="0" w:name="Dark List Accent 2"/>
-    <w:lsdException w:qFormat="1" w:unhideWhenUsed="0" w:uiPriority="71" w:semiHidden="0" w:name="Colorful Shading Accent 2"/>
-    <w:lsdException w:qFormat="1" w:unhideWhenUsed="0" w:uiPriority="72" w:semiHidden="0" w:name="Colorful List Accent 2"/>
+    <w:lsdException w:unhideWhenUsed="0" w:uiPriority="71" w:semiHidden="0" w:name="Colorful Shading Accent 2"/>
+    <w:lsdException w:unhideWhenUsed="0" w:uiPriority="72" w:semiHidden="0" w:name="Colorful List Accent 2"/>
     <w:lsdException w:unhideWhenUsed="0" w:uiPriority="73" w:semiHidden="0" w:name="Colorful Grid Accent 2"/>
-    <w:lsdException w:qFormat="1" w:unhideWhenUsed="0" w:uiPriority="60" w:semiHidden="0" w:name="Light Shading Accent 3"/>
-    <w:lsdException w:qFormat="1" w:unhideWhenUsed="0" w:uiPriority="61" w:semiHidden="0" w:name="Light List Accent 3"/>
-    <w:lsdException w:qFormat="1" w:unhideWhenUsed="0" w:uiPriority="62" w:semiHidden="0" w:name="Light Grid Accent 3"/>
+    <w:lsdException w:unhideWhenUsed="0" w:uiPriority="60" w:semiHidden="0" w:name="Light Shading Accent 3"/>
+    <w:lsdException w:unhideWhenUsed="0" w:uiPriority="61" w:semiHidden="0" w:name="Light List Accent 3"/>
+    <w:lsdException w:unhideWhenUsed="0" w:uiPriority="62" w:semiHidden="0" w:name="Light Grid Accent 3"/>
     <w:lsdException w:unhideWhenUsed="0" w:uiPriority="63" w:semiHidden="0" w:name="Medium Shading 1 Accent 3"/>
-    <w:lsdException w:qFormat="1" w:unhideWhenUsed="0" w:uiPriority="64" w:semiHidden="0" w:name="Medium Shading 2 Accent 3"/>
+    <w:lsdException w:unhideWhenUsed="0" w:uiPriority="64" w:semiHidden="0" w:name="Medium Shading 2 Accent 3"/>
     <w:lsdException w:unhideWhenUsed="0" w:uiPriority="65" w:semiHidden="0" w:name="Medium List 1 Accent 3"/>
-    <w:lsdException w:unhideWhenUsed="0" w:uiPriority="66" w:semiHidden="0" w:name="Medium List 2 Accent 3"/>
+    <w:lsdException w:qFormat="1" w:unhideWhenUsed="0" w:uiPriority="66" w:semiHidden="0" w:name="Medium List 2 Accent 3"/>
     <w:lsdException w:unhideWhenUsed="0" w:uiPriority="67" w:semiHidden="0" w:name="Medium Grid 1 Accent 3"/>
-    <w:lsdException w:qFormat="1" w:unhideWhenUsed="0" w:uiPriority="68" w:semiHidden="0" w:name="Medium Grid 2 Accent 3"/>
-    <w:lsdException w:qFormat="1" w:unhideWhenUsed="0" w:uiPriority="69" w:semiHidden="0" w:name="Medium Grid 3 Accent 3"/>
+    <w:lsdException w:unhideWhenUsed="0" w:uiPriority="68" w:semiHidden="0" w:name="Medium Grid 2 Accent 3"/>
+    <w:lsdException w:unhideWhenUsed="0" w:uiPriority="69" w:semiHidden="0" w:name="Medium Grid 3 Accent 3"/>
     <w:lsdException w:unhideWhenUsed="0" w:uiPriority="70" w:semiHidden="0" w:name="Dark List Accent 3"/>
     <w:lsdException w:unhideWhenUsed="0" w:uiPriority="71" w:semiHidden="0" w:name="Colorful Shading Accent 3"/>
     <w:lsdException w:unhideWhenUsed="0" w:uiPriority="72" w:semiHidden="0" w:name="Colorful List Accent 3"/>
     <w:lsdException w:unhideWhenUsed="0" w:uiPriority="73" w:semiHidden="0" w:name="Colorful Grid Accent 3"/>
-    <w:lsdException w:qFormat="1" w:unhideWhenUsed="0" w:uiPriority="60" w:semiHidden="0" w:name="Light Shading Accent 4"/>
-    <w:lsdException w:qFormat="1" w:unhideWhenUsed="0" w:uiPriority="61" w:semiHidden="0" w:name="Light List Accent 4"/>
-    <w:lsdException w:qFormat="1" w:unhideWhenUsed="0" w:uiPriority="62" w:semiHidden="0" w:name="Light Grid Accent 4"/>
-    <w:lsdException w:qFormat="1" w:unhideWhenUsed="0" w:uiPriority="63" w:semiHidden="0" w:name="Medium Shading 1 Accent 4"/>
-    <w:lsdException w:qFormat="1" w:unhideWhenUsed="0" w:uiPriority="64" w:semiHidden="0" w:name="Medium Shading 2 Accent 4"/>
+    <w:lsdException w:unhideWhenUsed="0" w:uiPriority="60" w:semiHidden="0" w:name="Light Shading Accent 4"/>
+    <w:lsdException w:unhideWhenUsed="0" w:uiPriority="61" w:semiHidden="0" w:name="Light List Accent 4"/>
+    <w:lsdException w:unhideWhenUsed="0" w:uiPriority="62" w:semiHidden="0" w:name="Light Grid Accent 4"/>
+    <w:lsdException w:unhideWhenUsed="0" w:uiPriority="63" w:semiHidden="0" w:name="Medium Shading 1 Accent 4"/>
+    <w:lsdException w:unhideWhenUsed="0" w:uiPriority="64" w:semiHidden="0" w:name="Medium Shading 2 Accent 4"/>
     <w:lsdException w:unhideWhenUsed="0" w:uiPriority="65" w:semiHidden="0" w:name="Medium List 1 Accent 4"/>
     <w:lsdException w:unhideWhenUsed="0" w:uiPriority="66" w:semiHidden="0" w:name="Medium List 2 Accent 4"/>
-    <w:lsdException w:qFormat="1" w:unhideWhenUsed="0" w:uiPriority="67" w:semiHidden="0" w:name="Medium Grid 1 Accent 4"/>
-    <w:lsdException w:qFormat="1" w:unhideWhenUsed="0" w:uiPriority="68" w:semiHidden="0" w:name="Medium Grid 2 Accent 4"/>
-    <w:lsdException w:qFormat="1" w:unhideWhenUsed="0" w:uiPriority="69" w:semiHidden="0" w:name="Medium Grid 3 Accent 4"/>
+    <w:lsdException w:unhideWhenUsed="0" w:uiPriority="67" w:semiHidden="0" w:name="Medium Grid 1 Accent 4"/>
+    <w:lsdException w:unhideWhenUsed="0" w:uiPriority="68" w:semiHidden="0" w:name="Medium Grid 2 Accent 4"/>
+    <w:lsdException w:unhideWhenUsed="0" w:uiPriority="69" w:semiHidden="0" w:name="Medium Grid 3 Accent 4"/>
     <w:lsdException w:unhideWhenUsed="0" w:uiPriority="70" w:semiHidden="0" w:name="Dark List Accent 4"/>
-    <w:lsdException w:qFormat="1" w:unhideWhenUsed="0" w:uiPriority="71" w:semiHidden="0" w:name="Colorful Shading Accent 4"/>
+    <w:lsdException w:unhideWhenUsed="0" w:uiPriority="71" w:semiHidden="0" w:name="Colorful Shading Accent 4"/>
     <w:lsdException w:unhideWhenUsed="0" w:uiPriority="72" w:semiHidden="0" w:name="Colorful List Accent 4"/>
     <w:lsdException w:unhideWhenUsed="0" w:uiPriority="73" w:semiHidden="0" w:name="Colorful Grid Accent 4"/>
-    <w:lsdException w:qFormat="1" w:unhideWhenUsed="0" w:uiPriority="60" w:semiHidden="0" w:name="Light Shading Accent 5"/>
-    <w:lsdException w:qFormat="1" w:unhideWhenUsed="0" w:uiPriority="61" w:semiHidden="0" w:name="Light List Accent 5"/>
-    <w:lsdException w:qFormat="1" w:unhideWhenUsed="0" w:uiPriority="62" w:semiHidden="0" w:name="Light Grid Accent 5"/>
+    <w:lsdException w:unhideWhenUsed="0" w:uiPriority="60" w:semiHidden="0" w:name="Light Shading Accent 5"/>
+    <w:lsdException w:unhideWhenUsed="0" w:uiPriority="61" w:semiHidden="0" w:name="Light List Accent 5"/>
+    <w:lsdException w:unhideWhenUsed="0" w:uiPriority="62" w:semiHidden="0" w:name="Light Grid Accent 5"/>
     <w:lsdException w:unhideWhenUsed="0" w:uiPriority="63" w:semiHidden="0" w:name="Medium Shading 1 Accent 5"/>
     <w:lsdException w:unhideWhenUsed="0" w:uiPriority="64" w:semiHidden="0" w:name="Medium Shading 2 Accent 5"/>
-    <w:lsdException w:qFormat="1" w:unhideWhenUsed="0" w:uiPriority="65" w:semiHidden="0" w:name="Medium List 1 Accent 5"/>
+    <w:lsdException w:unhideWhenUsed="0" w:uiPriority="65" w:semiHidden="0" w:name="Medium List 1 Accent 5"/>
     <w:lsdException w:unhideWhenUsed="0" w:uiPriority="66" w:semiHidden="0" w:name="Medium List 2 Accent 5"/>
     <w:lsdException w:unhideWhenUsed="0" w:uiPriority="67" w:semiHidden="0" w:name="Medium Grid 1 Accent 5"/>
-    <w:lsdException w:qFormat="1" w:unhideWhenUsed="0" w:uiPriority="68" w:semiHidden="0" w:name="Medium Grid 2 Accent 5"/>
+    <w:lsdException w:unhideWhenUsed="0" w:uiPriority="68" w:semiHidden="0" w:name="Medium Grid 2 Accent 5"/>
     <w:lsdException w:unhideWhenUsed="0" w:uiPriority="69" w:semiHidden="0" w:name="Medium Grid 3 Accent 5"/>
     <w:lsdException w:unhideWhenUsed="0" w:uiPriority="70" w:semiHidden="0" w:name="Dark List Accent 5"/>
     <w:lsdException w:unhideWhenUsed="0" w:uiPriority="71" w:semiHidden="0" w:name="Colorful Shading Accent 5"/>
     <w:lsdException w:unhideWhenUsed="0" w:uiPriority="72" w:semiHidden="0" w:name="Colorful List Accent 5"/>
-    <w:lsdException w:qFormat="1" w:unhideWhenUsed="0" w:uiPriority="73" w:semiHidden="0" w:name="Colorful Grid Accent 5"/>
-    <w:lsdException w:qFormat="1" w:unhideWhenUsed="0" w:uiPriority="60" w:semiHidden="0" w:name="Light Shading Accent 6"/>
-    <w:lsdException w:qFormat="1" w:unhideWhenUsed="0" w:uiPriority="61" w:semiHidden="0" w:name="Light List Accent 6"/>
-    <w:lsdException w:qFormat="1" w:unhideWhenUsed="0" w:uiPriority="62" w:semiHidden="0" w:name="Light Grid Accent 6"/>
+    <w:lsdException w:unhideWhenUsed="0" w:uiPriority="73" w:semiHidden="0" w:name="Colorful Grid Accent 5"/>
+    <w:lsdException w:unhideWhenUsed="0" w:uiPriority="60" w:semiHidden="0" w:name="Light Shading Accent 6"/>
+    <w:lsdException w:unhideWhenUsed="0" w:uiPriority="61" w:semiHidden="0" w:name="Light List Accent 6"/>
+    <w:lsdException w:unhideWhenUsed="0" w:uiPriority="62" w:semiHidden="0" w:name="Light Grid Accent 6"/>
     <w:lsdException w:unhideWhenUsed="0" w:uiPriority="63" w:semiHidden="0" w:name="Medium Shading 1 Accent 6"/>
     <w:lsdException w:unhideWhenUsed="0" w:uiPriority="64" w:semiHidden="0" w:name="Medium Shading 2 Accent 6"/>
     <w:lsdException w:unhideWhenUsed="0" w:uiPriority="65" w:semiHidden="0" w:name="Medium List 1 Accent 6"/>
-    <w:lsdException w:qFormat="1" w:unhideWhenUsed="0" w:uiPriority="66" w:semiHidden="0" w:name="Medium List 2 Accent 6"/>
+    <w:lsdException w:unhideWhenUsed="0" w:uiPriority="66" w:semiHidden="0" w:name="Medium List 2 Accent 6"/>
     <w:lsdException w:unhideWhenUsed="0" w:uiPriority="67" w:semiHidden="0" w:name="Medium Grid 1 Accent 6"/>
     <w:lsdException w:unhideWhenUsed="0" w:uiPriority="68" w:semiHidden="0" w:name="Medium Grid 2 Accent 6"/>
     <w:lsdException w:unhideWhenUsed="0" w:uiPriority="69" w:semiHidden="0" w:name="Medium Grid 3 Accent 6"/>
-    <w:lsdException w:qFormat="1" w:unhideWhenUsed="0" w:uiPriority="70" w:semiHidden="0" w:name="Dark List Accent 6"/>
+    <w:lsdException w:unhideWhenUsed="0" w:uiPriority="70" w:semiHidden="0" w:name="Dark List Accent 6"/>
     <w:lsdException w:unhideWhenUsed="0" w:uiPriority="71" w:semiHidden="0" w:name="Colorful Shading Accent 6"/>
-    <w:lsdException w:qFormat="1" w:unhideWhenUsed="0" w:uiPriority="72" w:semiHidden="0" w:name="Colorful List Accent 6"/>
+    <w:lsdException w:unhideWhenUsed="0" w:uiPriority="72" w:semiHidden="0" w:name="Colorful List Accent 6"/>
     <w:lsdException w:unhideWhenUsed="0" w:uiPriority="73" w:semiHidden="0" w:name="Colorful Grid Accent 6"/>
   </w:latentStyles>
   <w:style w:type="paragraph" w:default="1" w:styleId="1">
@@ -30299,7 +32204,6 @@
     <w:name w:val="Normal Table"/>
     <w:semiHidden/>
     <w:unhideWhenUsed/>
-    <w:qFormat/>
     <w:uiPriority w:val="99"/>
     <w:tblPr>
       <w:tblCellMar>
@@ -30315,7 +32219,6 @@
     <w:basedOn w:val="1"/>
     <w:link w:val="147"/>
     <w:unhideWhenUsed/>
-    <w:qFormat/>
     <w:uiPriority w:val="99"/>
     <w:pPr>
       <w:spacing w:after="120"/>
@@ -30326,7 +32229,6 @@
     <w:basedOn w:val="1"/>
     <w:link w:val="148"/>
     <w:unhideWhenUsed/>
-    <w:qFormat/>
     <w:uiPriority w:val="99"/>
     <w:pPr>
       <w:spacing w:after="120" w:line="480" w:lineRule="auto"/>
@@ -30337,7 +32239,6 @@
     <w:basedOn w:val="1"/>
     <w:link w:val="149"/>
     <w:unhideWhenUsed/>
-    <w:qFormat/>
     <w:uiPriority w:val="99"/>
     <w:pPr>
       <w:spacing w:after="120"/>
@@ -30400,7 +32301,6 @@
     <w:basedOn w:val="1"/>
     <w:link w:val="138"/>
     <w:unhideWhenUsed/>
-    <w:qFormat/>
     <w:uiPriority w:val="99"/>
     <w:pPr>
       <w:tabs>
@@ -30414,7 +32314,6 @@
     <w:name w:val="List"/>
     <w:basedOn w:val="1"/>
     <w:unhideWhenUsed/>
-    <w:qFormat/>
     <w:uiPriority w:val="99"/>
     <w:pPr>
       <w:ind w:left="360" w:hanging="360"/>
@@ -30425,7 +32324,6 @@
     <w:name w:val="List 2"/>
     <w:basedOn w:val="1"/>
     <w:unhideWhenUsed/>
-    <w:qFormat/>
     <w:uiPriority w:val="99"/>
     <w:pPr>
       <w:ind w:left="720" w:hanging="360"/>
@@ -30436,7 +32334,6 @@
     <w:name w:val="List 3"/>
     <w:basedOn w:val="1"/>
     <w:unhideWhenUsed/>
-    <w:qFormat/>
     <w:uiPriority w:val="99"/>
     <w:pPr>
       <w:ind w:left="1080" w:hanging="360"/>
@@ -30447,7 +32344,6 @@
     <w:name w:val="List Bullet"/>
     <w:basedOn w:val="1"/>
     <w:unhideWhenUsed/>
-    <w:qFormat/>
     <w:uiPriority w:val="99"/>
     <w:pPr>
       <w:numPr>
@@ -30461,7 +32357,6 @@
     <w:name w:val="List Bullet 2"/>
     <w:basedOn w:val="1"/>
     <w:unhideWhenUsed/>
-    <w:qFormat/>
     <w:uiPriority w:val="99"/>
     <w:pPr>
       <w:numPr>
@@ -30475,7 +32370,6 @@
     <w:name w:val="List Bullet 3"/>
     <w:basedOn w:val="1"/>
     <w:unhideWhenUsed/>
-    <w:qFormat/>
     <w:uiPriority w:val="99"/>
     <w:pPr>
       <w:numPr>
@@ -30489,7 +32383,6 @@
     <w:name w:val="List Continue"/>
     <w:basedOn w:val="1"/>
     <w:unhideWhenUsed/>
-    <w:qFormat/>
     <w:uiPriority w:val="99"/>
     <w:pPr>
       <w:spacing w:after="120"/>
@@ -30501,7 +32394,6 @@
     <w:name w:val="List Continue 2"/>
     <w:basedOn w:val="1"/>
     <w:unhideWhenUsed/>
-    <w:qFormat/>
     <w:uiPriority w:val="99"/>
     <w:pPr>
       <w:spacing w:after="120"/>
@@ -30513,7 +32405,6 @@
     <w:name w:val="List Continue 3"/>
     <w:basedOn w:val="1"/>
     <w:unhideWhenUsed/>
-    <w:qFormat/>
     <w:uiPriority w:val="99"/>
     <w:pPr>
       <w:spacing w:after="120"/>
@@ -30525,7 +32416,6 @@
     <w:name w:val="List Number"/>
     <w:basedOn w:val="1"/>
     <w:unhideWhenUsed/>
-    <w:qFormat/>
     <w:uiPriority w:val="99"/>
     <w:pPr>
       <w:numPr>
@@ -30539,7 +32429,6 @@
     <w:name w:val="List Number 2"/>
     <w:basedOn w:val="1"/>
     <w:unhideWhenUsed/>
-    <w:qFormat/>
     <w:uiPriority w:val="99"/>
     <w:pPr>
       <w:numPr>
@@ -30553,7 +32442,6 @@
     <w:name w:val="List Number 3"/>
     <w:basedOn w:val="1"/>
     <w:unhideWhenUsed/>
-    <w:qFormat/>
     <w:uiPriority w:val="99"/>
     <w:pPr>
       <w:numPr>
@@ -30567,7 +32455,6 @@
     <w:name w:val="macro"/>
     <w:link w:val="150"/>
     <w:unhideWhenUsed/>
-    <w:qFormat/>
     <w:uiPriority w:val="99"/>
     <w:pPr>
       <w:tabs>
@@ -30623,7 +32510,6 @@
   <w:style w:type="table" w:styleId="35">
     <w:name w:val="Table Grid"/>
     <w:basedOn w:val="12"/>
-    <w:qFormat/>
     <w:uiPriority w:val="59"/>
     <w:pPr>
       <w:spacing w:after="0" w:line="240" w:lineRule="auto"/>
@@ -30801,7 +32687,6 @@
   <w:style w:type="table" w:styleId="41">
     <w:name w:val="Light Shading Accent 1"/>
     <w:basedOn w:val="12"/>
-    <w:qFormat/>
     <w:uiPriority w:val="60"/>
     <w:pPr>
       <w:spacing w:after="0" w:line="240" w:lineRule="auto"/>
@@ -30901,7 +32786,6 @@
   <w:style w:type="table" w:styleId="42">
     <w:name w:val="Light Shading Accent 2"/>
     <w:basedOn w:val="12"/>
-    <w:qFormat/>
     <w:uiPriority w:val="60"/>
     <w:pPr>
       <w:spacing w:after="0" w:line="240" w:lineRule="auto"/>
@@ -31001,7 +32885,6 @@
   <w:style w:type="table" w:styleId="43">
     <w:name w:val="Light Shading Accent 3"/>
     <w:basedOn w:val="12"/>
-    <w:qFormat/>
     <w:uiPriority w:val="60"/>
     <w:pPr>
       <w:spacing w:after="0" w:line="240" w:lineRule="auto"/>
@@ -31101,7 +32984,6 @@
   <w:style w:type="table" w:styleId="44">
     <w:name w:val="Light Shading Accent 4"/>
     <w:basedOn w:val="12"/>
-    <w:qFormat/>
     <w:uiPriority w:val="60"/>
     <w:pPr>
       <w:spacing w:after="0" w:line="240" w:lineRule="auto"/>
@@ -31201,7 +33083,6 @@
   <w:style w:type="table" w:styleId="45">
     <w:name w:val="Light Shading Accent 5"/>
     <w:basedOn w:val="12"/>
-    <w:qFormat/>
     <w:uiPriority w:val="60"/>
     <w:pPr>
       <w:spacing w:after="0" w:line="240" w:lineRule="auto"/>
@@ -31301,7 +33182,6 @@
   <w:style w:type="table" w:styleId="46">
     <w:name w:val="Light Shading Accent 6"/>
     <w:basedOn w:val="12"/>
-    <w:qFormat/>
     <w:uiPriority w:val="60"/>
     <w:pPr>
       <w:spacing w:after="0" w:line="240" w:lineRule="auto"/>
@@ -31401,7 +33281,6 @@
   <w:style w:type="table" w:styleId="47">
     <w:name w:val="Light List"/>
     <w:basedOn w:val="12"/>
-    <w:qFormat/>
     <w:uiPriority w:val="61"/>
     <w:pPr>
       <w:spacing w:after="0" w:line="240" w:lineRule="auto"/>
@@ -31495,7 +33374,6 @@
   <w:style w:type="table" w:styleId="48">
     <w:name w:val="Light List Accent 1"/>
     <w:basedOn w:val="12"/>
-    <w:qFormat/>
     <w:uiPriority w:val="61"/>
     <w:pPr>
       <w:spacing w:after="0" w:line="240" w:lineRule="auto"/>
@@ -31589,7 +33467,6 @@
   <w:style w:type="table" w:styleId="49">
     <w:name w:val="Light List Accent 2"/>
     <w:basedOn w:val="12"/>
-    <w:qFormat/>
     <w:uiPriority w:val="61"/>
     <w:pPr>
       <w:spacing w:after="0" w:line="240" w:lineRule="auto"/>
@@ -31683,7 +33560,6 @@
   <w:style w:type="table" w:styleId="50">
     <w:name w:val="Light List Accent 3"/>
     <w:basedOn w:val="12"/>
-    <w:qFormat/>
     <w:uiPriority w:val="61"/>
     <w:pPr>
       <w:spacing w:after="0" w:line="240" w:lineRule="auto"/>
@@ -31777,7 +33653,6 @@
   <w:style w:type="table" w:styleId="51">
     <w:name w:val="Light List Accent 4"/>
     <w:basedOn w:val="12"/>
-    <w:qFormat/>
     <w:uiPriority w:val="61"/>
     <w:pPr>
       <w:spacing w:after="0" w:line="240" w:lineRule="auto"/>
@@ -31871,7 +33746,6 @@
   <w:style w:type="table" w:styleId="52">
     <w:name w:val="Light List Accent 5"/>
     <w:basedOn w:val="12"/>
-    <w:qFormat/>
     <w:uiPriority w:val="61"/>
     <w:pPr>
       <w:spacing w:after="0" w:line="240" w:lineRule="auto"/>
@@ -31965,7 +33839,6 @@
   <w:style w:type="table" w:styleId="53">
     <w:name w:val="Light List Accent 6"/>
     <w:basedOn w:val="12"/>
-    <w:qFormat/>
     <w:uiPriority w:val="61"/>
     <w:pPr>
       <w:spacing w:after="0" w:line="240" w:lineRule="auto"/>
@@ -32059,7 +33932,6 @@
   <w:style w:type="table" w:styleId="54">
     <w:name w:val="Light Grid"/>
     <w:basedOn w:val="12"/>
-    <w:qFormat/>
     <w:uiPriority w:val="62"/>
     <w:pPr>
       <w:spacing w:after="0" w:line="240" w:lineRule="auto"/>
@@ -32186,7 +34058,6 @@
   <w:style w:type="table" w:styleId="55">
     <w:name w:val="Light Grid Accent 1"/>
     <w:basedOn w:val="12"/>
-    <w:qFormat/>
     <w:uiPriority w:val="62"/>
     <w:pPr>
       <w:spacing w:after="0" w:line="240" w:lineRule="auto"/>
@@ -32313,7 +34184,6 @@
   <w:style w:type="table" w:styleId="56">
     <w:name w:val="Light Grid Accent 2"/>
     <w:basedOn w:val="12"/>
-    <w:qFormat/>
     <w:uiPriority w:val="62"/>
     <w:pPr>
       <w:spacing w:after="0" w:line="240" w:lineRule="auto"/>
@@ -32440,7 +34310,6 @@
   <w:style w:type="table" w:styleId="57">
     <w:name w:val="Light Grid Accent 3"/>
     <w:basedOn w:val="12"/>
-    <w:qFormat/>
     <w:uiPriority w:val="62"/>
     <w:pPr>
       <w:spacing w:after="0" w:line="240" w:lineRule="auto"/>
@@ -32567,7 +34436,6 @@
   <w:style w:type="table" w:styleId="58">
     <w:name w:val="Light Grid Accent 4"/>
     <w:basedOn w:val="12"/>
-    <w:qFormat/>
     <w:uiPriority w:val="62"/>
     <w:pPr>
       <w:spacing w:after="0" w:line="240" w:lineRule="auto"/>
@@ -32694,7 +34562,6 @@
   <w:style w:type="table" w:styleId="59">
     <w:name w:val="Light Grid Accent 5"/>
     <w:basedOn w:val="12"/>
-    <w:qFormat/>
     <w:uiPriority w:val="62"/>
     <w:pPr>
       <w:spacing w:after="0" w:line="240" w:lineRule="auto"/>
@@ -32821,7 +34688,6 @@
   <w:style w:type="table" w:styleId="60">
     <w:name w:val="Light Grid Accent 6"/>
     <w:basedOn w:val="12"/>
-    <w:qFormat/>
     <w:uiPriority w:val="62"/>
     <w:pPr>
       <w:spacing w:after="0" w:line="240" w:lineRule="auto"/>
@@ -32948,7 +34814,6 @@
   <w:style w:type="table" w:styleId="61">
     <w:name w:val="Medium Shading 1"/>
     <w:basedOn w:val="12"/>
-    <w:qFormat/>
     <w:uiPriority w:val="63"/>
     <w:pPr>
       <w:spacing w:after="0" w:line="240" w:lineRule="auto"/>
@@ -33056,7 +34921,6 @@
   <w:style w:type="table" w:styleId="62">
     <w:name w:val="Medium Shading 1 Accent 1"/>
     <w:basedOn w:val="12"/>
-    <w:qFormat/>
     <w:uiPriority w:val="63"/>
     <w:pPr>
       <w:spacing w:after="0" w:line="240" w:lineRule="auto"/>
@@ -33164,7 +35028,6 @@
   <w:style w:type="table" w:styleId="63">
     <w:name w:val="Medium Shading 1 Accent 2"/>
     <w:basedOn w:val="12"/>
-    <w:qFormat/>
     <w:uiPriority w:val="63"/>
     <w:pPr>
       <w:spacing w:after="0" w:line="240" w:lineRule="auto"/>
@@ -33379,7 +35242,6 @@
   <w:style w:type="table" w:styleId="65">
     <w:name w:val="Medium Shading 1 Accent 4"/>
     <w:basedOn w:val="12"/>
-    <w:qFormat/>
     <w:uiPriority w:val="63"/>
     <w:pPr>
       <w:spacing w:after="0" w:line="240" w:lineRule="auto"/>
@@ -34031,7 +35893,6 @@
   <w:style w:type="table" w:styleId="70">
     <w:name w:val="Medium Shading 2 Accent 2"/>
     <w:basedOn w:val="12"/>
-    <w:qFormat/>
     <w:uiPriority w:val="64"/>
     <w:pPr>
       <w:spacing w:after="0" w:line="240" w:lineRule="auto"/>
@@ -34197,7 +36058,6 @@
   <w:style w:type="table" w:styleId="71">
     <w:name w:val="Medium Shading 2 Accent 3"/>
     <w:basedOn w:val="12"/>
-    <w:qFormat/>
     <w:uiPriority w:val="64"/>
     <w:pPr>
       <w:spacing w:after="0" w:line="240" w:lineRule="auto"/>
@@ -34363,7 +36223,6 @@
   <w:style w:type="table" w:styleId="72">
     <w:name w:val="Medium Shading 2 Accent 4"/>
     <w:basedOn w:val="12"/>
-    <w:qFormat/>
     <w:uiPriority w:val="64"/>
     <w:pPr>
       <w:spacing w:after="0" w:line="240" w:lineRule="auto"/>
@@ -34859,7 +36718,6 @@
   <w:style w:type="table" w:styleId="75">
     <w:name w:val="Medium List 1"/>
     <w:basedOn w:val="12"/>
-    <w:qFormat/>
     <w:uiPriority w:val="65"/>
     <w:pPr>
       <w:spacing w:after="0" w:line="240" w:lineRule="auto"/>
@@ -35310,7 +37168,6 @@
   <w:style w:type="table" w:styleId="80">
     <w:name w:val="Medium List 1 Accent 5"/>
     <w:basedOn w:val="12"/>
-    <w:qFormat/>
     <w:uiPriority w:val="65"/>
     <w:pPr>
       <w:spacing w:after="0" w:line="240" w:lineRule="auto"/>
@@ -35620,7 +37477,6 @@
   <w:style w:type="table" w:styleId="83">
     <w:name w:val="Medium List 2 Accent 1"/>
     <w:basedOn w:val="12"/>
-    <w:qFormat/>
     <w:uiPriority w:val="66"/>
     <w:pPr>
       <w:spacing w:after="0" w:line="240" w:lineRule="auto"/>
@@ -35750,7 +37606,6 @@
   <w:style w:type="table" w:styleId="84">
     <w:name w:val="Medium List 2 Accent 2"/>
     <w:basedOn w:val="12"/>
-    <w:qFormat/>
     <w:uiPriority w:val="66"/>
     <w:pPr>
       <w:spacing w:after="0" w:line="240" w:lineRule="auto"/>
@@ -35880,6 +37735,7 @@
   <w:style w:type="table" w:styleId="85">
     <w:name w:val="Medium List 2 Accent 3"/>
     <w:basedOn w:val="12"/>
+    <w:qFormat/>
     <w:uiPriority w:val="66"/>
     <w:pPr>
       <w:spacing w:after="0" w:line="240" w:lineRule="auto"/>
@@ -36267,7 +38123,6 @@
   <w:style w:type="table" w:styleId="88">
     <w:name w:val="Medium List 2 Accent 6"/>
     <w:basedOn w:val="12"/>
-    <w:qFormat/>
     <w:uiPriority w:val="66"/>
     <w:pPr>
       <w:spacing w:after="0" w:line="240" w:lineRule="auto"/>
@@ -36397,7 +38252,6 @@
   <w:style w:type="table" w:styleId="89">
     <w:name w:val="Medium Grid 1"/>
     <w:basedOn w:val="12"/>
-    <w:qFormat/>
     <w:uiPriority w:val="67"/>
     <w:pPr>
       <w:spacing w:after="0" w:line="240" w:lineRule="auto"/>
@@ -36536,7 +38390,6 @@
   <w:style w:type="table" w:styleId="91">
     <w:name w:val="Medium Grid 1 Accent 2"/>
     <w:basedOn w:val="12"/>
-    <w:qFormat/>
     <w:uiPriority w:val="67"/>
     <w:pPr>
       <w:spacing w:after="0" w:line="240" w:lineRule="auto"/>
@@ -36675,7 +38528,6 @@
   <w:style w:type="table" w:styleId="93">
     <w:name w:val="Medium Grid 1 Accent 4"/>
     <w:basedOn w:val="12"/>
-    <w:qFormat/>
     <w:uiPriority w:val="67"/>
     <w:pPr>
       <w:spacing w:after="0" w:line="240" w:lineRule="auto"/>
@@ -37029,7 +38881,6 @@
   <w:style w:type="table" w:styleId="97">
     <w:name w:val="Medium Grid 2 Accent 1"/>
     <w:basedOn w:val="12"/>
-    <w:qFormat/>
     <w:uiPriority w:val="68"/>
     <w:pPr>
       <w:spacing w:after="0" w:line="240" w:lineRule="auto"/>
@@ -37322,7 +39173,6 @@
   <w:style w:type="table" w:styleId="99">
     <w:name w:val="Medium Grid 2 Accent 3"/>
     <w:basedOn w:val="12"/>
-    <w:qFormat/>
     <w:uiPriority w:val="68"/>
     <w:pPr>
       <w:spacing w:after="0" w:line="240" w:lineRule="auto"/>
@@ -37469,7 +39319,6 @@
   <w:style w:type="table" w:styleId="100">
     <w:name w:val="Medium Grid 2 Accent 4"/>
     <w:basedOn w:val="12"/>
-    <w:qFormat/>
     <w:uiPriority w:val="68"/>
     <w:pPr>
       <w:spacing w:after="0" w:line="240" w:lineRule="auto"/>
@@ -37616,7 +39465,6 @@
   <w:style w:type="table" w:styleId="101">
     <w:name w:val="Medium Grid 2 Accent 5"/>
     <w:basedOn w:val="12"/>
-    <w:qFormat/>
     <w:uiPriority w:val="68"/>
     <w:pPr>
       <w:spacing w:after="0" w:line="240" w:lineRule="auto"/>
@@ -38380,7 +40228,6 @@
   <w:style w:type="table" w:styleId="106">
     <w:name w:val="Medium Grid 3 Accent 3"/>
     <w:basedOn w:val="12"/>
-    <w:qFormat/>
     <w:uiPriority w:val="69"/>
     <w:pPr>
       <w:spacing w:after="0" w:line="240" w:lineRule="auto"/>
@@ -38538,7 +40385,6 @@
   <w:style w:type="table" w:styleId="107">
     <w:name w:val="Medium Grid 3 Accent 4"/>
     <w:basedOn w:val="12"/>
-    <w:qFormat/>
     <w:uiPriority w:val="69"/>
     <w:pPr>
       <w:spacing w:after="0" w:line="240" w:lineRule="auto"/>
@@ -39700,7 +41546,6 @@
   <w:style w:type="table" w:styleId="116">
     <w:name w:val="Dark List Accent 6"/>
     <w:basedOn w:val="12"/>
-    <w:qFormat/>
     <w:uiPriority w:val="70"/>
     <w:pPr>
       <w:spacing w:after="0" w:line="240" w:lineRule="auto"/>
@@ -40112,7 +41957,6 @@
   <w:style w:type="table" w:styleId="119">
     <w:name w:val="Colorful Shading Accent 2"/>
     <w:basedOn w:val="12"/>
-    <w:qFormat/>
     <w:uiPriority w:val="71"/>
     <w:pPr>
       <w:spacing w:after="0" w:line="240" w:lineRule="auto"/>
@@ -40389,7 +42233,6 @@
   <w:style w:type="table" w:styleId="121">
     <w:name w:val="Colorful Shading Accent 4"/>
     <w:basedOn w:val="12"/>
-    <w:qFormat/>
     <w:uiPriority w:val="71"/>
     <w:pPr>
       <w:spacing w:after="0" w:line="240" w:lineRule="auto"/>
@@ -41018,7 +42861,6 @@
   <w:style w:type="table" w:styleId="126">
     <w:name w:val="Colorful List Accent 2"/>
     <w:basedOn w:val="12"/>
-    <w:qFormat/>
     <w:uiPriority w:val="72"/>
     <w:pPr>
       <w:spacing w:after="0" w:line="240" w:lineRule="auto"/>
@@ -41387,7 +43229,6 @@
   <w:style w:type="table" w:styleId="130">
     <w:name w:val="Colorful List Accent 6"/>
     <w:basedOn w:val="12"/>
-    <w:qFormat/>
     <w:uiPriority w:val="72"/>
     <w:pPr>
       <w:spacing w:after="0" w:line="240" w:lineRule="auto"/>
@@ -41576,7 +43417,6 @@
   <w:style w:type="table" w:styleId="132">
     <w:name w:val="Colorful Grid Accent 1"/>
     <w:basedOn w:val="12"/>
-    <w:qFormat/>
     <w:uiPriority w:val="73"/>
     <w:pPr>
       <w:spacing w:after="0" w:line="240" w:lineRule="auto"/>
@@ -41961,7 +43801,6 @@
   <w:style w:type="table" w:styleId="136">
     <w:name w:val="Colorful Grid Accent 5"/>
     <w:basedOn w:val="12"/>
-    <w:qFormat/>
     <w:uiPriority w:val="73"/>
     <w:pPr>
       <w:spacing w:after="0" w:line="240" w:lineRule="auto"/>
@@ -42161,7 +44000,6 @@
     <w:name w:val="Footer Char"/>
     <w:basedOn w:val="11"/>
     <w:link w:val="18"/>
-    <w:qFormat/>
     <w:uiPriority w:val="99"/>
   </w:style>
   <w:style w:type="paragraph" w:styleId="140">
@@ -42232,7 +44070,6 @@
     <w:name w:val="Title Char"/>
     <w:basedOn w:val="11"/>
     <w:link w:val="36"/>
-    <w:qFormat/>
     <w:uiPriority w:val="10"/>
     <w:rPr>
       <w:rFonts w:asciiTheme="majorHAnsi" w:hAnsiTheme="majorHAnsi" w:eastAsiaTheme="majorEastAsia" w:cstheme="majorBidi"/>
@@ -42247,7 +44084,6 @@
     <w:name w:val="Subtitle Char"/>
     <w:basedOn w:val="11"/>
     <w:link w:val="34"/>
-    <w:qFormat/>
     <w:uiPriority w:val="11"/>
     <w:rPr>
       <w:rFonts w:asciiTheme="majorHAnsi" w:hAnsiTheme="majorHAnsi" w:eastAsiaTheme="majorEastAsia" w:cstheme="majorBidi"/>
@@ -42278,7 +44114,6 @@
     <w:name w:val="Body Text Char"/>
     <w:basedOn w:val="11"/>
     <w:link w:val="13"/>
-    <w:qFormat/>
     <w:uiPriority w:val="99"/>
   </w:style>
   <w:style w:type="character" w:customStyle="1" w:styleId="148">
@@ -42291,7 +44126,6 @@
     <w:name w:val="Body Text 3 Char"/>
     <w:basedOn w:val="11"/>
     <w:link w:val="15"/>
-    <w:qFormat/>
     <w:uiPriority w:val="99"/>
     <w:rPr>
       <w:sz w:val="16"/>
@@ -42302,7 +44136,6 @@
     <w:name w:val="Macro Text Char"/>
     <w:basedOn w:val="11"/>
     <w:link w:val="32"/>
-    <w:qFormat/>
     <w:uiPriority w:val="99"/>
     <w:rPr>
       <w:rFonts w:ascii="Courier" w:hAnsi="Courier"/>
@@ -42332,7 +44165,6 @@
     <w:name w:val="Quote Char"/>
     <w:basedOn w:val="11"/>
     <w:link w:val="151"/>
-    <w:qFormat/>
     <w:uiPriority w:val="29"/>
     <w:rPr>
       <w:i/>
@@ -42350,7 +44182,6 @@
     <w:basedOn w:val="11"/>
     <w:link w:val="5"/>
     <w:semiHidden/>
-    <w:qFormat/>
     <w:uiPriority w:val="9"/>
     <w:rPr>
       <w:rFonts w:asciiTheme="majorHAnsi" w:hAnsiTheme="majorHAnsi" w:eastAsiaTheme="majorEastAsia" w:cstheme="majorBidi"/>
@@ -42371,7 +44202,6 @@
     <w:basedOn w:val="11"/>
     <w:link w:val="6"/>
     <w:semiHidden/>
-    <w:qFormat/>
     <w:uiPriority w:val="9"/>
     <w:rPr>
       <w:rFonts w:asciiTheme="majorHAnsi" w:hAnsiTheme="majorHAnsi" w:eastAsiaTheme="majorEastAsia" w:cstheme="majorBidi"/>
@@ -42383,7 +44213,6 @@
     <w:basedOn w:val="11"/>
     <w:link w:val="7"/>
     <w:semiHidden/>
-    <w:qFormat/>
     <w:uiPriority w:val="9"/>
     <w:rPr>
       <w:rFonts w:asciiTheme="majorHAnsi" w:hAnsiTheme="majorHAnsi" w:eastAsiaTheme="majorEastAsia" w:cstheme="majorBidi"/>
@@ -42397,7 +44226,6 @@
     <w:basedOn w:val="11"/>
     <w:link w:val="8"/>
     <w:semiHidden/>
-    <w:qFormat/>
     <w:uiPriority w:val="9"/>
     <w:rPr>
       <w:rFonts w:asciiTheme="majorHAnsi" w:hAnsiTheme="majorHAnsi" w:eastAsiaTheme="majorEastAsia" w:cstheme="majorBidi"/>
@@ -42419,7 +44247,6 @@
     <w:basedOn w:val="11"/>
     <w:link w:val="9"/>
     <w:semiHidden/>
-    <w:qFormat/>
     <w:uiPriority w:val="9"/>
     <w:rPr>
       <w:rFonts w:asciiTheme="majorHAnsi" w:hAnsiTheme="majorHAnsi" w:eastAsiaTheme="majorEastAsia" w:cstheme="majorBidi"/>
@@ -42438,7 +44265,6 @@
     <w:basedOn w:val="11"/>
     <w:link w:val="10"/>
     <w:semiHidden/>
-    <w:qFormat/>
     <w:uiPriority w:val="9"/>
     <w:rPr>
       <w:rFonts w:asciiTheme="majorHAnsi" w:hAnsiTheme="majorHAnsi" w:eastAsiaTheme="majorEastAsia" w:cstheme="majorBidi"/>
@@ -42488,7 +44314,6 @@
     <w:name w:val="Intense Quote Char"/>
     <w:basedOn w:val="11"/>
     <w:link w:val="159"/>
-    <w:qFormat/>
     <w:uiPriority w:val="30"/>
     <w:rPr>
       <w:b/>

</xml_diff>